<commit_message>
Contract between .equals() and .hashCode()
</commit_message>
<xml_diff>
--- a/Core_JAVA_Interview.docx
+++ b/Core_JAVA_Interview.docx
@@ -5,16 +5,12 @@
     <w:p>
       <w:pPr>
         <w:rPr>
-          <w:b/>
-          <w:bCs/>
-          <w:sz w:val="44"/>
-          <w:szCs w:val="44"/>
-        </w:rPr>
-      </w:pPr>
-      <w:r>
-        <w:rPr>
-          <w:b/>
-          <w:bCs/>
+          <w:sz w:val="44"/>
+          <w:szCs w:val="44"/>
+        </w:rPr>
+      </w:pPr>
+      <w:r>
+        <w:rPr>
           <w:sz w:val="44"/>
           <w:szCs w:val="44"/>
         </w:rPr>
@@ -24,66 +20,63 @@
     <w:p>
       <w:pPr>
         <w:rPr>
-          <w:b/>
-          <w:bCs/>
-          <w:sz w:val="44"/>
-          <w:szCs w:val="44"/>
-        </w:rPr>
-      </w:pPr>
-      <w:r>
-        <w:rPr>
-          <w:b/>
-          <w:bCs/>
+          <w:sz w:val="44"/>
+          <w:szCs w:val="44"/>
+        </w:rPr>
+      </w:pPr>
+      <w:r>
+        <w:rPr>
           <w:sz w:val="44"/>
           <w:szCs w:val="44"/>
         </w:rPr>
         <w:t xml:space="preserve">1)what is </w:t>
       </w:r>
-      <w:proofErr w:type="gramStart"/>
-      <w:r>
-        <w:rPr>
-          <w:b/>
-          <w:bCs/>
+      <w:proofErr w:type="spellStart"/>
+      <w:proofErr w:type="gramStart"/>
+      <w:r>
+        <w:rPr>
           <w:sz w:val="44"/>
           <w:szCs w:val="44"/>
         </w:rPr>
         <w:t>jvm,jdk</w:t>
       </w:r>
-      <w:proofErr w:type="gramEnd"/>
-      <w:r>
-        <w:rPr>
-          <w:b/>
-          <w:bCs/>
+      <w:proofErr w:type="spellEnd"/>
+      <w:proofErr w:type="gramEnd"/>
+      <w:r>
+        <w:rPr>
           <w:sz w:val="44"/>
           <w:szCs w:val="44"/>
         </w:rPr>
         <w:t xml:space="preserve">, </w:t>
       </w:r>
-      <w:proofErr w:type="gramStart"/>
-      <w:r>
-        <w:rPr>
-          <w:b/>
-          <w:bCs/>
-          <w:sz w:val="44"/>
-          <w:szCs w:val="44"/>
-        </w:rPr>
-        <w:t>jre ?</w:t>
-      </w:r>
-      <w:proofErr w:type="gramEnd"/>
-    </w:p>
-    <w:p>
-      <w:pPr>
-        <w:rPr>
-          <w:b/>
-          <w:bCs/>
-          <w:sz w:val="44"/>
-          <w:szCs w:val="44"/>
-        </w:rPr>
-      </w:pPr>
-      <w:r>
-        <w:rPr>
-          <w:b/>
-          <w:bCs/>
+      <w:proofErr w:type="spellStart"/>
+      <w:proofErr w:type="gramStart"/>
+      <w:r>
+        <w:rPr>
+          <w:sz w:val="44"/>
+          <w:szCs w:val="44"/>
+        </w:rPr>
+        <w:t>jre</w:t>
+      </w:r>
+      <w:proofErr w:type="spellEnd"/>
+      <w:r>
+        <w:rPr>
+          <w:sz w:val="44"/>
+          <w:szCs w:val="44"/>
+        </w:rPr>
+        <w:t xml:space="preserve"> ?</w:t>
+      </w:r>
+      <w:proofErr w:type="gramEnd"/>
+    </w:p>
+    <w:p>
+      <w:pPr>
+        <w:rPr>
+          <w:sz w:val="44"/>
+          <w:szCs w:val="44"/>
+        </w:rPr>
+      </w:pPr>
+      <w:r>
+        <w:rPr>
           <w:sz w:val="44"/>
           <w:szCs w:val="44"/>
         </w:rPr>
@@ -91,8 +84,6 @@
       </w:r>
       <w:r>
         <w:rPr>
-          <w:b/>
-          <w:bCs/>
           <w:sz w:val="44"/>
           <w:szCs w:val="44"/>
         </w:rPr>
@@ -101,8 +92,6 @@
       <w:proofErr w:type="gramStart"/>
       <w:r>
         <w:rPr>
-          <w:b/>
-          <w:bCs/>
           <w:sz w:val="44"/>
           <w:szCs w:val="44"/>
         </w:rPr>
@@ -111,8 +100,6 @@
       <w:proofErr w:type="gramEnd"/>
       <w:r>
         <w:rPr>
-          <w:b/>
-          <w:bCs/>
           <w:sz w:val="44"/>
           <w:szCs w:val="44"/>
         </w:rPr>
@@ -121,8 +108,6 @@
       <w:proofErr w:type="gramStart"/>
       <w:r>
         <w:rPr>
-          <w:b/>
-          <w:bCs/>
           <w:sz w:val="44"/>
           <w:szCs w:val="44"/>
         </w:rPr>
@@ -133,16 +118,12 @@
     <w:p>
       <w:pPr>
         <w:rPr>
-          <w:b/>
-          <w:bCs/>
-          <w:sz w:val="44"/>
-          <w:szCs w:val="44"/>
-        </w:rPr>
-      </w:pPr>
-      <w:r>
-        <w:rPr>
-          <w:b/>
-          <w:bCs/>
+          <w:sz w:val="44"/>
+          <w:szCs w:val="44"/>
+        </w:rPr>
+      </w:pPr>
+      <w:r>
+        <w:rPr>
           <w:sz w:val="44"/>
           <w:szCs w:val="44"/>
         </w:rPr>
@@ -152,16 +133,12 @@
     <w:p>
       <w:pPr>
         <w:rPr>
-          <w:b/>
-          <w:bCs/>
-          <w:sz w:val="44"/>
-          <w:szCs w:val="44"/>
-        </w:rPr>
-      </w:pPr>
-      <w:r>
-        <w:rPr>
-          <w:b/>
-          <w:bCs/>
+          <w:sz w:val="44"/>
+          <w:szCs w:val="44"/>
+        </w:rPr>
+      </w:pPr>
+      <w:r>
+        <w:rPr>
           <w:sz w:val="44"/>
           <w:szCs w:val="44"/>
         </w:rPr>
@@ -170,8 +147,6 @@
       <w:proofErr w:type="gramStart"/>
       <w:r>
         <w:rPr>
-          <w:b/>
-          <w:bCs/>
           <w:sz w:val="44"/>
           <w:szCs w:val="44"/>
         </w:rPr>
@@ -180,8 +155,6 @@
       <w:proofErr w:type="gramEnd"/>
       <w:r>
         <w:rPr>
-          <w:b/>
-          <w:bCs/>
           <w:sz w:val="44"/>
           <w:szCs w:val="44"/>
         </w:rPr>
@@ -191,16 +164,12 @@
     <w:p>
       <w:pPr>
         <w:rPr>
-          <w:b/>
-          <w:bCs/>
-          <w:sz w:val="44"/>
-          <w:szCs w:val="44"/>
-        </w:rPr>
-      </w:pPr>
-      <w:r>
-        <w:rPr>
-          <w:b/>
-          <w:bCs/>
+          <w:sz w:val="44"/>
+          <w:szCs w:val="44"/>
+        </w:rPr>
+      </w:pPr>
+      <w:r>
+        <w:rPr>
           <w:sz w:val="44"/>
           <w:szCs w:val="44"/>
         </w:rPr>
@@ -210,16 +179,12 @@
     <w:p>
       <w:pPr>
         <w:rPr>
-          <w:b/>
-          <w:bCs/>
-          <w:sz w:val="44"/>
-          <w:szCs w:val="44"/>
-        </w:rPr>
-      </w:pPr>
-      <w:r>
-        <w:rPr>
-          <w:b/>
-          <w:bCs/>
+          <w:sz w:val="44"/>
+          <w:szCs w:val="44"/>
+        </w:rPr>
+      </w:pPr>
+      <w:r>
+        <w:rPr>
           <w:sz w:val="44"/>
           <w:szCs w:val="44"/>
         </w:rPr>
@@ -229,16 +194,12 @@
     <w:p>
       <w:pPr>
         <w:rPr>
-          <w:b/>
-          <w:bCs/>
-          <w:sz w:val="44"/>
-          <w:szCs w:val="44"/>
-        </w:rPr>
-      </w:pPr>
-      <w:r>
-        <w:rPr>
-          <w:b/>
-          <w:bCs/>
+          <w:sz w:val="44"/>
+          <w:szCs w:val="44"/>
+        </w:rPr>
+      </w:pPr>
+      <w:r>
+        <w:rPr>
           <w:sz w:val="44"/>
           <w:szCs w:val="44"/>
         </w:rPr>
@@ -247,8 +208,6 @@
       <w:proofErr w:type="gramStart"/>
       <w:r>
         <w:rPr>
-          <w:b/>
-          <w:bCs/>
           <w:sz w:val="44"/>
           <w:szCs w:val="44"/>
         </w:rPr>
@@ -259,16 +218,12 @@
     <w:p>
       <w:pPr>
         <w:rPr>
-          <w:b/>
-          <w:bCs/>
-          <w:sz w:val="44"/>
-          <w:szCs w:val="44"/>
-        </w:rPr>
-      </w:pPr>
-      <w:r>
-        <w:rPr>
-          <w:b/>
-          <w:bCs/>
+          <w:sz w:val="44"/>
+          <w:szCs w:val="44"/>
+        </w:rPr>
+      </w:pPr>
+      <w:r>
+        <w:rPr>
           <w:sz w:val="44"/>
           <w:szCs w:val="44"/>
         </w:rPr>
@@ -278,16 +233,12 @@
     <w:p>
       <w:pPr>
         <w:rPr>
-          <w:b/>
-          <w:bCs/>
-          <w:sz w:val="44"/>
-          <w:szCs w:val="44"/>
-        </w:rPr>
-      </w:pPr>
-      <w:r>
-        <w:rPr>
-          <w:b/>
-          <w:bCs/>
+          <w:sz w:val="44"/>
+          <w:szCs w:val="44"/>
+        </w:rPr>
+      </w:pPr>
+      <w:r>
+        <w:rPr>
           <w:sz w:val="44"/>
           <w:szCs w:val="44"/>
         </w:rPr>
@@ -296,8 +247,6 @@
       <w:proofErr w:type="gramStart"/>
       <w:r>
         <w:rPr>
-          <w:b/>
-          <w:bCs/>
           <w:sz w:val="44"/>
           <w:szCs w:val="44"/>
         </w:rPr>
@@ -308,16 +257,12 @@
     <w:p>
       <w:pPr>
         <w:rPr>
-          <w:b/>
-          <w:bCs/>
-          <w:sz w:val="44"/>
-          <w:szCs w:val="44"/>
-        </w:rPr>
-      </w:pPr>
-      <w:r>
-        <w:rPr>
-          <w:b/>
-          <w:bCs/>
+          <w:sz w:val="44"/>
+          <w:szCs w:val="44"/>
+        </w:rPr>
+      </w:pPr>
+      <w:r>
+        <w:rPr>
           <w:sz w:val="44"/>
           <w:szCs w:val="44"/>
         </w:rPr>
@@ -325,8 +270,6 @@
       </w:r>
       <w:r>
         <w:rPr>
-          <w:b/>
-          <w:bCs/>
           <w:sz w:val="44"/>
           <w:szCs w:val="44"/>
         </w:rPr>
@@ -335,8 +278,6 @@
       <w:proofErr w:type="gramStart"/>
       <w:r>
         <w:rPr>
-          <w:b/>
-          <w:bCs/>
           <w:sz w:val="44"/>
           <w:szCs w:val="44"/>
         </w:rPr>
@@ -345,8 +286,6 @@
       <w:proofErr w:type="gramEnd"/>
       <w:r>
         <w:rPr>
-          <w:b/>
-          <w:bCs/>
           <w:sz w:val="44"/>
           <w:szCs w:val="44"/>
         </w:rPr>
@@ -356,16 +295,12 @@
     <w:p>
       <w:pPr>
         <w:rPr>
-          <w:b/>
-          <w:bCs/>
-          <w:sz w:val="44"/>
-          <w:szCs w:val="44"/>
-        </w:rPr>
-      </w:pPr>
-      <w:r>
-        <w:rPr>
-          <w:b/>
-          <w:bCs/>
+          <w:sz w:val="44"/>
+          <w:szCs w:val="44"/>
+        </w:rPr>
+      </w:pPr>
+      <w:r>
+        <w:rPr>
           <w:sz w:val="44"/>
           <w:szCs w:val="44"/>
         </w:rPr>
@@ -374,8 +309,6 @@
       <w:proofErr w:type="gramStart"/>
       <w:r>
         <w:rPr>
-          <w:b/>
-          <w:bCs/>
           <w:sz w:val="44"/>
           <w:szCs w:val="44"/>
         </w:rPr>
@@ -386,16 +319,12 @@
     <w:p>
       <w:pPr>
         <w:rPr>
-          <w:b/>
-          <w:bCs/>
-          <w:sz w:val="44"/>
-          <w:szCs w:val="44"/>
-        </w:rPr>
-      </w:pPr>
-      <w:r>
-        <w:rPr>
-          <w:b/>
-          <w:bCs/>
+          <w:sz w:val="44"/>
+          <w:szCs w:val="44"/>
+        </w:rPr>
+      </w:pPr>
+      <w:r>
+        <w:rPr>
           <w:sz w:val="44"/>
           <w:szCs w:val="44"/>
         </w:rPr>
@@ -404,8 +333,6 @@
       <w:proofErr w:type="gramStart"/>
       <w:r>
         <w:rPr>
-          <w:b/>
-          <w:bCs/>
           <w:sz w:val="44"/>
           <w:szCs w:val="44"/>
         </w:rPr>
@@ -416,37 +343,54 @@
     <w:p>
       <w:pPr>
         <w:rPr>
-          <w:b/>
-          <w:bCs/>
-          <w:sz w:val="44"/>
-          <w:szCs w:val="44"/>
-        </w:rPr>
-      </w:pPr>
-      <w:r>
-        <w:rPr>
-          <w:b/>
-          <w:bCs/>
+          <w:sz w:val="44"/>
+          <w:szCs w:val="44"/>
+        </w:rPr>
+      </w:pPr>
+      <w:r>
+        <w:rPr>
           <w:sz w:val="44"/>
           <w:szCs w:val="44"/>
         </w:rPr>
         <w:lastRenderedPageBreak/>
-        <w:t xml:space="preserve">15) String.vs. </w:t>
-      </w:r>
-      <w:proofErr w:type="gramStart"/>
-      <w:r>
-        <w:rPr>
-          <w:b/>
-          <w:bCs/>
-          <w:sz w:val="44"/>
-          <w:szCs w:val="44"/>
-        </w:rPr>
-        <w:t>StringBuffer .</w:t>
-      </w:r>
-      <w:proofErr w:type="gramEnd"/>
-      <w:r>
-        <w:rPr>
-          <w:b/>
-          <w:bCs/>
+        <w:t xml:space="preserve">15) </w:t>
+      </w:r>
+      <w:proofErr w:type="spellStart"/>
+      <w:r>
+        <w:rPr>
+          <w:sz w:val="44"/>
+          <w:szCs w:val="44"/>
+        </w:rPr>
+        <w:t>String.vs</w:t>
+      </w:r>
+      <w:proofErr w:type="spellEnd"/>
+      <w:r>
+        <w:rPr>
+          <w:sz w:val="44"/>
+          <w:szCs w:val="44"/>
+        </w:rPr>
+        <w:t xml:space="preserve">. </w:t>
+      </w:r>
+      <w:proofErr w:type="spellStart"/>
+      <w:proofErr w:type="gramStart"/>
+      <w:r>
+        <w:rPr>
+          <w:sz w:val="44"/>
+          <w:szCs w:val="44"/>
+        </w:rPr>
+        <w:t>StringBuffer</w:t>
+      </w:r>
+      <w:proofErr w:type="spellEnd"/>
+      <w:r>
+        <w:rPr>
+          <w:sz w:val="44"/>
+          <w:szCs w:val="44"/>
+        </w:rPr>
+        <w:t xml:space="preserve"> .</w:t>
+      </w:r>
+      <w:proofErr w:type="gramEnd"/>
+      <w:r>
+        <w:rPr>
           <w:sz w:val="44"/>
           <w:szCs w:val="44"/>
         </w:rPr>
@@ -456,16 +400,12 @@
     <w:p>
       <w:pPr>
         <w:rPr>
-          <w:b/>
-          <w:bCs/>
-          <w:sz w:val="44"/>
-          <w:szCs w:val="44"/>
-        </w:rPr>
-      </w:pPr>
-      <w:r>
-        <w:rPr>
-          <w:b/>
-          <w:bCs/>
+          <w:sz w:val="44"/>
+          <w:szCs w:val="44"/>
+        </w:rPr>
+      </w:pPr>
+      <w:r>
+        <w:rPr>
           <w:sz w:val="44"/>
           <w:szCs w:val="44"/>
         </w:rPr>
@@ -475,16 +415,12 @@
     <w:p>
       <w:pPr>
         <w:rPr>
-          <w:b/>
-          <w:bCs/>
-          <w:sz w:val="44"/>
-          <w:szCs w:val="44"/>
-        </w:rPr>
-      </w:pPr>
-      <w:r>
-        <w:rPr>
-          <w:b/>
-          <w:bCs/>
+          <w:sz w:val="44"/>
+          <w:szCs w:val="44"/>
+        </w:rPr>
+      </w:pPr>
+      <w:r>
+        <w:rPr>
           <w:sz w:val="44"/>
           <w:szCs w:val="44"/>
         </w:rPr>
@@ -494,16 +430,12 @@
     <w:p>
       <w:pPr>
         <w:rPr>
-          <w:b/>
-          <w:bCs/>
-          <w:sz w:val="44"/>
-          <w:szCs w:val="44"/>
-        </w:rPr>
-      </w:pPr>
-      <w:r>
-        <w:rPr>
-          <w:b/>
-          <w:bCs/>
+          <w:sz w:val="44"/>
+          <w:szCs w:val="44"/>
+        </w:rPr>
+      </w:pPr>
+      <w:r>
+        <w:rPr>
           <w:sz w:val="44"/>
           <w:szCs w:val="44"/>
         </w:rPr>
@@ -513,16 +445,12 @@
     <w:p>
       <w:pPr>
         <w:rPr>
-          <w:b/>
-          <w:bCs/>
-          <w:sz w:val="44"/>
-          <w:szCs w:val="44"/>
-        </w:rPr>
-      </w:pPr>
-      <w:r>
-        <w:rPr>
-          <w:b/>
-          <w:bCs/>
+          <w:sz w:val="44"/>
+          <w:szCs w:val="44"/>
+        </w:rPr>
+      </w:pPr>
+      <w:r>
+        <w:rPr>
           <w:sz w:val="44"/>
           <w:szCs w:val="44"/>
         </w:rPr>
@@ -532,16 +460,12 @@
     <w:p>
       <w:pPr>
         <w:rPr>
-          <w:b/>
-          <w:bCs/>
-          <w:sz w:val="44"/>
-          <w:szCs w:val="44"/>
-        </w:rPr>
-      </w:pPr>
-      <w:r>
-        <w:rPr>
-          <w:b/>
-          <w:bCs/>
+          <w:sz w:val="44"/>
+          <w:szCs w:val="44"/>
+        </w:rPr>
+      </w:pPr>
+      <w:r>
+        <w:rPr>
           <w:sz w:val="44"/>
           <w:szCs w:val="44"/>
         </w:rPr>
@@ -551,16 +475,12 @@
     <w:p>
       <w:pPr>
         <w:rPr>
-          <w:b/>
-          <w:bCs/>
-          <w:sz w:val="44"/>
-          <w:szCs w:val="44"/>
-        </w:rPr>
-      </w:pPr>
-      <w:r>
-        <w:rPr>
-          <w:b/>
-          <w:bCs/>
+          <w:sz w:val="44"/>
+          <w:szCs w:val="44"/>
+        </w:rPr>
+      </w:pPr>
+      <w:r>
+        <w:rPr>
           <w:sz w:val="44"/>
           <w:szCs w:val="44"/>
         </w:rPr>
@@ -570,16 +490,12 @@
     <w:p>
       <w:pPr>
         <w:rPr>
-          <w:b/>
-          <w:bCs/>
-          <w:sz w:val="44"/>
-          <w:szCs w:val="44"/>
-        </w:rPr>
-      </w:pPr>
-      <w:r>
-        <w:rPr>
-          <w:b/>
-          <w:bCs/>
+          <w:sz w:val="44"/>
+          <w:szCs w:val="44"/>
+        </w:rPr>
+      </w:pPr>
+      <w:r>
+        <w:rPr>
           <w:sz w:val="44"/>
           <w:szCs w:val="44"/>
         </w:rPr>
@@ -589,16 +505,12 @@
     <w:p>
       <w:pPr>
         <w:rPr>
-          <w:b/>
-          <w:bCs/>
-          <w:sz w:val="44"/>
-          <w:szCs w:val="44"/>
-        </w:rPr>
-      </w:pPr>
-      <w:r>
-        <w:rPr>
-          <w:b/>
-          <w:bCs/>
+          <w:sz w:val="44"/>
+          <w:szCs w:val="44"/>
+        </w:rPr>
+      </w:pPr>
+      <w:r>
+        <w:rPr>
           <w:sz w:val="44"/>
           <w:szCs w:val="44"/>
         </w:rPr>
@@ -608,16 +520,12 @@
     <w:p>
       <w:pPr>
         <w:rPr>
-          <w:b/>
-          <w:bCs/>
-          <w:sz w:val="44"/>
-          <w:szCs w:val="44"/>
-        </w:rPr>
-      </w:pPr>
-      <w:r>
-        <w:rPr>
-          <w:b/>
-          <w:bCs/>
+          <w:sz w:val="44"/>
+          <w:szCs w:val="44"/>
+        </w:rPr>
+      </w:pPr>
+      <w:r>
+        <w:rPr>
           <w:sz w:val="44"/>
           <w:szCs w:val="44"/>
         </w:rPr>
@@ -627,16 +535,12 @@
     <w:p>
       <w:pPr>
         <w:rPr>
-          <w:b/>
-          <w:bCs/>
-          <w:sz w:val="44"/>
-          <w:szCs w:val="44"/>
-        </w:rPr>
-      </w:pPr>
-      <w:r>
-        <w:rPr>
-          <w:b/>
-          <w:bCs/>
+          <w:sz w:val="44"/>
+          <w:szCs w:val="44"/>
+        </w:rPr>
+      </w:pPr>
+      <w:r>
+        <w:rPr>
           <w:sz w:val="44"/>
           <w:szCs w:val="44"/>
         </w:rPr>
@@ -646,16 +550,12 @@
     <w:p>
       <w:pPr>
         <w:rPr>
-          <w:b/>
-          <w:bCs/>
-          <w:sz w:val="44"/>
-          <w:szCs w:val="44"/>
-        </w:rPr>
-      </w:pPr>
-      <w:r>
-        <w:rPr>
-          <w:b/>
-          <w:bCs/>
+          <w:sz w:val="44"/>
+          <w:szCs w:val="44"/>
+        </w:rPr>
+      </w:pPr>
+      <w:r>
+        <w:rPr>
           <w:sz w:val="44"/>
           <w:szCs w:val="44"/>
         </w:rPr>
@@ -666,16 +566,12 @@
     <w:p>
       <w:pPr>
         <w:rPr>
-          <w:b/>
-          <w:bCs/>
-          <w:sz w:val="44"/>
-          <w:szCs w:val="44"/>
-        </w:rPr>
-      </w:pPr>
-      <w:r>
-        <w:rPr>
-          <w:b/>
-          <w:bCs/>
+          <w:sz w:val="44"/>
+          <w:szCs w:val="44"/>
+        </w:rPr>
+      </w:pPr>
+      <w:r>
+        <w:rPr>
           <w:sz w:val="44"/>
           <w:szCs w:val="44"/>
         </w:rPr>
@@ -685,16 +581,12 @@
     <w:p>
       <w:pPr>
         <w:rPr>
-          <w:b/>
-          <w:bCs/>
-          <w:sz w:val="44"/>
-          <w:szCs w:val="44"/>
-        </w:rPr>
-      </w:pPr>
-      <w:r>
-        <w:rPr>
-          <w:b/>
-          <w:bCs/>
+          <w:sz w:val="44"/>
+          <w:szCs w:val="44"/>
+        </w:rPr>
+      </w:pPr>
+      <w:r>
+        <w:rPr>
           <w:sz w:val="44"/>
           <w:szCs w:val="44"/>
         </w:rPr>
@@ -703,8 +595,6 @@
       <w:proofErr w:type="gramStart"/>
       <w:r>
         <w:rPr>
-          <w:b/>
-          <w:bCs/>
           <w:sz w:val="44"/>
           <w:szCs w:val="44"/>
         </w:rPr>
@@ -713,8 +603,6 @@
       <w:proofErr w:type="gramEnd"/>
       <w:r>
         <w:rPr>
-          <w:b/>
-          <w:bCs/>
           <w:sz w:val="44"/>
           <w:szCs w:val="44"/>
         </w:rPr>
@@ -724,16 +612,12 @@
     <w:p>
       <w:pPr>
         <w:rPr>
-          <w:b/>
-          <w:bCs/>
-          <w:sz w:val="44"/>
-          <w:szCs w:val="44"/>
-        </w:rPr>
-      </w:pPr>
-      <w:r>
-        <w:rPr>
-          <w:b/>
-          <w:bCs/>
+          <w:sz w:val="44"/>
+          <w:szCs w:val="44"/>
+        </w:rPr>
+      </w:pPr>
+      <w:r>
+        <w:rPr>
           <w:sz w:val="44"/>
           <w:szCs w:val="44"/>
         </w:rPr>
@@ -743,16 +627,12 @@
     <w:p>
       <w:pPr>
         <w:rPr>
-          <w:b/>
-          <w:bCs/>
-          <w:sz w:val="44"/>
-          <w:szCs w:val="44"/>
-        </w:rPr>
-      </w:pPr>
-      <w:r>
-        <w:rPr>
-          <w:b/>
-          <w:bCs/>
+          <w:sz w:val="44"/>
+          <w:szCs w:val="44"/>
+        </w:rPr>
+      </w:pPr>
+      <w:r>
+        <w:rPr>
           <w:sz w:val="44"/>
           <w:szCs w:val="44"/>
         </w:rPr>
@@ -762,16 +642,12 @@
     <w:p>
       <w:pPr>
         <w:rPr>
-          <w:b/>
-          <w:bCs/>
-          <w:sz w:val="44"/>
-          <w:szCs w:val="44"/>
-        </w:rPr>
-      </w:pPr>
-      <w:r>
-        <w:rPr>
-          <w:b/>
-          <w:bCs/>
+          <w:sz w:val="44"/>
+          <w:szCs w:val="44"/>
+        </w:rPr>
+      </w:pPr>
+      <w:r>
+        <w:rPr>
           <w:sz w:val="44"/>
           <w:szCs w:val="44"/>
         </w:rPr>
@@ -780,8 +656,6 @@
       <w:proofErr w:type="gramStart"/>
       <w:r>
         <w:rPr>
-          <w:b/>
-          <w:bCs/>
           <w:sz w:val="44"/>
           <w:szCs w:val="44"/>
         </w:rPr>
@@ -790,8 +664,6 @@
       <w:proofErr w:type="gramEnd"/>
       <w:r>
         <w:rPr>
-          <w:b/>
-          <w:bCs/>
           <w:sz w:val="44"/>
           <w:szCs w:val="44"/>
         </w:rPr>
@@ -801,16 +673,12 @@
     <w:p>
       <w:pPr>
         <w:rPr>
-          <w:b/>
-          <w:bCs/>
-          <w:sz w:val="44"/>
-          <w:szCs w:val="44"/>
-        </w:rPr>
-      </w:pPr>
-      <w:r>
-        <w:rPr>
-          <w:b/>
-          <w:bCs/>
+          <w:sz w:val="44"/>
+          <w:szCs w:val="44"/>
+        </w:rPr>
+      </w:pPr>
+      <w:r>
+        <w:rPr>
           <w:sz w:val="44"/>
           <w:szCs w:val="44"/>
         </w:rPr>
@@ -820,16 +688,12 @@
     <w:p>
       <w:pPr>
         <w:rPr>
-          <w:b/>
-          <w:bCs/>
-          <w:sz w:val="44"/>
-          <w:szCs w:val="44"/>
-        </w:rPr>
-      </w:pPr>
-      <w:r>
-        <w:rPr>
-          <w:b/>
-          <w:bCs/>
+          <w:sz w:val="44"/>
+          <w:szCs w:val="44"/>
+        </w:rPr>
+      </w:pPr>
+      <w:r>
+        <w:rPr>
           <w:sz w:val="44"/>
           <w:szCs w:val="44"/>
         </w:rPr>
@@ -839,16 +703,12 @@
     <w:p>
       <w:pPr>
         <w:rPr>
-          <w:b/>
-          <w:bCs/>
-          <w:sz w:val="44"/>
-          <w:szCs w:val="44"/>
-        </w:rPr>
-      </w:pPr>
-      <w:r>
-        <w:rPr>
-          <w:b/>
-          <w:bCs/>
+          <w:sz w:val="44"/>
+          <w:szCs w:val="44"/>
+        </w:rPr>
+      </w:pPr>
+      <w:r>
+        <w:rPr>
           <w:sz w:val="44"/>
           <w:szCs w:val="44"/>
         </w:rPr>
@@ -858,16 +718,12 @@
     <w:p>
       <w:pPr>
         <w:rPr>
-          <w:b/>
-          <w:bCs/>
-          <w:sz w:val="44"/>
-          <w:szCs w:val="44"/>
-        </w:rPr>
-      </w:pPr>
-      <w:r>
-        <w:rPr>
-          <w:b/>
-          <w:bCs/>
+          <w:sz w:val="44"/>
+          <w:szCs w:val="44"/>
+        </w:rPr>
+      </w:pPr>
+      <w:r>
+        <w:rPr>
           <w:sz w:val="44"/>
           <w:szCs w:val="44"/>
         </w:rPr>
@@ -877,16 +733,12 @@
     <w:p>
       <w:pPr>
         <w:rPr>
-          <w:b/>
-          <w:bCs/>
-          <w:sz w:val="44"/>
-          <w:szCs w:val="44"/>
-        </w:rPr>
-      </w:pPr>
-      <w:r>
-        <w:rPr>
-          <w:b/>
-          <w:bCs/>
+          <w:sz w:val="44"/>
+          <w:szCs w:val="44"/>
+        </w:rPr>
+      </w:pPr>
+      <w:r>
+        <w:rPr>
           <w:sz w:val="44"/>
           <w:szCs w:val="44"/>
         </w:rPr>
@@ -896,8 +748,6 @@
       <w:proofErr w:type="gramStart"/>
       <w:r>
         <w:rPr>
-          <w:b/>
-          <w:bCs/>
           <w:sz w:val="44"/>
           <w:szCs w:val="44"/>
         </w:rPr>
@@ -906,8 +756,6 @@
       <w:proofErr w:type="gramEnd"/>
       <w:r>
         <w:rPr>
-          <w:b/>
-          <w:bCs/>
           <w:sz w:val="44"/>
           <w:szCs w:val="44"/>
         </w:rPr>
@@ -917,16 +765,12 @@
     <w:p>
       <w:pPr>
         <w:rPr>
-          <w:b/>
-          <w:bCs/>
-          <w:sz w:val="44"/>
-          <w:szCs w:val="44"/>
-        </w:rPr>
-      </w:pPr>
-      <w:r>
-        <w:rPr>
-          <w:b/>
-          <w:bCs/>
+          <w:sz w:val="44"/>
+          <w:szCs w:val="44"/>
+        </w:rPr>
+      </w:pPr>
+      <w:r>
+        <w:rPr>
           <w:sz w:val="44"/>
           <w:szCs w:val="44"/>
         </w:rPr>
@@ -936,17 +780,13 @@
     <w:p>
       <w:pPr>
         <w:rPr>
-          <w:b/>
-          <w:bCs/>
-          <w:sz w:val="44"/>
-          <w:szCs w:val="44"/>
-        </w:rPr>
-      </w:pPr>
-      <w:proofErr w:type="gramStart"/>
-      <w:r>
-        <w:rPr>
-          <w:b/>
-          <w:bCs/>
+          <w:sz w:val="44"/>
+          <w:szCs w:val="44"/>
+        </w:rPr>
+      </w:pPr>
+      <w:proofErr w:type="gramStart"/>
+      <w:r>
+        <w:rPr>
           <w:sz w:val="44"/>
           <w:szCs w:val="44"/>
         </w:rPr>
@@ -955,8 +795,6 @@
       <w:proofErr w:type="gramEnd"/>
       <w:r>
         <w:rPr>
-          <w:b/>
-          <w:bCs/>
           <w:sz w:val="44"/>
           <w:szCs w:val="44"/>
         </w:rPr>
@@ -966,16 +804,12 @@
     <w:p>
       <w:pPr>
         <w:rPr>
-          <w:b/>
-          <w:bCs/>
-          <w:sz w:val="44"/>
-          <w:szCs w:val="44"/>
-        </w:rPr>
-      </w:pPr>
-      <w:r>
-        <w:rPr>
-          <w:b/>
-          <w:bCs/>
+          <w:sz w:val="44"/>
+          <w:szCs w:val="44"/>
+        </w:rPr>
+      </w:pPr>
+      <w:r>
+        <w:rPr>
           <w:sz w:val="44"/>
           <w:szCs w:val="44"/>
         </w:rPr>
@@ -985,16 +819,12 @@
     <w:p>
       <w:pPr>
         <w:rPr>
-          <w:b/>
-          <w:bCs/>
-          <w:sz w:val="44"/>
-          <w:szCs w:val="44"/>
-        </w:rPr>
-      </w:pPr>
-      <w:r>
-        <w:rPr>
-          <w:b/>
-          <w:bCs/>
+          <w:sz w:val="44"/>
+          <w:szCs w:val="44"/>
+        </w:rPr>
+      </w:pPr>
+      <w:r>
+        <w:rPr>
           <w:sz w:val="44"/>
           <w:szCs w:val="44"/>
         </w:rPr>
@@ -1004,16 +834,12 @@
     <w:p>
       <w:pPr>
         <w:rPr>
-          <w:b/>
-          <w:bCs/>
-          <w:sz w:val="44"/>
-          <w:szCs w:val="44"/>
-        </w:rPr>
-      </w:pPr>
-      <w:r>
-        <w:rPr>
-          <w:b/>
-          <w:bCs/>
+          <w:sz w:val="44"/>
+          <w:szCs w:val="44"/>
+        </w:rPr>
+      </w:pPr>
+      <w:r>
+        <w:rPr>
           <w:sz w:val="44"/>
           <w:szCs w:val="44"/>
         </w:rPr>
@@ -1022,8 +848,6 @@
       <w:proofErr w:type="gramStart"/>
       <w:r>
         <w:rPr>
-          <w:b/>
-          <w:bCs/>
           <w:sz w:val="44"/>
           <w:szCs w:val="44"/>
         </w:rPr>
@@ -1032,8 +856,6 @@
       <w:proofErr w:type="gramEnd"/>
       <w:r>
         <w:rPr>
-          <w:b/>
-          <w:bCs/>
           <w:sz w:val="44"/>
           <w:szCs w:val="44"/>
         </w:rPr>
@@ -1043,16 +865,12 @@
     <w:p>
       <w:pPr>
         <w:rPr>
-          <w:b/>
-          <w:bCs/>
-          <w:sz w:val="44"/>
-          <w:szCs w:val="44"/>
-        </w:rPr>
-      </w:pPr>
-      <w:r>
-        <w:rPr>
-          <w:b/>
-          <w:bCs/>
+          <w:sz w:val="44"/>
+          <w:szCs w:val="44"/>
+        </w:rPr>
+      </w:pPr>
+      <w:r>
+        <w:rPr>
           <w:sz w:val="44"/>
           <w:szCs w:val="44"/>
         </w:rPr>
@@ -1061,8 +879,6 @@
       <w:proofErr w:type="gramStart"/>
       <w:r>
         <w:rPr>
-          <w:b/>
-          <w:bCs/>
           <w:sz w:val="44"/>
           <w:szCs w:val="44"/>
         </w:rPr>
@@ -1073,16 +889,12 @@
     <w:p>
       <w:pPr>
         <w:rPr>
-          <w:b/>
-          <w:bCs/>
-          <w:sz w:val="44"/>
-          <w:szCs w:val="44"/>
-        </w:rPr>
-      </w:pPr>
-      <w:r>
-        <w:rPr>
-          <w:b/>
-          <w:bCs/>
+          <w:sz w:val="44"/>
+          <w:szCs w:val="44"/>
+        </w:rPr>
+      </w:pPr>
+      <w:r>
+        <w:rPr>
           <w:sz w:val="44"/>
           <w:szCs w:val="44"/>
         </w:rPr>
@@ -1092,16 +904,12 @@
     <w:p>
       <w:pPr>
         <w:rPr>
-          <w:b/>
-          <w:bCs/>
-          <w:sz w:val="44"/>
-          <w:szCs w:val="44"/>
-        </w:rPr>
-      </w:pPr>
-      <w:r>
-        <w:rPr>
-          <w:b/>
-          <w:bCs/>
+          <w:sz w:val="44"/>
+          <w:szCs w:val="44"/>
+        </w:rPr>
+      </w:pPr>
+      <w:r>
+        <w:rPr>
           <w:sz w:val="44"/>
           <w:szCs w:val="44"/>
         </w:rPr>
@@ -1111,16 +919,12 @@
     <w:p>
       <w:pPr>
         <w:rPr>
-          <w:b/>
-          <w:bCs/>
-          <w:sz w:val="44"/>
-          <w:szCs w:val="44"/>
-        </w:rPr>
-      </w:pPr>
-      <w:r>
-        <w:rPr>
-          <w:b/>
-          <w:bCs/>
+          <w:sz w:val="44"/>
+          <w:szCs w:val="44"/>
+        </w:rPr>
+      </w:pPr>
+      <w:r>
+        <w:rPr>
           <w:sz w:val="44"/>
           <w:szCs w:val="44"/>
         </w:rPr>
@@ -1130,16 +934,12 @@
     <w:p>
       <w:pPr>
         <w:rPr>
-          <w:b/>
-          <w:bCs/>
-          <w:sz w:val="44"/>
-          <w:szCs w:val="44"/>
-        </w:rPr>
-      </w:pPr>
-      <w:r>
-        <w:rPr>
-          <w:b/>
-          <w:bCs/>
+          <w:sz w:val="44"/>
+          <w:szCs w:val="44"/>
+        </w:rPr>
+      </w:pPr>
+      <w:r>
+        <w:rPr>
           <w:sz w:val="44"/>
           <w:szCs w:val="44"/>
         </w:rPr>
@@ -1150,16 +950,12 @@
     <w:p>
       <w:pPr>
         <w:rPr>
-          <w:b/>
-          <w:bCs/>
-          <w:sz w:val="44"/>
-          <w:szCs w:val="44"/>
-        </w:rPr>
-      </w:pPr>
-      <w:r>
-        <w:rPr>
-          <w:b/>
-          <w:bCs/>
+          <w:sz w:val="44"/>
+          <w:szCs w:val="44"/>
+        </w:rPr>
+      </w:pPr>
+      <w:r>
+        <w:rPr>
           <w:sz w:val="44"/>
           <w:szCs w:val="44"/>
         </w:rPr>
@@ -1167,8 +963,6 @@
       </w:r>
       <w:r>
         <w:rPr>
-          <w:b/>
-          <w:bCs/>
           <w:sz w:val="44"/>
           <w:szCs w:val="44"/>
         </w:rPr>
@@ -1176,8 +970,6 @@
       </w:r>
       <w:r>
         <w:rPr>
-          <w:b/>
-          <w:bCs/>
           <w:sz w:val="44"/>
           <w:szCs w:val="44"/>
         </w:rPr>
@@ -1187,16 +979,12 @@
     <w:p>
       <w:pPr>
         <w:rPr>
-          <w:b/>
-          <w:bCs/>
-          <w:sz w:val="44"/>
-          <w:szCs w:val="44"/>
-        </w:rPr>
-      </w:pPr>
-      <w:r>
-        <w:rPr>
-          <w:b/>
-          <w:bCs/>
+          <w:sz w:val="44"/>
+          <w:szCs w:val="44"/>
+        </w:rPr>
+      </w:pPr>
+      <w:r>
+        <w:rPr>
           <w:sz w:val="44"/>
           <w:szCs w:val="44"/>
         </w:rPr>
@@ -1206,35 +994,43 @@
     <w:p>
       <w:pPr>
         <w:rPr>
-          <w:b/>
-          <w:bCs/>
-          <w:sz w:val="44"/>
-          <w:szCs w:val="44"/>
-        </w:rPr>
-      </w:pPr>
-      <w:r>
-        <w:rPr>
-          <w:b/>
-          <w:bCs/>
-          <w:sz w:val="44"/>
-          <w:szCs w:val="44"/>
-        </w:rPr>
-        <w:t>49)default and static methods in java 8 i/f.</w:t>
-      </w:r>
-    </w:p>
-    <w:p>
-      <w:pPr>
-        <w:rPr>
-          <w:b/>
-          <w:bCs/>
-          <w:sz w:val="44"/>
-          <w:szCs w:val="44"/>
-        </w:rPr>
-      </w:pPr>
-      <w:r>
-        <w:rPr>
-          <w:b/>
-          <w:bCs/>
+          <w:sz w:val="44"/>
+          <w:szCs w:val="44"/>
+        </w:rPr>
+      </w:pPr>
+      <w:r>
+        <w:rPr>
+          <w:sz w:val="44"/>
+          <w:szCs w:val="44"/>
+        </w:rPr>
+        <w:t xml:space="preserve">49)default and static methods in java 8 </w:t>
+      </w:r>
+      <w:proofErr w:type="spellStart"/>
+      <w:r>
+        <w:rPr>
+          <w:sz w:val="44"/>
+          <w:szCs w:val="44"/>
+        </w:rPr>
+        <w:t>i</w:t>
+      </w:r>
+      <w:proofErr w:type="spellEnd"/>
+      <w:r>
+        <w:rPr>
+          <w:sz w:val="44"/>
+          <w:szCs w:val="44"/>
+        </w:rPr>
+        <w:t>/f.</w:t>
+      </w:r>
+    </w:p>
+    <w:p>
+      <w:pPr>
+        <w:rPr>
+          <w:sz w:val="44"/>
+          <w:szCs w:val="44"/>
+        </w:rPr>
+      </w:pPr>
+      <w:r>
+        <w:rPr>
           <w:sz w:val="44"/>
           <w:szCs w:val="44"/>
         </w:rPr>
@@ -1244,16 +1040,12 @@
     <w:p>
       <w:pPr>
         <w:rPr>
-          <w:b/>
-          <w:bCs/>
-          <w:sz w:val="44"/>
-          <w:szCs w:val="44"/>
-        </w:rPr>
-      </w:pPr>
-      <w:r>
-        <w:rPr>
-          <w:b/>
-          <w:bCs/>
+          <w:sz w:val="44"/>
+          <w:szCs w:val="44"/>
+        </w:rPr>
+      </w:pPr>
+      <w:r>
+        <w:rPr>
           <w:sz w:val="44"/>
           <w:szCs w:val="44"/>
         </w:rPr>
@@ -1263,35 +1055,43 @@
     <w:p>
       <w:pPr>
         <w:rPr>
-          <w:b/>
-          <w:bCs/>
-          <w:sz w:val="44"/>
-          <w:szCs w:val="44"/>
-        </w:rPr>
-      </w:pPr>
-      <w:r>
-        <w:rPr>
-          <w:b/>
-          <w:bCs/>
-          <w:sz w:val="44"/>
-          <w:szCs w:val="44"/>
-        </w:rPr>
-        <w:t>52)What is functional i/f.</w:t>
-      </w:r>
-    </w:p>
-    <w:p>
-      <w:pPr>
-        <w:rPr>
-          <w:b/>
-          <w:bCs/>
-          <w:sz w:val="44"/>
-          <w:szCs w:val="44"/>
-        </w:rPr>
-      </w:pPr>
-      <w:r>
-        <w:rPr>
-          <w:b/>
-          <w:bCs/>
+          <w:sz w:val="44"/>
+          <w:szCs w:val="44"/>
+        </w:rPr>
+      </w:pPr>
+      <w:r>
+        <w:rPr>
+          <w:sz w:val="44"/>
+          <w:szCs w:val="44"/>
+        </w:rPr>
+        <w:t xml:space="preserve">52)What is functional </w:t>
+      </w:r>
+      <w:proofErr w:type="spellStart"/>
+      <w:r>
+        <w:rPr>
+          <w:sz w:val="44"/>
+          <w:szCs w:val="44"/>
+        </w:rPr>
+        <w:t>i</w:t>
+      </w:r>
+      <w:proofErr w:type="spellEnd"/>
+      <w:r>
+        <w:rPr>
+          <w:sz w:val="44"/>
+          <w:szCs w:val="44"/>
+        </w:rPr>
+        <w:t>/f.</w:t>
+      </w:r>
+    </w:p>
+    <w:p>
+      <w:pPr>
+        <w:rPr>
+          <w:sz w:val="44"/>
+          <w:szCs w:val="44"/>
+        </w:rPr>
+      </w:pPr>
+      <w:r>
+        <w:rPr>
           <w:sz w:val="44"/>
           <w:szCs w:val="44"/>
         </w:rPr>
@@ -1300,18 +1100,23 @@
       <w:proofErr w:type="gramStart"/>
       <w:r>
         <w:rPr>
-          <w:b/>
-          <w:bCs/>
-          <w:sz w:val="44"/>
-          <w:szCs w:val="44"/>
-        </w:rPr>
-        <w:t>of  i</w:t>
-      </w:r>
-      <w:proofErr w:type="gramEnd"/>
-      <w:r>
-        <w:rPr>
-          <w:b/>
-          <w:bCs/>
+          <w:sz w:val="44"/>
+          <w:szCs w:val="44"/>
+        </w:rPr>
+        <w:t xml:space="preserve">of  </w:t>
+      </w:r>
+      <w:proofErr w:type="spellStart"/>
+      <w:r>
+        <w:rPr>
+          <w:sz w:val="44"/>
+          <w:szCs w:val="44"/>
+        </w:rPr>
+        <w:t>i</w:t>
+      </w:r>
+      <w:proofErr w:type="spellEnd"/>
+      <w:proofErr w:type="gramEnd"/>
+      <w:r>
+        <w:rPr>
           <w:sz w:val="44"/>
           <w:szCs w:val="44"/>
         </w:rPr>
@@ -1321,16 +1126,12 @@
     <w:p>
       <w:pPr>
         <w:rPr>
-          <w:b/>
-          <w:bCs/>
-          <w:sz w:val="44"/>
-          <w:szCs w:val="44"/>
-        </w:rPr>
-      </w:pPr>
-      <w:r>
-        <w:rPr>
-          <w:b/>
-          <w:bCs/>
+          <w:sz w:val="44"/>
+          <w:szCs w:val="44"/>
+        </w:rPr>
+      </w:pPr>
+      <w:r>
+        <w:rPr>
           <w:sz w:val="44"/>
           <w:szCs w:val="44"/>
         </w:rPr>
@@ -1340,16 +1141,12 @@
     <w:p>
       <w:pPr>
         <w:rPr>
-          <w:b/>
-          <w:bCs/>
-          <w:sz w:val="44"/>
-          <w:szCs w:val="44"/>
-        </w:rPr>
-      </w:pPr>
-      <w:r>
-        <w:rPr>
-          <w:b/>
-          <w:bCs/>
+          <w:sz w:val="44"/>
+          <w:szCs w:val="44"/>
+        </w:rPr>
+      </w:pPr>
+      <w:r>
+        <w:rPr>
           <w:sz w:val="44"/>
           <w:szCs w:val="44"/>
         </w:rPr>
@@ -1357,8 +1154,6 @@
       </w:r>
       <w:r>
         <w:rPr>
-          <w:b/>
-          <w:bCs/>
           <w:sz w:val="44"/>
           <w:szCs w:val="44"/>
         </w:rPr>
@@ -1368,56 +1163,62 @@
     <w:p>
       <w:pPr>
         <w:rPr>
-          <w:b/>
-          <w:bCs/>
-          <w:sz w:val="44"/>
-          <w:szCs w:val="44"/>
-        </w:rPr>
-      </w:pPr>
-      <w:r>
-        <w:rPr>
-          <w:b/>
-          <w:bCs/>
+          <w:sz w:val="44"/>
+          <w:szCs w:val="44"/>
+        </w:rPr>
+      </w:pPr>
+      <w:r>
+        <w:rPr>
           <w:sz w:val="44"/>
           <w:szCs w:val="44"/>
         </w:rPr>
         <w:t xml:space="preserve">56) </w:t>
       </w:r>
-      <w:proofErr w:type="gramStart"/>
-      <w:r>
-        <w:rPr>
-          <w:b/>
-          <w:bCs/>
-          <w:sz w:val="44"/>
-          <w:szCs w:val="44"/>
-        </w:rPr>
-        <w:t>ToString(</w:t>
-      </w:r>
-      <w:proofErr w:type="gramEnd"/>
-      <w:r>
-        <w:rPr>
-          <w:b/>
-          <w:bCs/>
+      <w:proofErr w:type="spellStart"/>
+      <w:proofErr w:type="gramStart"/>
+      <w:r>
+        <w:rPr>
+          <w:sz w:val="44"/>
+          <w:szCs w:val="44"/>
+        </w:rPr>
+        <w:t>ToString</w:t>
+      </w:r>
+      <w:proofErr w:type="spellEnd"/>
+      <w:r>
+        <w:rPr>
+          <w:sz w:val="44"/>
+          <w:szCs w:val="44"/>
+        </w:rPr>
+        <w:t>(</w:t>
+      </w:r>
+      <w:proofErr w:type="gramEnd"/>
+      <w:r>
+        <w:rPr>
           <w:sz w:val="44"/>
           <w:szCs w:val="44"/>
         </w:rPr>
         <w:t xml:space="preserve">) and </w:t>
       </w:r>
-      <w:proofErr w:type="gramStart"/>
-      <w:r>
-        <w:rPr>
-          <w:b/>
-          <w:bCs/>
-          <w:sz w:val="44"/>
-          <w:szCs w:val="44"/>
-        </w:rPr>
-        <w:t>getClass(</w:t>
-      </w:r>
-      <w:proofErr w:type="gramEnd"/>
-      <w:r>
-        <w:rPr>
-          <w:b/>
-          <w:bCs/>
+      <w:proofErr w:type="spellStart"/>
+      <w:proofErr w:type="gramStart"/>
+      <w:r>
+        <w:rPr>
+          <w:sz w:val="44"/>
+          <w:szCs w:val="44"/>
+        </w:rPr>
+        <w:t>getClass</w:t>
+      </w:r>
+      <w:proofErr w:type="spellEnd"/>
+      <w:r>
+        <w:rPr>
+          <w:sz w:val="44"/>
+          <w:szCs w:val="44"/>
+        </w:rPr>
+        <w:t>(</w:t>
+      </w:r>
+      <w:proofErr w:type="gramEnd"/>
+      <w:r>
+        <w:rPr>
           <w:sz w:val="44"/>
           <w:szCs w:val="44"/>
         </w:rPr>
@@ -1427,16 +1228,12 @@
     <w:p>
       <w:pPr>
         <w:rPr>
-          <w:b/>
-          <w:bCs/>
-          <w:sz w:val="44"/>
-          <w:szCs w:val="44"/>
-        </w:rPr>
-      </w:pPr>
-      <w:r>
-        <w:rPr>
-          <w:b/>
-          <w:bCs/>
+          <w:sz w:val="44"/>
+          <w:szCs w:val="44"/>
+        </w:rPr>
+      </w:pPr>
+      <w:r>
+        <w:rPr>
           <w:sz w:val="44"/>
           <w:szCs w:val="44"/>
         </w:rPr>
@@ -1446,26 +1243,20 @@
     <w:p>
       <w:pPr>
         <w:rPr>
-          <w:b/>
-          <w:bCs/>
-          <w:sz w:val="44"/>
-          <w:szCs w:val="44"/>
-        </w:rPr>
-      </w:pPr>
-    </w:p>
-    <w:p>
-      <w:pPr>
-        <w:rPr>
-          <w:b/>
-          <w:bCs/>
-          <w:sz w:val="44"/>
-          <w:szCs w:val="44"/>
-        </w:rPr>
-      </w:pPr>
-      <w:r>
-        <w:rPr>
-          <w:b/>
-          <w:bCs/>
+          <w:sz w:val="44"/>
+          <w:szCs w:val="44"/>
+        </w:rPr>
+      </w:pPr>
+    </w:p>
+    <w:p>
+      <w:pPr>
+        <w:rPr>
+          <w:sz w:val="44"/>
+          <w:szCs w:val="44"/>
+        </w:rPr>
+      </w:pPr>
+      <w:r>
+        <w:rPr>
           <w:sz w:val="44"/>
           <w:szCs w:val="44"/>
         </w:rPr>
@@ -1474,8 +1265,6 @@
       <w:proofErr w:type="gramStart"/>
       <w:r>
         <w:rPr>
-          <w:b/>
-          <w:bCs/>
           <w:sz w:val="44"/>
           <w:szCs w:val="44"/>
         </w:rPr>
@@ -1484,8 +1273,6 @@
       <w:proofErr w:type="gramEnd"/>
       <w:r>
         <w:rPr>
-          <w:b/>
-          <w:bCs/>
           <w:sz w:val="44"/>
           <w:szCs w:val="44"/>
         </w:rPr>
@@ -1495,16 +1282,12 @@
     <w:p>
       <w:pPr>
         <w:rPr>
-          <w:b/>
-          <w:bCs/>
-          <w:sz w:val="44"/>
-          <w:szCs w:val="44"/>
-        </w:rPr>
-      </w:pPr>
-      <w:r>
-        <w:rPr>
-          <w:b/>
-          <w:bCs/>
+          <w:sz w:val="44"/>
+          <w:szCs w:val="44"/>
+        </w:rPr>
+      </w:pPr>
+      <w:r>
+        <w:rPr>
           <w:sz w:val="44"/>
           <w:szCs w:val="44"/>
         </w:rPr>
@@ -1513,8 +1296,6 @@
       <w:proofErr w:type="gramStart"/>
       <w:r>
         <w:rPr>
-          <w:b/>
-          <w:bCs/>
           <w:sz w:val="44"/>
           <w:szCs w:val="44"/>
         </w:rPr>
@@ -1525,16 +1306,12 @@
     <w:p>
       <w:pPr>
         <w:rPr>
-          <w:b/>
-          <w:bCs/>
-          <w:sz w:val="44"/>
-          <w:szCs w:val="44"/>
-        </w:rPr>
-      </w:pPr>
-      <w:r>
-        <w:rPr>
-          <w:b/>
-          <w:bCs/>
+          <w:sz w:val="44"/>
+          <w:szCs w:val="44"/>
+        </w:rPr>
+      </w:pPr>
+      <w:r>
+        <w:rPr>
           <w:sz w:val="44"/>
           <w:szCs w:val="44"/>
         </w:rPr>
@@ -1544,16 +1321,12 @@
     <w:p>
       <w:pPr>
         <w:rPr>
-          <w:b/>
-          <w:bCs/>
-          <w:sz w:val="44"/>
-          <w:szCs w:val="44"/>
-        </w:rPr>
-      </w:pPr>
-      <w:r>
-        <w:rPr>
-          <w:b/>
-          <w:bCs/>
+          <w:sz w:val="44"/>
+          <w:szCs w:val="44"/>
+        </w:rPr>
+      </w:pPr>
+      <w:r>
+        <w:rPr>
           <w:sz w:val="44"/>
           <w:szCs w:val="44"/>
         </w:rPr>
@@ -1562,8 +1335,6 @@
       <w:proofErr w:type="gramStart"/>
       <w:r>
         <w:rPr>
-          <w:b/>
-          <w:bCs/>
           <w:sz w:val="44"/>
           <w:szCs w:val="44"/>
         </w:rPr>
@@ -1574,16 +1345,12 @@
     <w:p>
       <w:pPr>
         <w:rPr>
-          <w:b/>
-          <w:bCs/>
-          <w:sz w:val="44"/>
-          <w:szCs w:val="44"/>
-        </w:rPr>
-      </w:pPr>
-      <w:r>
-        <w:rPr>
-          <w:b/>
-          <w:bCs/>
+          <w:sz w:val="44"/>
+          <w:szCs w:val="44"/>
+        </w:rPr>
+      </w:pPr>
+      <w:r>
+        <w:rPr>
           <w:sz w:val="44"/>
           <w:szCs w:val="44"/>
         </w:rPr>
@@ -1592,8 +1359,6 @@
       <w:proofErr w:type="gramStart"/>
       <w:r>
         <w:rPr>
-          <w:b/>
-          <w:bCs/>
           <w:sz w:val="44"/>
           <w:szCs w:val="44"/>
         </w:rPr>
@@ -1602,8 +1367,6 @@
       <w:proofErr w:type="gramEnd"/>
       <w:r>
         <w:rPr>
-          <w:b/>
-          <w:bCs/>
           <w:sz w:val="44"/>
           <w:szCs w:val="44"/>
         </w:rPr>
@@ -1612,8 +1375,6 @@
       <w:proofErr w:type="gramStart"/>
       <w:r>
         <w:rPr>
-          <w:b/>
-          <w:bCs/>
           <w:sz w:val="44"/>
           <w:szCs w:val="44"/>
         </w:rPr>
@@ -1622,8 +1383,6 @@
       <w:proofErr w:type="gramEnd"/>
       <w:r>
         <w:rPr>
-          <w:b/>
-          <w:bCs/>
           <w:sz w:val="44"/>
           <w:szCs w:val="44"/>
         </w:rPr>
@@ -1633,16 +1392,12 @@
     <w:p>
       <w:pPr>
         <w:rPr>
-          <w:b/>
-          <w:bCs/>
-          <w:sz w:val="44"/>
-          <w:szCs w:val="44"/>
-        </w:rPr>
-      </w:pPr>
-      <w:r>
-        <w:rPr>
-          <w:b/>
-          <w:bCs/>
+          <w:sz w:val="44"/>
+          <w:szCs w:val="44"/>
+        </w:rPr>
+      </w:pPr>
+      <w:r>
+        <w:rPr>
           <w:sz w:val="44"/>
           <w:szCs w:val="44"/>
         </w:rPr>
@@ -1652,16 +1407,12 @@
     <w:p>
       <w:pPr>
         <w:rPr>
-          <w:b/>
-          <w:bCs/>
-          <w:sz w:val="44"/>
-          <w:szCs w:val="44"/>
-        </w:rPr>
-      </w:pPr>
-      <w:r>
-        <w:rPr>
-          <w:b/>
-          <w:bCs/>
+          <w:sz w:val="44"/>
+          <w:szCs w:val="44"/>
+        </w:rPr>
+      </w:pPr>
+      <w:r>
+        <w:rPr>
           <w:sz w:val="44"/>
           <w:szCs w:val="44"/>
         </w:rPr>
@@ -1670,8 +1421,6 @@
       <w:proofErr w:type="gramStart"/>
       <w:r>
         <w:rPr>
-          <w:b/>
-          <w:bCs/>
           <w:sz w:val="44"/>
           <w:szCs w:val="44"/>
         </w:rPr>
@@ -1682,16 +1431,12 @@
     <w:p>
       <w:pPr>
         <w:rPr>
-          <w:b/>
-          <w:bCs/>
-          <w:sz w:val="44"/>
-          <w:szCs w:val="44"/>
-        </w:rPr>
-      </w:pPr>
-      <w:r>
-        <w:rPr>
-          <w:b/>
-          <w:bCs/>
+          <w:sz w:val="44"/>
+          <w:szCs w:val="44"/>
+        </w:rPr>
+      </w:pPr>
+      <w:r>
+        <w:rPr>
           <w:sz w:val="44"/>
           <w:szCs w:val="44"/>
         </w:rPr>
@@ -1700,8 +1445,6 @@
       <w:proofErr w:type="gramStart"/>
       <w:r>
         <w:rPr>
-          <w:b/>
-          <w:bCs/>
           <w:sz w:val="44"/>
           <w:szCs w:val="44"/>
         </w:rPr>
@@ -1710,8 +1453,6 @@
       <w:proofErr w:type="gramEnd"/>
       <w:r>
         <w:rPr>
-          <w:b/>
-          <w:bCs/>
           <w:sz w:val="44"/>
           <w:szCs w:val="44"/>
         </w:rPr>
@@ -1720,8 +1461,6 @@
       <w:proofErr w:type="gramStart"/>
       <w:r>
         <w:rPr>
-          <w:b/>
-          <w:bCs/>
           <w:sz w:val="44"/>
           <w:szCs w:val="44"/>
         </w:rPr>
@@ -1730,8 +1469,6 @@
       <w:proofErr w:type="gramEnd"/>
       <w:r>
         <w:rPr>
-          <w:b/>
-          <w:bCs/>
           <w:sz w:val="44"/>
           <w:szCs w:val="44"/>
         </w:rPr>
@@ -1741,16 +1478,12 @@
     <w:p>
       <w:pPr>
         <w:rPr>
-          <w:b/>
-          <w:bCs/>
-          <w:sz w:val="44"/>
-          <w:szCs w:val="44"/>
-        </w:rPr>
-      </w:pPr>
-      <w:r>
-        <w:rPr>
-          <w:b/>
-          <w:bCs/>
+          <w:sz w:val="44"/>
+          <w:szCs w:val="44"/>
+        </w:rPr>
+      </w:pPr>
+      <w:r>
+        <w:rPr>
           <w:sz w:val="44"/>
           <w:szCs w:val="44"/>
         </w:rPr>
@@ -1759,8 +1492,6 @@
       </w:r>
       <w:r>
         <w:rPr>
-          <w:b/>
-          <w:bCs/>
           <w:sz w:val="44"/>
           <w:szCs w:val="44"/>
         </w:rPr>
@@ -1769,8 +1500,6 @@
       <w:proofErr w:type="gramStart"/>
       <w:r>
         <w:rPr>
-          <w:b/>
-          <w:bCs/>
           <w:sz w:val="44"/>
           <w:szCs w:val="44"/>
         </w:rPr>
@@ -1779,8 +1508,6 @@
       <w:proofErr w:type="gramEnd"/>
       <w:r>
         <w:rPr>
-          <w:b/>
-          <w:bCs/>
           <w:sz w:val="44"/>
           <w:szCs w:val="44"/>
         </w:rPr>
@@ -1789,8 +1516,6 @@
       <w:proofErr w:type="gramStart"/>
       <w:r>
         <w:rPr>
-          <w:b/>
-          <w:bCs/>
           <w:sz w:val="44"/>
           <w:szCs w:val="44"/>
         </w:rPr>
@@ -1799,8 +1524,6 @@
       <w:proofErr w:type="gramEnd"/>
       <w:r>
         <w:rPr>
-          <w:b/>
-          <w:bCs/>
           <w:sz w:val="44"/>
           <w:szCs w:val="44"/>
         </w:rPr>
@@ -1810,16 +1533,12 @@
     <w:p>
       <w:pPr>
         <w:rPr>
-          <w:b/>
-          <w:bCs/>
-          <w:sz w:val="44"/>
-          <w:szCs w:val="44"/>
-        </w:rPr>
-      </w:pPr>
-      <w:r>
-        <w:rPr>
-          <w:b/>
-          <w:bCs/>
+          <w:sz w:val="44"/>
+          <w:szCs w:val="44"/>
+        </w:rPr>
+      </w:pPr>
+      <w:r>
+        <w:rPr>
           <w:sz w:val="44"/>
           <w:szCs w:val="44"/>
         </w:rPr>
@@ -1828,8 +1547,6 @@
       <w:proofErr w:type="gramStart"/>
       <w:r>
         <w:rPr>
-          <w:b/>
-          <w:bCs/>
           <w:sz w:val="44"/>
           <w:szCs w:val="44"/>
         </w:rPr>
@@ -1838,8 +1555,6 @@
       <w:proofErr w:type="gramEnd"/>
       <w:r>
         <w:rPr>
-          <w:b/>
-          <w:bCs/>
           <w:sz w:val="44"/>
           <w:szCs w:val="44"/>
         </w:rPr>
@@ -1848,8 +1563,6 @@
       <w:proofErr w:type="gramStart"/>
       <w:r>
         <w:rPr>
-          <w:b/>
-          <w:bCs/>
           <w:sz w:val="44"/>
           <w:szCs w:val="44"/>
         </w:rPr>
@@ -1860,16 +1573,12 @@
     <w:p>
       <w:pPr>
         <w:rPr>
-          <w:b/>
-          <w:bCs/>
-          <w:sz w:val="44"/>
-          <w:szCs w:val="44"/>
-        </w:rPr>
-      </w:pPr>
-      <w:r>
-        <w:rPr>
-          <w:b/>
-          <w:bCs/>
+          <w:sz w:val="44"/>
+          <w:szCs w:val="44"/>
+        </w:rPr>
+      </w:pPr>
+      <w:r>
+        <w:rPr>
           <w:sz w:val="44"/>
           <w:szCs w:val="44"/>
         </w:rPr>
@@ -1877,8 +1586,6 @@
       </w:r>
       <w:r>
         <w:rPr>
-          <w:b/>
-          <w:bCs/>
           <w:sz w:val="44"/>
           <w:szCs w:val="44"/>
         </w:rPr>
@@ -1888,16 +1595,12 @@
     <w:p>
       <w:pPr>
         <w:rPr>
-          <w:b/>
-          <w:bCs/>
-          <w:sz w:val="44"/>
-          <w:szCs w:val="44"/>
-        </w:rPr>
-      </w:pPr>
-      <w:r>
-        <w:rPr>
-          <w:b/>
-          <w:bCs/>
+          <w:sz w:val="44"/>
+          <w:szCs w:val="44"/>
+        </w:rPr>
+      </w:pPr>
+      <w:r>
+        <w:rPr>
           <w:sz w:val="44"/>
           <w:szCs w:val="44"/>
         </w:rPr>
@@ -1906,38 +1609,41 @@
       <w:proofErr w:type="gramStart"/>
       <w:r>
         <w:rPr>
-          <w:b/>
-          <w:bCs/>
-          <w:sz w:val="44"/>
-          <w:szCs w:val="44"/>
-        </w:rPr>
-        <w:t>is .hashCode</w:t>
-      </w:r>
-      <w:proofErr w:type="gramEnd"/>
-      <w:r>
-        <w:rPr>
-          <w:b/>
-          <w:bCs/>
+          <w:sz w:val="44"/>
+          <w:szCs w:val="44"/>
+        </w:rPr>
+        <w:t>is .</w:t>
+      </w:r>
+      <w:proofErr w:type="spellStart"/>
+      <w:r>
+        <w:rPr>
+          <w:sz w:val="44"/>
+          <w:szCs w:val="44"/>
+        </w:rPr>
+        <w:t>hashCode</w:t>
+      </w:r>
+      <w:proofErr w:type="spellEnd"/>
+      <w:proofErr w:type="gramEnd"/>
+      <w:r>
+        <w:rPr>
           <w:sz w:val="44"/>
           <w:szCs w:val="44"/>
         </w:rPr>
         <w:t xml:space="preserve">() and </w:t>
       </w:r>
-      <w:proofErr w:type="gramStart"/>
-      <w:r>
-        <w:rPr>
-          <w:b/>
-          <w:bCs/>
+      <w:proofErr w:type="spellStart"/>
+      <w:proofErr w:type="gramStart"/>
+      <w:r>
+        <w:rPr>
           <w:sz w:val="44"/>
           <w:szCs w:val="44"/>
         </w:rPr>
         <w:t>it’s</w:t>
       </w:r>
-      <w:proofErr w:type="gramEnd"/>
-      <w:r>
-        <w:rPr>
-          <w:b/>
-          <w:bCs/>
+      <w:proofErr w:type="spellEnd"/>
+      <w:proofErr w:type="gramEnd"/>
+      <w:r>
+        <w:rPr>
           <w:sz w:val="44"/>
           <w:szCs w:val="44"/>
         </w:rPr>
@@ -1947,16 +1653,12 @@
     <w:p>
       <w:pPr>
         <w:rPr>
-          <w:b/>
-          <w:bCs/>
-          <w:sz w:val="44"/>
-          <w:szCs w:val="44"/>
-        </w:rPr>
-      </w:pPr>
-      <w:r>
-        <w:rPr>
-          <w:b/>
-          <w:bCs/>
+          <w:sz w:val="44"/>
+          <w:szCs w:val="44"/>
+        </w:rPr>
+      </w:pPr>
+      <w:r>
+        <w:rPr>
           <w:sz w:val="44"/>
           <w:szCs w:val="44"/>
         </w:rPr>
@@ -1965,8 +1667,6 @@
       <w:proofErr w:type="gramStart"/>
       <w:r>
         <w:rPr>
-          <w:b/>
-          <w:bCs/>
           <w:sz w:val="44"/>
           <w:szCs w:val="44"/>
         </w:rPr>
@@ -1975,8 +1675,6 @@
       <w:proofErr w:type="gramEnd"/>
       <w:r>
         <w:rPr>
-          <w:b/>
-          <w:bCs/>
           <w:sz w:val="44"/>
           <w:szCs w:val="44"/>
         </w:rPr>
@@ -1985,8 +1683,6 @@
       <w:proofErr w:type="gramStart"/>
       <w:r>
         <w:rPr>
-          <w:b/>
-          <w:bCs/>
           <w:sz w:val="44"/>
           <w:szCs w:val="44"/>
         </w:rPr>
@@ -1997,16 +1693,12 @@
     <w:p>
       <w:pPr>
         <w:rPr>
-          <w:b/>
-          <w:bCs/>
-          <w:sz w:val="44"/>
-          <w:szCs w:val="44"/>
-        </w:rPr>
-      </w:pPr>
-      <w:r>
-        <w:rPr>
-          <w:b/>
-          <w:bCs/>
+          <w:sz w:val="44"/>
+          <w:szCs w:val="44"/>
+        </w:rPr>
+      </w:pPr>
+      <w:r>
+        <w:rPr>
           <w:sz w:val="44"/>
           <w:szCs w:val="44"/>
         </w:rPr>
@@ -2015,18 +1707,23 @@
       <w:proofErr w:type="gramStart"/>
       <w:r>
         <w:rPr>
-          <w:b/>
-          <w:bCs/>
-          <w:sz w:val="44"/>
-          <w:szCs w:val="44"/>
-        </w:rPr>
-        <w:t>the .hashCode</w:t>
-      </w:r>
-      <w:proofErr w:type="gramEnd"/>
-      <w:r>
-        <w:rPr>
-          <w:b/>
-          <w:bCs/>
+          <w:sz w:val="44"/>
+          <w:szCs w:val="44"/>
+        </w:rPr>
+        <w:t>the .</w:t>
+      </w:r>
+      <w:proofErr w:type="spellStart"/>
+      <w:r>
+        <w:rPr>
+          <w:sz w:val="44"/>
+          <w:szCs w:val="44"/>
+        </w:rPr>
+        <w:t>hashCode</w:t>
+      </w:r>
+      <w:proofErr w:type="spellEnd"/>
+      <w:proofErr w:type="gramEnd"/>
+      <w:r>
+        <w:rPr>
           <w:sz w:val="44"/>
           <w:szCs w:val="44"/>
         </w:rPr>
@@ -2036,16 +1733,12 @@
     <w:p>
       <w:pPr>
         <w:rPr>
-          <w:b/>
-          <w:bCs/>
-          <w:sz w:val="44"/>
-          <w:szCs w:val="44"/>
-        </w:rPr>
-      </w:pPr>
-      <w:r>
-        <w:rPr>
-          <w:b/>
-          <w:bCs/>
+          <w:sz w:val="44"/>
+          <w:szCs w:val="44"/>
+        </w:rPr>
+      </w:pPr>
+      <w:r>
+        <w:rPr>
           <w:sz w:val="44"/>
           <w:szCs w:val="44"/>
         </w:rPr>
@@ -2054,18 +1747,30 @@
       <w:proofErr w:type="gramStart"/>
       <w:r>
         <w:rPr>
-          <w:b/>
-          <w:bCs/>
-          <w:sz w:val="44"/>
-          <w:szCs w:val="44"/>
-        </w:rPr>
-        <w:t>and  .hashCode(</w:t>
-      </w:r>
-      <w:proofErr w:type="gramEnd"/>
-      <w:r>
-        <w:rPr>
-          <w:b/>
-          <w:bCs/>
+          <w:sz w:val="44"/>
+          <w:szCs w:val="44"/>
+        </w:rPr>
+        <w:t>and  .</w:t>
+      </w:r>
+      <w:proofErr w:type="spellStart"/>
+      <w:r>
+        <w:rPr>
+          <w:sz w:val="44"/>
+          <w:szCs w:val="44"/>
+        </w:rPr>
+        <w:t>hashCode</w:t>
+      </w:r>
+      <w:proofErr w:type="spellEnd"/>
+      <w:r>
+        <w:rPr>
+          <w:sz w:val="44"/>
+          <w:szCs w:val="44"/>
+        </w:rPr>
+        <w:t>(</w:t>
+      </w:r>
+      <w:proofErr w:type="gramEnd"/>
+      <w:r>
+        <w:rPr>
           <w:sz w:val="44"/>
           <w:szCs w:val="44"/>
         </w:rPr>
@@ -2075,16 +1780,12 @@
     <w:p>
       <w:pPr>
         <w:rPr>
-          <w:b/>
-          <w:bCs/>
-          <w:sz w:val="44"/>
-          <w:szCs w:val="44"/>
-        </w:rPr>
-      </w:pPr>
-      <w:r>
-        <w:rPr>
-          <w:b/>
-          <w:bCs/>
+          <w:sz w:val="44"/>
+          <w:szCs w:val="44"/>
+        </w:rPr>
+      </w:pPr>
+      <w:r>
+        <w:rPr>
           <w:sz w:val="44"/>
           <w:szCs w:val="44"/>
         </w:rPr>
@@ -2094,16 +1795,12 @@
     <w:p>
       <w:pPr>
         <w:rPr>
-          <w:b/>
-          <w:bCs/>
-          <w:sz w:val="44"/>
-          <w:szCs w:val="44"/>
-        </w:rPr>
-      </w:pPr>
-      <w:r>
-        <w:rPr>
-          <w:b/>
-          <w:bCs/>
+          <w:sz w:val="44"/>
+          <w:szCs w:val="44"/>
+        </w:rPr>
+      </w:pPr>
+      <w:r>
+        <w:rPr>
           <w:sz w:val="44"/>
           <w:szCs w:val="44"/>
         </w:rPr>
@@ -2113,35 +1810,43 @@
     <w:p>
       <w:pPr>
         <w:rPr>
-          <w:b/>
-          <w:bCs/>
-          <w:sz w:val="44"/>
-          <w:szCs w:val="44"/>
-        </w:rPr>
-      </w:pPr>
-      <w:r>
-        <w:rPr>
-          <w:b/>
-          <w:bCs/>
-          <w:sz w:val="44"/>
-          <w:szCs w:val="44"/>
-        </w:rPr>
-        <w:t>75) instanceof operator.</w:t>
-      </w:r>
-    </w:p>
-    <w:p>
-      <w:pPr>
-        <w:rPr>
-          <w:b/>
-          <w:bCs/>
-          <w:sz w:val="44"/>
-          <w:szCs w:val="44"/>
-        </w:rPr>
-      </w:pPr>
-      <w:r>
-        <w:rPr>
-          <w:b/>
-          <w:bCs/>
+          <w:sz w:val="44"/>
+          <w:szCs w:val="44"/>
+        </w:rPr>
+      </w:pPr>
+      <w:r>
+        <w:rPr>
+          <w:sz w:val="44"/>
+          <w:szCs w:val="44"/>
+        </w:rPr>
+        <w:t xml:space="preserve">75) </w:t>
+      </w:r>
+      <w:proofErr w:type="spellStart"/>
+      <w:r>
+        <w:rPr>
+          <w:sz w:val="44"/>
+          <w:szCs w:val="44"/>
+        </w:rPr>
+        <w:t>instanceof</w:t>
+      </w:r>
+      <w:proofErr w:type="spellEnd"/>
+      <w:r>
+        <w:rPr>
+          <w:sz w:val="44"/>
+          <w:szCs w:val="44"/>
+        </w:rPr>
+        <w:t xml:space="preserve"> operator.</w:t>
+      </w:r>
+    </w:p>
+    <w:p>
+      <w:pPr>
+        <w:rPr>
+          <w:sz w:val="44"/>
+          <w:szCs w:val="44"/>
+        </w:rPr>
+      </w:pPr>
+      <w:r>
+        <w:rPr>
           <w:sz w:val="44"/>
           <w:szCs w:val="44"/>
         </w:rPr>
@@ -2151,16 +1856,12 @@
     <w:p>
       <w:pPr>
         <w:rPr>
-          <w:b/>
-          <w:bCs/>
-          <w:sz w:val="44"/>
-          <w:szCs w:val="44"/>
-        </w:rPr>
-      </w:pPr>
-      <w:r>
-        <w:rPr>
-          <w:b/>
-          <w:bCs/>
+          <w:sz w:val="44"/>
+          <w:szCs w:val="44"/>
+        </w:rPr>
+      </w:pPr>
+      <w:r>
+        <w:rPr>
           <w:sz w:val="44"/>
           <w:szCs w:val="44"/>
         </w:rPr>
@@ -2169,8 +1870,6 @@
       <w:proofErr w:type="gramStart"/>
       <w:r>
         <w:rPr>
-          <w:b/>
-          <w:bCs/>
           <w:sz w:val="44"/>
           <w:szCs w:val="44"/>
         </w:rPr>
@@ -2179,8 +1878,6 @@
       <w:proofErr w:type="gramEnd"/>
       <w:r>
         <w:rPr>
-          <w:b/>
-          <w:bCs/>
           <w:sz w:val="44"/>
           <w:szCs w:val="44"/>
         </w:rPr>
@@ -2189,8 +1886,6 @@
       <w:proofErr w:type="gramStart"/>
       <w:r>
         <w:rPr>
-          <w:b/>
-          <w:bCs/>
           <w:sz w:val="44"/>
           <w:szCs w:val="44"/>
         </w:rPr>
@@ -2201,16 +1896,12 @@
     <w:p>
       <w:pPr>
         <w:rPr>
-          <w:b/>
-          <w:bCs/>
-          <w:sz w:val="44"/>
-          <w:szCs w:val="44"/>
-        </w:rPr>
-      </w:pPr>
-      <w:r>
-        <w:rPr>
-          <w:b/>
-          <w:bCs/>
+          <w:sz w:val="44"/>
+          <w:szCs w:val="44"/>
+        </w:rPr>
+      </w:pPr>
+      <w:r>
+        <w:rPr>
           <w:sz w:val="44"/>
           <w:szCs w:val="44"/>
         </w:rPr>
@@ -2220,58 +1911,537 @@
     <w:p>
       <w:pPr>
         <w:rPr>
-          <w:b/>
-          <w:bCs/>
-          <w:sz w:val="44"/>
-          <w:szCs w:val="44"/>
-        </w:rPr>
-      </w:pPr>
-      <w:r>
-        <w:rPr>
-          <w:b/>
-          <w:bCs/>
+          <w:sz w:val="44"/>
+          <w:szCs w:val="44"/>
+        </w:rPr>
+      </w:pPr>
+      <w:r>
+        <w:rPr>
           <w:sz w:val="44"/>
           <w:szCs w:val="44"/>
         </w:rPr>
         <w:lastRenderedPageBreak/>
-        <w:t xml:space="preserve">79) try with </w:t>
-      </w:r>
-      <w:proofErr w:type="gramStart"/>
-      <w:r>
-        <w:rPr>
-          <w:b/>
-          <w:bCs/>
-          <w:sz w:val="44"/>
-          <w:szCs w:val="44"/>
-        </w:rPr>
-        <w:t>resource.(</w:t>
-      </w:r>
-      <w:proofErr w:type="gramEnd"/>
-      <w:r>
-        <w:rPr>
-          <w:b/>
-          <w:bCs/>
-          <w:sz w:val="44"/>
-          <w:szCs w:val="44"/>
-        </w:rPr>
-        <w:t>*)</w:t>
-      </w:r>
-    </w:p>
-    <w:p>
-      <w:pPr>
-        <w:rPr>
-          <w:b/>
-          <w:bCs/>
-          <w:sz w:val="44"/>
-          <w:szCs w:val="44"/>
-        </w:rPr>
-      </w:pPr>
-    </w:p>
-    <w:p>
-      <w:pPr>
-        <w:rPr>
-          <w:b/>
-          <w:bCs/>
+        <w:t>79) try with resource.</w:t>
+      </w:r>
+    </w:p>
+    <w:p>
+      <w:pPr>
+        <w:rPr>
+          <w:sz w:val="44"/>
+          <w:szCs w:val="44"/>
+        </w:rPr>
+      </w:pPr>
+      <w:r>
+        <w:rPr>
+          <w:sz w:val="44"/>
+          <w:szCs w:val="44"/>
+        </w:rPr>
+        <w:t xml:space="preserve">80) what </w:t>
+      </w:r>
+      <w:proofErr w:type="gramStart"/>
+      <w:r>
+        <w:rPr>
+          <w:sz w:val="44"/>
+          <w:szCs w:val="44"/>
+        </w:rPr>
+        <w:t>is .</w:t>
+      </w:r>
+      <w:proofErr w:type="spellStart"/>
+      <w:r>
+        <w:rPr>
+          <w:sz w:val="44"/>
+          <w:szCs w:val="44"/>
+        </w:rPr>
+        <w:t>hashCode</w:t>
+      </w:r>
+      <w:proofErr w:type="spellEnd"/>
+      <w:proofErr w:type="gramEnd"/>
+      <w:r>
+        <w:rPr>
+          <w:sz w:val="44"/>
+          <w:szCs w:val="44"/>
+        </w:rPr>
+        <w:t xml:space="preserve">() and </w:t>
+      </w:r>
+      <w:proofErr w:type="gramStart"/>
+      <w:r>
+        <w:rPr>
+          <w:sz w:val="44"/>
+          <w:szCs w:val="44"/>
+        </w:rPr>
+        <w:t>it’s</w:t>
+      </w:r>
+      <w:proofErr w:type="gramEnd"/>
+      <w:r>
+        <w:rPr>
+          <w:sz w:val="44"/>
+          <w:szCs w:val="44"/>
+        </w:rPr>
+        <w:t xml:space="preserve"> </w:t>
+      </w:r>
+      <w:proofErr w:type="gramStart"/>
+      <w:r>
+        <w:rPr>
+          <w:sz w:val="44"/>
+          <w:szCs w:val="44"/>
+        </w:rPr>
+        <w:t>significance ?</w:t>
+      </w:r>
+      <w:proofErr w:type="gramEnd"/>
+    </w:p>
+    <w:p>
+      <w:pPr>
+        <w:rPr>
+          <w:sz w:val="44"/>
+          <w:szCs w:val="44"/>
+        </w:rPr>
+      </w:pPr>
+      <w:r>
+        <w:rPr>
+          <w:sz w:val="44"/>
+          <w:szCs w:val="44"/>
+        </w:rPr>
+        <w:t xml:space="preserve">81) default </w:t>
+      </w:r>
+      <w:proofErr w:type="spellStart"/>
+      <w:r>
+        <w:rPr>
+          <w:sz w:val="44"/>
+          <w:szCs w:val="44"/>
+        </w:rPr>
+        <w:t>behaviour</w:t>
+      </w:r>
+      <w:proofErr w:type="spellEnd"/>
+      <w:r>
+        <w:rPr>
+          <w:sz w:val="44"/>
+          <w:szCs w:val="44"/>
+        </w:rPr>
+        <w:t xml:space="preserve"> of </w:t>
+      </w:r>
+      <w:proofErr w:type="gramStart"/>
+      <w:r>
+        <w:rPr>
+          <w:sz w:val="44"/>
+          <w:szCs w:val="44"/>
+        </w:rPr>
+        <w:t>the .equals</w:t>
+      </w:r>
+      <w:proofErr w:type="gramEnd"/>
+      <w:r>
+        <w:rPr>
+          <w:sz w:val="44"/>
+          <w:szCs w:val="44"/>
+        </w:rPr>
+        <w:t xml:space="preserve">() in </w:t>
+      </w:r>
+      <w:proofErr w:type="gramStart"/>
+      <w:r>
+        <w:rPr>
+          <w:sz w:val="44"/>
+          <w:szCs w:val="44"/>
+        </w:rPr>
+        <w:t>java ?</w:t>
+      </w:r>
+      <w:proofErr w:type="gramEnd"/>
+    </w:p>
+    <w:p>
+      <w:pPr>
+        <w:rPr>
+          <w:sz w:val="44"/>
+          <w:szCs w:val="44"/>
+        </w:rPr>
+      </w:pPr>
+      <w:r>
+        <w:rPr>
+          <w:sz w:val="44"/>
+          <w:szCs w:val="44"/>
+        </w:rPr>
+        <w:t xml:space="preserve">82) why </w:t>
+      </w:r>
+      <w:proofErr w:type="gramStart"/>
+      <w:r>
+        <w:rPr>
+          <w:sz w:val="44"/>
+          <w:szCs w:val="44"/>
+        </w:rPr>
+        <w:t>does .equals</w:t>
+      </w:r>
+      <w:proofErr w:type="gramEnd"/>
+      <w:r>
+        <w:rPr>
+          <w:sz w:val="44"/>
+          <w:szCs w:val="44"/>
+        </w:rPr>
+        <w:t>() behaves differently in String class?</w:t>
+      </w:r>
+    </w:p>
+    <w:p>
+      <w:pPr>
+        <w:rPr>
+          <w:sz w:val="44"/>
+          <w:szCs w:val="44"/>
+        </w:rPr>
+      </w:pPr>
+      <w:r>
+        <w:rPr>
+          <w:sz w:val="44"/>
+          <w:szCs w:val="44"/>
+        </w:rPr>
+        <w:t xml:space="preserve">83)what is the contract </w:t>
+      </w:r>
+      <w:proofErr w:type="gramStart"/>
+      <w:r>
+        <w:rPr>
+          <w:sz w:val="44"/>
+          <w:szCs w:val="44"/>
+        </w:rPr>
+        <w:t>between .equals</w:t>
+      </w:r>
+      <w:proofErr w:type="gramEnd"/>
+      <w:r>
+        <w:rPr>
+          <w:sz w:val="44"/>
+          <w:szCs w:val="44"/>
+        </w:rPr>
+        <w:t xml:space="preserve">() </w:t>
+      </w:r>
+      <w:proofErr w:type="gramStart"/>
+      <w:r>
+        <w:rPr>
+          <w:sz w:val="44"/>
+          <w:szCs w:val="44"/>
+        </w:rPr>
+        <w:t>and .</w:t>
+      </w:r>
+      <w:proofErr w:type="spellStart"/>
+      <w:r>
+        <w:rPr>
+          <w:sz w:val="44"/>
+          <w:szCs w:val="44"/>
+        </w:rPr>
+        <w:t>hashCode</w:t>
+      </w:r>
+      <w:proofErr w:type="spellEnd"/>
+      <w:proofErr w:type="gramEnd"/>
+      <w:r>
+        <w:rPr>
+          <w:sz w:val="44"/>
+          <w:szCs w:val="44"/>
+        </w:rPr>
+        <w:t xml:space="preserve">() in </w:t>
+      </w:r>
+      <w:proofErr w:type="gramStart"/>
+      <w:r>
+        <w:rPr>
+          <w:sz w:val="44"/>
+          <w:szCs w:val="44"/>
+        </w:rPr>
+        <w:t>java ?</w:t>
+      </w:r>
+      <w:proofErr w:type="gramEnd"/>
+    </w:p>
+    <w:p>
+      <w:pPr>
+        <w:rPr>
+          <w:sz w:val="44"/>
+          <w:szCs w:val="44"/>
+        </w:rPr>
+      </w:pPr>
+      <w:r>
+        <w:rPr>
+          <w:sz w:val="44"/>
+          <w:szCs w:val="44"/>
+        </w:rPr>
+        <w:t xml:space="preserve">84) </w:t>
+      </w:r>
+      <w:proofErr w:type="gramStart"/>
+      <w:r>
+        <w:rPr>
+          <w:sz w:val="44"/>
+          <w:szCs w:val="44"/>
+        </w:rPr>
+        <w:t>define :</w:t>
+      </w:r>
+      <w:proofErr w:type="gramEnd"/>
+      <w:r>
+        <w:rPr>
+          <w:sz w:val="44"/>
+          <w:szCs w:val="44"/>
+        </w:rPr>
+        <w:br/>
+        <w:t xml:space="preserve"> </w:t>
+      </w:r>
+      <w:proofErr w:type="gramStart"/>
+      <w:r>
+        <w:rPr>
+          <w:sz w:val="44"/>
+          <w:szCs w:val="44"/>
+        </w:rPr>
+        <w:t>a)</w:t>
+      </w:r>
+      <w:proofErr w:type="spellStart"/>
+      <w:r>
+        <w:rPr>
+          <w:sz w:val="44"/>
+          <w:szCs w:val="44"/>
+        </w:rPr>
+        <w:t>reflexitivity</w:t>
+      </w:r>
+      <w:proofErr w:type="spellEnd"/>
+      <w:proofErr w:type="gramEnd"/>
+    </w:p>
+    <w:p>
+      <w:pPr>
+        <w:rPr>
+          <w:sz w:val="44"/>
+          <w:szCs w:val="44"/>
+        </w:rPr>
+      </w:pPr>
+      <w:proofErr w:type="gramStart"/>
+      <w:r>
+        <w:rPr>
+          <w:sz w:val="44"/>
+          <w:szCs w:val="44"/>
+        </w:rPr>
+        <w:t>b)consistency</w:t>
+      </w:r>
+      <w:proofErr w:type="gramEnd"/>
+    </w:p>
+    <w:p>
+      <w:pPr>
+        <w:rPr>
+          <w:sz w:val="44"/>
+          <w:szCs w:val="44"/>
+        </w:rPr>
+      </w:pPr>
+      <w:r>
+        <w:rPr>
+          <w:sz w:val="44"/>
+          <w:szCs w:val="44"/>
+        </w:rPr>
+        <w:t>c)not-nullity</w:t>
+      </w:r>
+    </w:p>
+    <w:p>
+      <w:pPr>
+        <w:rPr>
+          <w:sz w:val="44"/>
+          <w:szCs w:val="44"/>
+        </w:rPr>
+      </w:pPr>
+      <w:r>
+        <w:rPr>
+          <w:sz w:val="44"/>
+          <w:szCs w:val="44"/>
+        </w:rPr>
+        <w:t>d)Symmetry</w:t>
+      </w:r>
+    </w:p>
+    <w:p>
+      <w:pPr>
+        <w:rPr>
+          <w:sz w:val="44"/>
+          <w:szCs w:val="44"/>
+        </w:rPr>
+      </w:pPr>
+      <w:proofErr w:type="gramStart"/>
+      <w:r>
+        <w:rPr>
+          <w:sz w:val="44"/>
+          <w:szCs w:val="44"/>
+        </w:rPr>
+        <w:t>e)transitivity</w:t>
+      </w:r>
+      <w:proofErr w:type="gramEnd"/>
+      <w:r>
+        <w:rPr>
+          <w:sz w:val="44"/>
+          <w:szCs w:val="44"/>
+        </w:rPr>
+        <w:t xml:space="preserve"> </w:t>
+      </w:r>
+    </w:p>
+    <w:p>
+      <w:pPr>
+        <w:rPr>
+          <w:sz w:val="44"/>
+          <w:szCs w:val="44"/>
+        </w:rPr>
+      </w:pPr>
+    </w:p>
+    <w:p>
+      <w:pPr>
+        <w:rPr>
+          <w:sz w:val="44"/>
+          <w:szCs w:val="44"/>
+        </w:rPr>
+      </w:pPr>
+      <w:r>
+        <w:rPr>
+          <w:sz w:val="44"/>
+          <w:szCs w:val="44"/>
+        </w:rPr>
+        <w:t xml:space="preserve">contracts </w:t>
+      </w:r>
+      <w:proofErr w:type="gramStart"/>
+      <w:r>
+        <w:rPr>
+          <w:sz w:val="44"/>
+          <w:szCs w:val="44"/>
+        </w:rPr>
+        <w:t>of .equals</w:t>
+      </w:r>
+      <w:proofErr w:type="gramEnd"/>
+      <w:r>
+        <w:rPr>
+          <w:sz w:val="44"/>
+          <w:szCs w:val="44"/>
+        </w:rPr>
+        <w:t>() in java with example.</w:t>
+      </w:r>
+    </w:p>
+    <w:p>
+      <w:pPr>
+        <w:rPr>
+          <w:sz w:val="44"/>
+          <w:szCs w:val="44"/>
+        </w:rPr>
+      </w:pPr>
+    </w:p>
+    <w:p>
+      <w:pPr>
+        <w:rPr>
+          <w:sz w:val="44"/>
+          <w:szCs w:val="44"/>
+        </w:rPr>
+      </w:pPr>
+      <w:r>
+        <w:rPr>
+          <w:sz w:val="44"/>
+          <w:szCs w:val="44"/>
+        </w:rPr>
+        <w:lastRenderedPageBreak/>
+        <w:t xml:space="preserve">85) why to </w:t>
+      </w:r>
+      <w:proofErr w:type="gramStart"/>
+      <w:r>
+        <w:rPr>
+          <w:sz w:val="44"/>
+          <w:szCs w:val="44"/>
+        </w:rPr>
+        <w:t>override .equals</w:t>
+      </w:r>
+      <w:proofErr w:type="gramEnd"/>
+      <w:r>
+        <w:rPr>
+          <w:sz w:val="44"/>
+          <w:szCs w:val="44"/>
+        </w:rPr>
+        <w:t xml:space="preserve">() </w:t>
+      </w:r>
+      <w:proofErr w:type="gramStart"/>
+      <w:r>
+        <w:rPr>
+          <w:sz w:val="44"/>
+          <w:szCs w:val="44"/>
+        </w:rPr>
+        <w:t>and .</w:t>
+      </w:r>
+      <w:proofErr w:type="spellStart"/>
+      <w:r>
+        <w:rPr>
+          <w:sz w:val="44"/>
+          <w:szCs w:val="44"/>
+        </w:rPr>
+        <w:t>hashCode</w:t>
+      </w:r>
+      <w:proofErr w:type="spellEnd"/>
+      <w:proofErr w:type="gramEnd"/>
+      <w:r>
+        <w:rPr>
+          <w:sz w:val="44"/>
+          <w:szCs w:val="44"/>
+        </w:rPr>
+        <w:t xml:space="preserve">() together in </w:t>
+      </w:r>
+      <w:proofErr w:type="gramStart"/>
+      <w:r>
+        <w:rPr>
+          <w:sz w:val="44"/>
+          <w:szCs w:val="44"/>
+        </w:rPr>
+        <w:t>java ?</w:t>
+      </w:r>
+      <w:proofErr w:type="gramEnd"/>
+    </w:p>
+    <w:p>
+      <w:pPr>
+        <w:rPr>
+          <w:sz w:val="44"/>
+          <w:szCs w:val="44"/>
+        </w:rPr>
+      </w:pPr>
+      <w:r>
+        <w:rPr>
+          <w:sz w:val="44"/>
+          <w:szCs w:val="44"/>
+        </w:rPr>
+        <w:t xml:space="preserve">86)what are the best practices followed when overriding </w:t>
+      </w:r>
+      <w:proofErr w:type="gramStart"/>
+      <w:r>
+        <w:rPr>
+          <w:sz w:val="44"/>
+          <w:szCs w:val="44"/>
+        </w:rPr>
+        <w:t>the .equals</w:t>
+      </w:r>
+      <w:proofErr w:type="gramEnd"/>
+      <w:r>
+        <w:rPr>
+          <w:sz w:val="44"/>
+          <w:szCs w:val="44"/>
+        </w:rPr>
+        <w:t xml:space="preserve">() </w:t>
+      </w:r>
+      <w:proofErr w:type="gramStart"/>
+      <w:r>
+        <w:rPr>
+          <w:sz w:val="44"/>
+          <w:szCs w:val="44"/>
+        </w:rPr>
+        <w:t>and .</w:t>
+      </w:r>
+      <w:proofErr w:type="spellStart"/>
+      <w:r>
+        <w:rPr>
+          <w:sz w:val="44"/>
+          <w:szCs w:val="44"/>
+        </w:rPr>
+        <w:t>hashCode</w:t>
+      </w:r>
+      <w:proofErr w:type="spellEnd"/>
+      <w:proofErr w:type="gramEnd"/>
+      <w:r>
+        <w:rPr>
+          <w:sz w:val="44"/>
+          <w:szCs w:val="44"/>
+        </w:rPr>
+        <w:t>() in Java?</w:t>
+      </w:r>
+    </w:p>
+    <w:p>
+      <w:pPr>
+        <w:rPr>
+          <w:sz w:val="44"/>
+          <w:szCs w:val="44"/>
+        </w:rPr>
+      </w:pPr>
+    </w:p>
+    <w:p>
+      <w:pPr>
+        <w:rPr>
           <w:sz w:val="44"/>
           <w:szCs w:val="44"/>
         </w:rPr>

</xml_diff>

<commit_message>
Iterators and barach kahi !
</commit_message>
<xml_diff>
--- a/Core_JAVA_Interview.docx
+++ b/Core_JAVA_Interview.docx
@@ -37,8 +37,52 @@
           <w:sz w:val="44"/>
           <w:szCs w:val="44"/>
         </w:rPr>
-        <w:t>1)what is jvm,jdk, jre ?</w:t>
-      </w:r>
+        <w:t xml:space="preserve">1)what is </w:t>
+      </w:r>
+      <w:proofErr w:type="spellStart"/>
+      <w:proofErr w:type="gramStart"/>
+      <w:r>
+        <w:rPr>
+          <w:b/>
+          <w:bCs/>
+          <w:sz w:val="44"/>
+          <w:szCs w:val="44"/>
+        </w:rPr>
+        <w:t>jvm,jdk</w:t>
+      </w:r>
+      <w:proofErr w:type="spellEnd"/>
+      <w:proofErr w:type="gramEnd"/>
+      <w:r>
+        <w:rPr>
+          <w:b/>
+          <w:bCs/>
+          <w:sz w:val="44"/>
+          <w:szCs w:val="44"/>
+        </w:rPr>
+        <w:t xml:space="preserve">, </w:t>
+      </w:r>
+      <w:proofErr w:type="spellStart"/>
+      <w:proofErr w:type="gramStart"/>
+      <w:r>
+        <w:rPr>
+          <w:b/>
+          <w:bCs/>
+          <w:sz w:val="44"/>
+          <w:szCs w:val="44"/>
+        </w:rPr>
+        <w:t>jre</w:t>
+      </w:r>
+      <w:proofErr w:type="spellEnd"/>
+      <w:r>
+        <w:rPr>
+          <w:b/>
+          <w:bCs/>
+          <w:sz w:val="44"/>
+          <w:szCs w:val="44"/>
+        </w:rPr>
+        <w:t xml:space="preserve"> ?</w:t>
+      </w:r>
+      <w:proofErr w:type="gramEnd"/>
     </w:p>
     <w:p>
       <w:pPr>
@@ -66,8 +110,38 @@
           <w:szCs w:val="44"/>
         </w:rPr>
         <w:br/>
-        <w:t>3)is java interpreted or compiled language ?</w:t>
-      </w:r>
+      </w:r>
+      <w:proofErr w:type="gramStart"/>
+      <w:r>
+        <w:rPr>
+          <w:b/>
+          <w:bCs/>
+          <w:sz w:val="44"/>
+          <w:szCs w:val="44"/>
+        </w:rPr>
+        <w:t>3)is</w:t>
+      </w:r>
+      <w:proofErr w:type="gramEnd"/>
+      <w:r>
+        <w:rPr>
+          <w:b/>
+          <w:bCs/>
+          <w:sz w:val="44"/>
+          <w:szCs w:val="44"/>
+        </w:rPr>
+        <w:t xml:space="preserve"> java interpreted or compiled </w:t>
+      </w:r>
+      <w:proofErr w:type="gramStart"/>
+      <w:r>
+        <w:rPr>
+          <w:b/>
+          <w:bCs/>
+          <w:sz w:val="44"/>
+          <w:szCs w:val="44"/>
+        </w:rPr>
+        <w:t>language ?</w:t>
+      </w:r>
+      <w:proofErr w:type="gramEnd"/>
     </w:p>
     <w:p>
       <w:pPr>
@@ -104,7 +178,27 @@
           <w:sz w:val="44"/>
           <w:szCs w:val="44"/>
         </w:rPr>
-        <w:t>5) Primitive vs. Non-Primitive.</w:t>
+        <w:t xml:space="preserve">5) Primitive vs. </w:t>
+      </w:r>
+      <w:proofErr w:type="gramStart"/>
+      <w:r>
+        <w:rPr>
+          <w:b/>
+          <w:bCs/>
+          <w:sz w:val="44"/>
+          <w:szCs w:val="44"/>
+        </w:rPr>
+        <w:t>Non-Primitive</w:t>
+      </w:r>
+      <w:proofErr w:type="gramEnd"/>
+      <w:r>
+        <w:rPr>
+          <w:b/>
+          <w:bCs/>
+          <w:sz w:val="44"/>
+          <w:szCs w:val="44"/>
+        </w:rPr>
+        <w:t>.</w:t>
       </w:r>
     </w:p>
     <w:p>
@@ -161,8 +255,19 @@
           <w:sz w:val="44"/>
           <w:szCs w:val="44"/>
         </w:rPr>
-        <w:t>8)what is narrowing and what is widening ?</w:t>
-      </w:r>
+        <w:t xml:space="preserve">8)what is narrowing and what is </w:t>
+      </w:r>
+      <w:proofErr w:type="gramStart"/>
+      <w:r>
+        <w:rPr>
+          <w:b/>
+          <w:bCs/>
+          <w:sz w:val="44"/>
+          <w:szCs w:val="44"/>
+        </w:rPr>
+        <w:t>widening ?</w:t>
+      </w:r>
+      <w:proofErr w:type="gramEnd"/>
     </w:p>
     <w:p>
       <w:pPr>
@@ -199,8 +304,19 @@
           <w:sz w:val="44"/>
           <w:szCs w:val="44"/>
         </w:rPr>
-        <w:t>10) different types of ARRAYS in java ?</w:t>
-      </w:r>
+        <w:t xml:space="preserve">10) different types of ARRAYS in </w:t>
+      </w:r>
+      <w:proofErr w:type="gramStart"/>
+      <w:r>
+        <w:rPr>
+          <w:b/>
+          <w:bCs/>
+          <w:sz w:val="44"/>
+          <w:szCs w:val="44"/>
+        </w:rPr>
+        <w:t>java ?</w:t>
+      </w:r>
+      <w:proofErr w:type="gramEnd"/>
     </w:p>
     <w:p>
       <w:pPr>
@@ -228,46 +344,87 @@
           <w:szCs w:val="44"/>
         </w:rPr>
         <w:br/>
-        <w:t>12)W.A.P. to swap two numbers without the third variable.</w:t>
-      </w:r>
-    </w:p>
-    <w:p>
-      <w:pPr>
-        <w:rPr>
-          <w:b/>
-          <w:bCs/>
-          <w:sz w:val="44"/>
-          <w:szCs w:val="44"/>
-        </w:rPr>
-      </w:pPr>
-      <w:r>
-        <w:rPr>
-          <w:b/>
-          <w:bCs/>
-          <w:sz w:val="44"/>
-          <w:szCs w:val="44"/>
-        </w:rPr>
-        <w:t>13) What is String in JAVA ?</w:t>
-      </w:r>
-    </w:p>
-    <w:p>
-      <w:pPr>
-        <w:rPr>
-          <w:b/>
-          <w:bCs/>
-          <w:sz w:val="44"/>
-          <w:szCs w:val="44"/>
-        </w:rPr>
-      </w:pPr>
-      <w:r>
-        <w:rPr>
-          <w:b/>
-          <w:bCs/>
-          <w:sz w:val="44"/>
-          <w:szCs w:val="44"/>
-        </w:rPr>
-        <w:t>14) What is String constant pool in JAVA ?</w:t>
-      </w:r>
+      </w:r>
+      <w:proofErr w:type="gramStart"/>
+      <w:r>
+        <w:rPr>
+          <w:b/>
+          <w:bCs/>
+          <w:sz w:val="44"/>
+          <w:szCs w:val="44"/>
+        </w:rPr>
+        <w:t>12)W.A.P.</w:t>
+      </w:r>
+      <w:proofErr w:type="gramEnd"/>
+      <w:r>
+        <w:rPr>
+          <w:b/>
+          <w:bCs/>
+          <w:sz w:val="44"/>
+          <w:szCs w:val="44"/>
+        </w:rPr>
+        <w:t xml:space="preserve"> to swap two numbers without the third variable.</w:t>
+      </w:r>
+    </w:p>
+    <w:p>
+      <w:pPr>
+        <w:rPr>
+          <w:b/>
+          <w:bCs/>
+          <w:sz w:val="44"/>
+          <w:szCs w:val="44"/>
+        </w:rPr>
+      </w:pPr>
+      <w:r>
+        <w:rPr>
+          <w:b/>
+          <w:bCs/>
+          <w:sz w:val="44"/>
+          <w:szCs w:val="44"/>
+        </w:rPr>
+        <w:t xml:space="preserve">13) What is String in </w:t>
+      </w:r>
+      <w:proofErr w:type="gramStart"/>
+      <w:r>
+        <w:rPr>
+          <w:b/>
+          <w:bCs/>
+          <w:sz w:val="44"/>
+          <w:szCs w:val="44"/>
+        </w:rPr>
+        <w:t>JAVA ?</w:t>
+      </w:r>
+      <w:proofErr w:type="gramEnd"/>
+    </w:p>
+    <w:p>
+      <w:pPr>
+        <w:rPr>
+          <w:b/>
+          <w:bCs/>
+          <w:sz w:val="44"/>
+          <w:szCs w:val="44"/>
+        </w:rPr>
+      </w:pPr>
+      <w:r>
+        <w:rPr>
+          <w:b/>
+          <w:bCs/>
+          <w:sz w:val="44"/>
+          <w:szCs w:val="44"/>
+        </w:rPr>
+        <w:t xml:space="preserve">14) What is String constant pool in </w:t>
+      </w:r>
+      <w:proofErr w:type="gramStart"/>
+      <w:r>
+        <w:rPr>
+          <w:b/>
+          <w:bCs/>
+          <w:sz w:val="44"/>
+          <w:szCs w:val="44"/>
+        </w:rPr>
+        <w:t>JAVA ?</w:t>
+      </w:r>
+      <w:proofErr w:type="gramEnd"/>
     </w:p>
     <w:p>
       <w:pPr>
@@ -286,7 +443,58 @@
           <w:szCs w:val="44"/>
         </w:rPr>
         <w:lastRenderedPageBreak/>
-        <w:t>15) String.vs. StringBuffer . vs. StringBuilder in JAVA.</w:t>
+        <w:t xml:space="preserve">15) </w:t>
+      </w:r>
+      <w:proofErr w:type="spellStart"/>
+      <w:r>
+        <w:rPr>
+          <w:b/>
+          <w:bCs/>
+          <w:sz w:val="44"/>
+          <w:szCs w:val="44"/>
+        </w:rPr>
+        <w:t>String.vs</w:t>
+      </w:r>
+      <w:proofErr w:type="spellEnd"/>
+      <w:r>
+        <w:rPr>
+          <w:b/>
+          <w:bCs/>
+          <w:sz w:val="44"/>
+          <w:szCs w:val="44"/>
+        </w:rPr>
+        <w:t xml:space="preserve">. </w:t>
+      </w:r>
+      <w:proofErr w:type="spellStart"/>
+      <w:proofErr w:type="gramStart"/>
+      <w:r>
+        <w:rPr>
+          <w:b/>
+          <w:bCs/>
+          <w:sz w:val="44"/>
+          <w:szCs w:val="44"/>
+        </w:rPr>
+        <w:t>StringBuffer</w:t>
+      </w:r>
+      <w:proofErr w:type="spellEnd"/>
+      <w:r>
+        <w:rPr>
+          <w:b/>
+          <w:bCs/>
+          <w:sz w:val="44"/>
+          <w:szCs w:val="44"/>
+        </w:rPr>
+        <w:t xml:space="preserve"> .</w:t>
+      </w:r>
+      <w:proofErr w:type="gramEnd"/>
+      <w:r>
+        <w:rPr>
+          <w:b/>
+          <w:bCs/>
+          <w:sz w:val="44"/>
+          <w:szCs w:val="44"/>
+        </w:rPr>
+        <w:t xml:space="preserve"> vs. StringBuilder in JAVA.</w:t>
       </w:r>
     </w:p>
     <w:p>
@@ -534,7 +742,27 @@
           <w:sz w:val="44"/>
           <w:szCs w:val="44"/>
         </w:rPr>
-        <w:t>28)explain difference between this call and this();</w:t>
+        <w:t xml:space="preserve">28)explain difference between this call and </w:t>
+      </w:r>
+      <w:proofErr w:type="gramStart"/>
+      <w:r>
+        <w:rPr>
+          <w:b/>
+          <w:bCs/>
+          <w:sz w:val="44"/>
+          <w:szCs w:val="44"/>
+        </w:rPr>
+        <w:t>this(</w:t>
+      </w:r>
+      <w:proofErr w:type="gramEnd"/>
+      <w:r>
+        <w:rPr>
+          <w:b/>
+          <w:bCs/>
+          <w:sz w:val="44"/>
+          <w:szCs w:val="44"/>
+        </w:rPr>
+        <w:t>);</w:t>
       </w:r>
     </w:p>
     <w:p>
@@ -591,7 +819,27 @@
           <w:sz w:val="44"/>
           <w:szCs w:val="44"/>
         </w:rPr>
-        <w:t>31)explain the super call in the context of constructor , method and variable.</w:t>
+        <w:t xml:space="preserve">31)explain the super call in the context of </w:t>
+      </w:r>
+      <w:proofErr w:type="gramStart"/>
+      <w:r>
+        <w:rPr>
+          <w:b/>
+          <w:bCs/>
+          <w:sz w:val="44"/>
+          <w:szCs w:val="44"/>
+        </w:rPr>
+        <w:t>constructor ,</w:t>
+      </w:r>
+      <w:proofErr w:type="gramEnd"/>
+      <w:r>
+        <w:rPr>
+          <w:b/>
+          <w:bCs/>
+          <w:sz w:val="44"/>
+          <w:szCs w:val="44"/>
+        </w:rPr>
+        <w:t xml:space="preserve"> method and variable.</w:t>
       </w:r>
     </w:p>
     <w:p>
@@ -687,7 +935,27 @@
           <w:szCs w:val="44"/>
         </w:rPr>
         <w:lastRenderedPageBreak/>
-        <w:t>36)W.A.P to demonstrate over-riding vs. runtime polymorphism.</w:t>
+        <w:t>36)W.</w:t>
+      </w:r>
+      <w:proofErr w:type="gramStart"/>
+      <w:r>
+        <w:rPr>
+          <w:b/>
+          <w:bCs/>
+          <w:sz w:val="44"/>
+          <w:szCs w:val="44"/>
+        </w:rPr>
+        <w:t>A.P</w:t>
+      </w:r>
+      <w:proofErr w:type="gramEnd"/>
+      <w:r>
+        <w:rPr>
+          <w:b/>
+          <w:bCs/>
+          <w:sz w:val="44"/>
+          <w:szCs w:val="44"/>
+        </w:rPr>
+        <w:t xml:space="preserve"> to demonstrate over-riding vs. runtime polymorphism.</w:t>
       </w:r>
     </w:p>
     <w:p>
@@ -718,14 +986,25 @@
           <w:szCs w:val="44"/>
         </w:rPr>
       </w:pPr>
-      <w:r>
-        <w:rPr>
-          <w:b/>
-          <w:bCs/>
-          <w:sz w:val="44"/>
-          <w:szCs w:val="44"/>
-        </w:rPr>
-        <w:t>38 ) types and order of access modifiers from less to more secure. Prove it with the codes.</w:t>
+      <w:proofErr w:type="gramStart"/>
+      <w:r>
+        <w:rPr>
+          <w:b/>
+          <w:bCs/>
+          <w:sz w:val="44"/>
+          <w:szCs w:val="44"/>
+        </w:rPr>
+        <w:t>38 )</w:t>
+      </w:r>
+      <w:proofErr w:type="gramEnd"/>
+      <w:r>
+        <w:rPr>
+          <w:b/>
+          <w:bCs/>
+          <w:sz w:val="44"/>
+          <w:szCs w:val="44"/>
+        </w:rPr>
+        <w:t xml:space="preserve"> types and order of access modifiers from less to more secure. Prove it with the codes.</w:t>
       </w:r>
     </w:p>
     <w:p>
@@ -782,27 +1061,58 @@
           <w:sz w:val="44"/>
           <w:szCs w:val="44"/>
         </w:rPr>
-        <w:t>41)what is the relation between access modifiers and Overriding.</w:t>
-      </w:r>
-    </w:p>
-    <w:p>
-      <w:pPr>
-        <w:rPr>
-          <w:b/>
-          <w:bCs/>
-          <w:sz w:val="44"/>
-          <w:szCs w:val="44"/>
-        </w:rPr>
-      </w:pPr>
-      <w:r>
-        <w:rPr>
-          <w:b/>
-          <w:bCs/>
-          <w:sz w:val="44"/>
-          <w:szCs w:val="44"/>
-        </w:rPr>
-        <w:t>42)what is abstraction ?</w:t>
-      </w:r>
+        <w:t xml:space="preserve">41)what is the relation between access modifiers and </w:t>
+      </w:r>
+      <w:proofErr w:type="gramStart"/>
+      <w:r>
+        <w:rPr>
+          <w:b/>
+          <w:bCs/>
+          <w:sz w:val="44"/>
+          <w:szCs w:val="44"/>
+        </w:rPr>
+        <w:t>Overriding</w:t>
+      </w:r>
+      <w:proofErr w:type="gramEnd"/>
+      <w:r>
+        <w:rPr>
+          <w:b/>
+          <w:bCs/>
+          <w:sz w:val="44"/>
+          <w:szCs w:val="44"/>
+        </w:rPr>
+        <w:t>.</w:t>
+      </w:r>
+    </w:p>
+    <w:p>
+      <w:pPr>
+        <w:rPr>
+          <w:b/>
+          <w:bCs/>
+          <w:sz w:val="44"/>
+          <w:szCs w:val="44"/>
+        </w:rPr>
+      </w:pPr>
+      <w:r>
+        <w:rPr>
+          <w:b/>
+          <w:bCs/>
+          <w:sz w:val="44"/>
+          <w:szCs w:val="44"/>
+        </w:rPr>
+        <w:t xml:space="preserve">42)what is </w:t>
+      </w:r>
+      <w:proofErr w:type="gramStart"/>
+      <w:r>
+        <w:rPr>
+          <w:b/>
+          <w:bCs/>
+          <w:sz w:val="44"/>
+          <w:szCs w:val="44"/>
+        </w:rPr>
+        <w:t>abstraction ?</w:t>
+      </w:r>
+      <w:proofErr w:type="gramEnd"/>
     </w:p>
     <w:p>
       <w:pPr>
@@ -953,7 +1263,27 @@
           <w:sz w:val="44"/>
           <w:szCs w:val="44"/>
         </w:rPr>
-        <w:t>49)default and static methods in java 8 i/f.</w:t>
+        <w:t xml:space="preserve">49)default and static methods in java 8 </w:t>
+      </w:r>
+      <w:proofErr w:type="spellStart"/>
+      <w:r>
+        <w:rPr>
+          <w:b/>
+          <w:bCs/>
+          <w:sz w:val="44"/>
+          <w:szCs w:val="44"/>
+        </w:rPr>
+        <w:t>i</w:t>
+      </w:r>
+      <w:proofErr w:type="spellEnd"/>
+      <w:r>
+        <w:rPr>
+          <w:b/>
+          <w:bCs/>
+          <w:sz w:val="44"/>
+          <w:szCs w:val="44"/>
+        </w:rPr>
+        <w:t>/f.</w:t>
       </w:r>
     </w:p>
     <w:p>
@@ -1010,26 +1340,77 @@
           <w:sz w:val="44"/>
           <w:szCs w:val="44"/>
         </w:rPr>
-        <w:t>52)What is functional i/f.</w:t>
-      </w:r>
-    </w:p>
-    <w:p>
-      <w:pPr>
-        <w:rPr>
-          <w:b/>
-          <w:bCs/>
-          <w:sz w:val="44"/>
-          <w:szCs w:val="44"/>
-        </w:rPr>
-      </w:pPr>
-      <w:r>
-        <w:rPr>
-          <w:b/>
-          <w:bCs/>
-          <w:sz w:val="44"/>
-          <w:szCs w:val="44"/>
-        </w:rPr>
-        <w:t>53) how do you invoke a method of  i/f with anonymous class.</w:t>
+        <w:t xml:space="preserve">52)What is functional </w:t>
+      </w:r>
+      <w:proofErr w:type="spellStart"/>
+      <w:r>
+        <w:rPr>
+          <w:b/>
+          <w:bCs/>
+          <w:sz w:val="44"/>
+          <w:szCs w:val="44"/>
+        </w:rPr>
+        <w:t>i</w:t>
+      </w:r>
+      <w:proofErr w:type="spellEnd"/>
+      <w:r>
+        <w:rPr>
+          <w:b/>
+          <w:bCs/>
+          <w:sz w:val="44"/>
+          <w:szCs w:val="44"/>
+        </w:rPr>
+        <w:t>/f.</w:t>
+      </w:r>
+    </w:p>
+    <w:p>
+      <w:pPr>
+        <w:rPr>
+          <w:b/>
+          <w:bCs/>
+          <w:sz w:val="44"/>
+          <w:szCs w:val="44"/>
+        </w:rPr>
+      </w:pPr>
+      <w:r>
+        <w:rPr>
+          <w:b/>
+          <w:bCs/>
+          <w:sz w:val="44"/>
+          <w:szCs w:val="44"/>
+        </w:rPr>
+        <w:t xml:space="preserve">53) how do you invoke a method </w:t>
+      </w:r>
+      <w:proofErr w:type="gramStart"/>
+      <w:r>
+        <w:rPr>
+          <w:b/>
+          <w:bCs/>
+          <w:sz w:val="44"/>
+          <w:szCs w:val="44"/>
+        </w:rPr>
+        <w:t xml:space="preserve">of  </w:t>
+      </w:r>
+      <w:proofErr w:type="spellStart"/>
+      <w:r>
+        <w:rPr>
+          <w:b/>
+          <w:bCs/>
+          <w:sz w:val="44"/>
+          <w:szCs w:val="44"/>
+        </w:rPr>
+        <w:t>i</w:t>
+      </w:r>
+      <w:proofErr w:type="spellEnd"/>
+      <w:proofErr w:type="gramEnd"/>
+      <w:r>
+        <w:rPr>
+          <w:b/>
+          <w:bCs/>
+          <w:sz w:val="44"/>
+          <w:szCs w:val="44"/>
+        </w:rPr>
+        <w:t>/f with anonymous class.</w:t>
       </w:r>
     </w:p>
     <w:p>
@@ -1095,7 +1476,69 @@
           <w:sz w:val="44"/>
           <w:szCs w:val="44"/>
         </w:rPr>
-        <w:t>56) ToString() and getClass()</w:t>
+        <w:t xml:space="preserve">56) </w:t>
+      </w:r>
+      <w:proofErr w:type="spellStart"/>
+      <w:proofErr w:type="gramStart"/>
+      <w:r>
+        <w:rPr>
+          <w:b/>
+          <w:bCs/>
+          <w:sz w:val="44"/>
+          <w:szCs w:val="44"/>
+        </w:rPr>
+        <w:t>ToString</w:t>
+      </w:r>
+      <w:proofErr w:type="spellEnd"/>
+      <w:r>
+        <w:rPr>
+          <w:b/>
+          <w:bCs/>
+          <w:sz w:val="44"/>
+          <w:szCs w:val="44"/>
+        </w:rPr>
+        <w:t>(</w:t>
+      </w:r>
+      <w:proofErr w:type="gramEnd"/>
+      <w:r>
+        <w:rPr>
+          <w:b/>
+          <w:bCs/>
+          <w:sz w:val="44"/>
+          <w:szCs w:val="44"/>
+        </w:rPr>
+        <w:t xml:space="preserve">) and </w:t>
+      </w:r>
+      <w:proofErr w:type="spellStart"/>
+      <w:proofErr w:type="gramStart"/>
+      <w:r>
+        <w:rPr>
+          <w:b/>
+          <w:bCs/>
+          <w:sz w:val="44"/>
+          <w:szCs w:val="44"/>
+        </w:rPr>
+        <w:t>getClass</w:t>
+      </w:r>
+      <w:proofErr w:type="spellEnd"/>
+      <w:r>
+        <w:rPr>
+          <w:b/>
+          <w:bCs/>
+          <w:sz w:val="44"/>
+          <w:szCs w:val="44"/>
+        </w:rPr>
+        <w:t>(</w:t>
+      </w:r>
+      <w:proofErr w:type="gramEnd"/>
+      <w:r>
+        <w:rPr>
+          <w:b/>
+          <w:bCs/>
+          <w:sz w:val="44"/>
+          <w:szCs w:val="44"/>
+        </w:rPr>
+        <w:t>)</w:t>
       </w:r>
     </w:p>
     <w:p>
@@ -1143,27 +1586,58 @@
           <w:sz w:val="44"/>
           <w:szCs w:val="44"/>
         </w:rPr>
-        <w:t>58)is it compulsory to write the catch block with try ? explain.</w:t>
-      </w:r>
-    </w:p>
-    <w:p>
-      <w:pPr>
-        <w:rPr>
-          <w:b/>
-          <w:bCs/>
-          <w:sz w:val="44"/>
-          <w:szCs w:val="44"/>
-        </w:rPr>
-      </w:pPr>
-      <w:r>
-        <w:rPr>
-          <w:b/>
-          <w:bCs/>
-          <w:sz w:val="44"/>
-          <w:szCs w:val="44"/>
-        </w:rPr>
-        <w:t>59)can we write consecutive try/ finally blocks ?</w:t>
-      </w:r>
+        <w:t xml:space="preserve">58)is it compulsory to write the catch block with </w:t>
+      </w:r>
+      <w:proofErr w:type="gramStart"/>
+      <w:r>
+        <w:rPr>
+          <w:b/>
+          <w:bCs/>
+          <w:sz w:val="44"/>
+          <w:szCs w:val="44"/>
+        </w:rPr>
+        <w:t>try ?</w:t>
+      </w:r>
+      <w:proofErr w:type="gramEnd"/>
+      <w:r>
+        <w:rPr>
+          <w:b/>
+          <w:bCs/>
+          <w:sz w:val="44"/>
+          <w:szCs w:val="44"/>
+        </w:rPr>
+        <w:t xml:space="preserve"> explain.</w:t>
+      </w:r>
+    </w:p>
+    <w:p>
+      <w:pPr>
+        <w:rPr>
+          <w:b/>
+          <w:bCs/>
+          <w:sz w:val="44"/>
+          <w:szCs w:val="44"/>
+        </w:rPr>
+      </w:pPr>
+      <w:r>
+        <w:rPr>
+          <w:b/>
+          <w:bCs/>
+          <w:sz w:val="44"/>
+          <w:szCs w:val="44"/>
+        </w:rPr>
+        <w:t xml:space="preserve">59)can we write consecutive try/ finally </w:t>
+      </w:r>
+      <w:proofErr w:type="gramStart"/>
+      <w:r>
+        <w:rPr>
+          <w:b/>
+          <w:bCs/>
+          <w:sz w:val="44"/>
+          <w:szCs w:val="44"/>
+        </w:rPr>
+        <w:t>blocks ?</w:t>
+      </w:r>
+      <w:proofErr w:type="gramEnd"/>
     </w:p>
     <w:p>
       <w:pPr>
@@ -1200,26 +1674,77 @@
           <w:sz w:val="44"/>
           <w:szCs w:val="44"/>
         </w:rPr>
-        <w:t>61)will finally always get executed ?</w:t>
-      </w:r>
-    </w:p>
-    <w:p>
-      <w:pPr>
-        <w:rPr>
-          <w:b/>
-          <w:bCs/>
-          <w:sz w:val="44"/>
-          <w:szCs w:val="44"/>
-        </w:rPr>
-      </w:pPr>
-      <w:r>
-        <w:rPr>
-          <w:b/>
-          <w:bCs/>
-          <w:sz w:val="44"/>
-          <w:szCs w:val="44"/>
-        </w:rPr>
-        <w:t>62)why it’s compulsory to handle checked(Compile) time exceptions at compile time? But optional to handle unchecked(Runtime) exceptions at compile time?</w:t>
+        <w:t xml:space="preserve">61)will finally always get </w:t>
+      </w:r>
+      <w:proofErr w:type="gramStart"/>
+      <w:r>
+        <w:rPr>
+          <w:b/>
+          <w:bCs/>
+          <w:sz w:val="44"/>
+          <w:szCs w:val="44"/>
+        </w:rPr>
+        <w:t>executed ?</w:t>
+      </w:r>
+      <w:proofErr w:type="gramEnd"/>
+    </w:p>
+    <w:p>
+      <w:pPr>
+        <w:rPr>
+          <w:b/>
+          <w:bCs/>
+          <w:sz w:val="44"/>
+          <w:szCs w:val="44"/>
+        </w:rPr>
+      </w:pPr>
+      <w:r>
+        <w:rPr>
+          <w:b/>
+          <w:bCs/>
+          <w:sz w:val="44"/>
+          <w:szCs w:val="44"/>
+        </w:rPr>
+        <w:t xml:space="preserve">62)why it’s compulsory to handle </w:t>
+      </w:r>
+      <w:proofErr w:type="gramStart"/>
+      <w:r>
+        <w:rPr>
+          <w:b/>
+          <w:bCs/>
+          <w:sz w:val="44"/>
+          <w:szCs w:val="44"/>
+        </w:rPr>
+        <w:t>checked(</w:t>
+      </w:r>
+      <w:proofErr w:type="gramEnd"/>
+      <w:r>
+        <w:rPr>
+          <w:b/>
+          <w:bCs/>
+          <w:sz w:val="44"/>
+          <w:szCs w:val="44"/>
+        </w:rPr>
+        <w:t xml:space="preserve">Compile) time exceptions at compile time? But optional to handle </w:t>
+      </w:r>
+      <w:proofErr w:type="gramStart"/>
+      <w:r>
+        <w:rPr>
+          <w:b/>
+          <w:bCs/>
+          <w:sz w:val="44"/>
+          <w:szCs w:val="44"/>
+        </w:rPr>
+        <w:t>unchecked(</w:t>
+      </w:r>
+      <w:proofErr w:type="gramEnd"/>
+      <w:r>
+        <w:rPr>
+          <w:b/>
+          <w:bCs/>
+          <w:sz w:val="44"/>
+          <w:szCs w:val="44"/>
+        </w:rPr>
+        <w:t>Runtime) exceptions at compile time?</w:t>
       </w:r>
     </w:p>
     <w:p>
@@ -1257,26 +1782,77 @@
           <w:sz w:val="44"/>
           <w:szCs w:val="44"/>
         </w:rPr>
-        <w:t>64)when to use the throw keyword ?</w:t>
-      </w:r>
-    </w:p>
-    <w:p>
-      <w:pPr>
-        <w:rPr>
-          <w:b/>
-          <w:bCs/>
-          <w:sz w:val="44"/>
-          <w:szCs w:val="44"/>
-        </w:rPr>
-      </w:pPr>
-      <w:r>
-        <w:rPr>
-          <w:b/>
-          <w:bCs/>
-          <w:sz w:val="44"/>
-          <w:szCs w:val="44"/>
-        </w:rPr>
-        <w:t>65)can you throw the multiple exceptions from the single try block a)with overlapping logic. b)separate logic.</w:t>
+        <w:t xml:space="preserve">64)when to use the throw </w:t>
+      </w:r>
+      <w:proofErr w:type="gramStart"/>
+      <w:r>
+        <w:rPr>
+          <w:b/>
+          <w:bCs/>
+          <w:sz w:val="44"/>
+          <w:szCs w:val="44"/>
+        </w:rPr>
+        <w:t>keyword ?</w:t>
+      </w:r>
+      <w:proofErr w:type="gramEnd"/>
+    </w:p>
+    <w:p>
+      <w:pPr>
+        <w:rPr>
+          <w:b/>
+          <w:bCs/>
+          <w:sz w:val="44"/>
+          <w:szCs w:val="44"/>
+        </w:rPr>
+      </w:pPr>
+      <w:r>
+        <w:rPr>
+          <w:b/>
+          <w:bCs/>
+          <w:sz w:val="44"/>
+          <w:szCs w:val="44"/>
+        </w:rPr>
+        <w:t xml:space="preserve">65)can you throw the multiple exceptions from the single try block </w:t>
+      </w:r>
+      <w:proofErr w:type="gramStart"/>
+      <w:r>
+        <w:rPr>
+          <w:b/>
+          <w:bCs/>
+          <w:sz w:val="44"/>
+          <w:szCs w:val="44"/>
+        </w:rPr>
+        <w:t>a)with</w:t>
+      </w:r>
+      <w:proofErr w:type="gramEnd"/>
+      <w:r>
+        <w:rPr>
+          <w:b/>
+          <w:bCs/>
+          <w:sz w:val="44"/>
+          <w:szCs w:val="44"/>
+        </w:rPr>
+        <w:t xml:space="preserve"> overlapping logic. </w:t>
+      </w:r>
+      <w:proofErr w:type="gramStart"/>
+      <w:r>
+        <w:rPr>
+          <w:b/>
+          <w:bCs/>
+          <w:sz w:val="44"/>
+          <w:szCs w:val="44"/>
+        </w:rPr>
+        <w:t>b)separate</w:t>
+      </w:r>
+      <w:proofErr w:type="gramEnd"/>
+      <w:r>
+        <w:rPr>
+          <w:b/>
+          <w:bCs/>
+          <w:sz w:val="44"/>
+          <w:szCs w:val="44"/>
+        </w:rPr>
+        <w:t xml:space="preserve"> logic.</w:t>
       </w:r>
     </w:p>
     <w:p>
@@ -1305,27 +1881,98 @@
           <w:sz w:val="44"/>
           <w:szCs w:val="44"/>
         </w:rPr>
-        <w:t xml:space="preserve">Can we throw an Exception  from constructor ? </w:t>
-      </w:r>
-    </w:p>
-    <w:p>
-      <w:pPr>
-        <w:rPr>
-          <w:b/>
-          <w:bCs/>
-          <w:sz w:val="44"/>
-          <w:szCs w:val="44"/>
-        </w:rPr>
-      </w:pPr>
-      <w:r>
-        <w:rPr>
-          <w:b/>
-          <w:bCs/>
-          <w:sz w:val="44"/>
-          <w:szCs w:val="44"/>
-        </w:rPr>
-        <w:t>67)what is static block ? and it’s use ?</w:t>
-      </w:r>
+        <w:t xml:space="preserve">Can we throw an </w:t>
+      </w:r>
+      <w:proofErr w:type="gramStart"/>
+      <w:r>
+        <w:rPr>
+          <w:b/>
+          <w:bCs/>
+          <w:sz w:val="44"/>
+          <w:szCs w:val="44"/>
+        </w:rPr>
+        <w:t>Exception  from</w:t>
+      </w:r>
+      <w:proofErr w:type="gramEnd"/>
+      <w:r>
+        <w:rPr>
+          <w:b/>
+          <w:bCs/>
+          <w:sz w:val="44"/>
+          <w:szCs w:val="44"/>
+        </w:rPr>
+        <w:t xml:space="preserve"> </w:t>
+      </w:r>
+      <w:proofErr w:type="gramStart"/>
+      <w:r>
+        <w:rPr>
+          <w:b/>
+          <w:bCs/>
+          <w:sz w:val="44"/>
+          <w:szCs w:val="44"/>
+        </w:rPr>
+        <w:t>constructor ?</w:t>
+      </w:r>
+      <w:proofErr w:type="gramEnd"/>
+      <w:r>
+        <w:rPr>
+          <w:b/>
+          <w:bCs/>
+          <w:sz w:val="44"/>
+          <w:szCs w:val="44"/>
+        </w:rPr>
+        <w:t xml:space="preserve"> </w:t>
+      </w:r>
+    </w:p>
+    <w:p>
+      <w:pPr>
+        <w:rPr>
+          <w:b/>
+          <w:bCs/>
+          <w:sz w:val="44"/>
+          <w:szCs w:val="44"/>
+        </w:rPr>
+      </w:pPr>
+      <w:r>
+        <w:rPr>
+          <w:b/>
+          <w:bCs/>
+          <w:sz w:val="44"/>
+          <w:szCs w:val="44"/>
+        </w:rPr>
+        <w:t xml:space="preserve">67)what is static </w:t>
+      </w:r>
+      <w:proofErr w:type="gramStart"/>
+      <w:r>
+        <w:rPr>
+          <w:b/>
+          <w:bCs/>
+          <w:sz w:val="44"/>
+          <w:szCs w:val="44"/>
+        </w:rPr>
+        <w:t>block ?</w:t>
+      </w:r>
+      <w:proofErr w:type="gramEnd"/>
+      <w:r>
+        <w:rPr>
+          <w:b/>
+          <w:bCs/>
+          <w:sz w:val="44"/>
+          <w:szCs w:val="44"/>
+        </w:rPr>
+        <w:t xml:space="preserve"> and it’s </w:t>
+      </w:r>
+      <w:proofErr w:type="gramStart"/>
+      <w:r>
+        <w:rPr>
+          <w:b/>
+          <w:bCs/>
+          <w:sz w:val="44"/>
+          <w:szCs w:val="44"/>
+        </w:rPr>
+        <w:t>use ?</w:t>
+      </w:r>
+      <w:proofErr w:type="gramEnd"/>
     </w:p>
     <w:p>
       <w:pPr>
@@ -1371,64 +2018,219 @@
           <w:sz w:val="44"/>
           <w:szCs w:val="44"/>
         </w:rPr>
-        <w:t>69)What is .hashCode() and it’s significance?</w:t>
-      </w:r>
-    </w:p>
-    <w:p>
-      <w:pPr>
-        <w:rPr>
-          <w:b/>
-          <w:bCs/>
-          <w:sz w:val="44"/>
-          <w:szCs w:val="44"/>
-        </w:rPr>
-      </w:pPr>
-      <w:r>
-        <w:rPr>
-          <w:b/>
-          <w:bCs/>
-          <w:sz w:val="44"/>
-          <w:szCs w:val="44"/>
-        </w:rPr>
-        <w:t>70)what is .intern() method and String interning in java ?</w:t>
-      </w:r>
-    </w:p>
-    <w:p>
-      <w:pPr>
-        <w:rPr>
-          <w:b/>
-          <w:bCs/>
-          <w:sz w:val="44"/>
-          <w:szCs w:val="44"/>
-        </w:rPr>
-      </w:pPr>
-      <w:r>
-        <w:rPr>
-          <w:b/>
-          <w:bCs/>
-          <w:sz w:val="44"/>
-          <w:szCs w:val="44"/>
-        </w:rPr>
-        <w:t>71)how can we override the .hashCode()?</w:t>
-      </w:r>
-    </w:p>
-    <w:p>
-      <w:pPr>
-        <w:rPr>
-          <w:b/>
-          <w:bCs/>
-          <w:sz w:val="44"/>
-          <w:szCs w:val="44"/>
-        </w:rPr>
-      </w:pPr>
-      <w:r>
-        <w:rPr>
-          <w:b/>
-          <w:bCs/>
-          <w:sz w:val="44"/>
-          <w:szCs w:val="44"/>
-        </w:rPr>
-        <w:t>72) String class and  .hashCode() method.</w:t>
+        <w:t xml:space="preserve">69)What </w:t>
+      </w:r>
+      <w:proofErr w:type="gramStart"/>
+      <w:r>
+        <w:rPr>
+          <w:b/>
+          <w:bCs/>
+          <w:sz w:val="44"/>
+          <w:szCs w:val="44"/>
+        </w:rPr>
+        <w:t>is .</w:t>
+      </w:r>
+      <w:proofErr w:type="spellStart"/>
+      <w:r>
+        <w:rPr>
+          <w:b/>
+          <w:bCs/>
+          <w:sz w:val="44"/>
+          <w:szCs w:val="44"/>
+        </w:rPr>
+        <w:t>hashCode</w:t>
+      </w:r>
+      <w:proofErr w:type="spellEnd"/>
+      <w:proofErr w:type="gramEnd"/>
+      <w:r>
+        <w:rPr>
+          <w:b/>
+          <w:bCs/>
+          <w:sz w:val="44"/>
+          <w:szCs w:val="44"/>
+        </w:rPr>
+        <w:t xml:space="preserve">() and </w:t>
+      </w:r>
+      <w:proofErr w:type="spellStart"/>
+      <w:proofErr w:type="gramStart"/>
+      <w:r>
+        <w:rPr>
+          <w:b/>
+          <w:bCs/>
+          <w:sz w:val="44"/>
+          <w:szCs w:val="44"/>
+        </w:rPr>
+        <w:t>it’s</w:t>
+      </w:r>
+      <w:proofErr w:type="spellEnd"/>
+      <w:proofErr w:type="gramEnd"/>
+      <w:r>
+        <w:rPr>
+          <w:b/>
+          <w:bCs/>
+          <w:sz w:val="44"/>
+          <w:szCs w:val="44"/>
+        </w:rPr>
+        <w:t xml:space="preserve"> significance?</w:t>
+      </w:r>
+    </w:p>
+    <w:p>
+      <w:pPr>
+        <w:rPr>
+          <w:b/>
+          <w:bCs/>
+          <w:sz w:val="44"/>
+          <w:szCs w:val="44"/>
+        </w:rPr>
+      </w:pPr>
+      <w:r>
+        <w:rPr>
+          <w:b/>
+          <w:bCs/>
+          <w:sz w:val="44"/>
+          <w:szCs w:val="44"/>
+        </w:rPr>
+        <w:t xml:space="preserve">70)what </w:t>
+      </w:r>
+      <w:proofErr w:type="gramStart"/>
+      <w:r>
+        <w:rPr>
+          <w:b/>
+          <w:bCs/>
+          <w:sz w:val="44"/>
+          <w:szCs w:val="44"/>
+        </w:rPr>
+        <w:t>is .intern</w:t>
+      </w:r>
+      <w:proofErr w:type="gramEnd"/>
+      <w:r>
+        <w:rPr>
+          <w:b/>
+          <w:bCs/>
+          <w:sz w:val="44"/>
+          <w:szCs w:val="44"/>
+        </w:rPr>
+        <w:t xml:space="preserve">() method and String interning in </w:t>
+      </w:r>
+      <w:proofErr w:type="gramStart"/>
+      <w:r>
+        <w:rPr>
+          <w:b/>
+          <w:bCs/>
+          <w:sz w:val="44"/>
+          <w:szCs w:val="44"/>
+        </w:rPr>
+        <w:t>java ?</w:t>
+      </w:r>
+      <w:proofErr w:type="gramEnd"/>
+    </w:p>
+    <w:p>
+      <w:pPr>
+        <w:rPr>
+          <w:b/>
+          <w:bCs/>
+          <w:sz w:val="44"/>
+          <w:szCs w:val="44"/>
+        </w:rPr>
+      </w:pPr>
+      <w:r>
+        <w:rPr>
+          <w:b/>
+          <w:bCs/>
+          <w:sz w:val="44"/>
+          <w:szCs w:val="44"/>
+        </w:rPr>
+        <w:t xml:space="preserve">71)how can we override </w:t>
+      </w:r>
+      <w:proofErr w:type="gramStart"/>
+      <w:r>
+        <w:rPr>
+          <w:b/>
+          <w:bCs/>
+          <w:sz w:val="44"/>
+          <w:szCs w:val="44"/>
+        </w:rPr>
+        <w:t>the .</w:t>
+      </w:r>
+      <w:proofErr w:type="spellStart"/>
+      <w:r>
+        <w:rPr>
+          <w:b/>
+          <w:bCs/>
+          <w:sz w:val="44"/>
+          <w:szCs w:val="44"/>
+        </w:rPr>
+        <w:t>hashCode</w:t>
+      </w:r>
+      <w:proofErr w:type="spellEnd"/>
+      <w:proofErr w:type="gramEnd"/>
+      <w:r>
+        <w:rPr>
+          <w:b/>
+          <w:bCs/>
+          <w:sz w:val="44"/>
+          <w:szCs w:val="44"/>
+        </w:rPr>
+        <w:t>()?</w:t>
+      </w:r>
+    </w:p>
+    <w:p>
+      <w:pPr>
+        <w:rPr>
+          <w:b/>
+          <w:bCs/>
+          <w:sz w:val="44"/>
+          <w:szCs w:val="44"/>
+        </w:rPr>
+      </w:pPr>
+      <w:r>
+        <w:rPr>
+          <w:b/>
+          <w:bCs/>
+          <w:sz w:val="44"/>
+          <w:szCs w:val="44"/>
+        </w:rPr>
+        <w:t xml:space="preserve">72) String class </w:t>
+      </w:r>
+      <w:proofErr w:type="gramStart"/>
+      <w:r>
+        <w:rPr>
+          <w:b/>
+          <w:bCs/>
+          <w:sz w:val="44"/>
+          <w:szCs w:val="44"/>
+        </w:rPr>
+        <w:t>and  .</w:t>
+      </w:r>
+      <w:proofErr w:type="spellStart"/>
+      <w:r>
+        <w:rPr>
+          <w:b/>
+          <w:bCs/>
+          <w:sz w:val="44"/>
+          <w:szCs w:val="44"/>
+        </w:rPr>
+        <w:t>hashCode</w:t>
+      </w:r>
+      <w:proofErr w:type="spellEnd"/>
+      <w:r>
+        <w:rPr>
+          <w:b/>
+          <w:bCs/>
+          <w:sz w:val="44"/>
+          <w:szCs w:val="44"/>
+        </w:rPr>
+        <w:t>(</w:t>
+      </w:r>
+      <w:proofErr w:type="gramEnd"/>
+      <w:r>
+        <w:rPr>
+          <w:b/>
+          <w:bCs/>
+          <w:sz w:val="44"/>
+          <w:szCs w:val="44"/>
+        </w:rPr>
+        <w:t>) method.</w:t>
       </w:r>
     </w:p>
     <w:p>
@@ -1485,7 +2287,27 @@
           <w:sz w:val="44"/>
           <w:szCs w:val="44"/>
         </w:rPr>
-        <w:t>75) instanceof operator.</w:t>
+        <w:t xml:space="preserve">75) </w:t>
+      </w:r>
+      <w:proofErr w:type="spellStart"/>
+      <w:r>
+        <w:rPr>
+          <w:b/>
+          <w:bCs/>
+          <w:sz w:val="44"/>
+          <w:szCs w:val="44"/>
+        </w:rPr>
+        <w:t>instanceof</w:t>
+      </w:r>
+      <w:proofErr w:type="spellEnd"/>
+      <w:r>
+        <w:rPr>
+          <w:b/>
+          <w:bCs/>
+          <w:sz w:val="44"/>
+          <w:szCs w:val="44"/>
+        </w:rPr>
+        <w:t xml:space="preserve"> operator.</w:t>
       </w:r>
     </w:p>
     <w:p>
@@ -1523,8 +2345,39 @@
           <w:sz w:val="44"/>
           <w:szCs w:val="44"/>
         </w:rPr>
-        <w:t>77) what are the cases when finally does not execute ?</w:t>
-      </w:r>
+        <w:t xml:space="preserve">77) what are the cases when </w:t>
+      </w:r>
+      <w:proofErr w:type="gramStart"/>
+      <w:r>
+        <w:rPr>
+          <w:b/>
+          <w:bCs/>
+          <w:sz w:val="44"/>
+          <w:szCs w:val="44"/>
+        </w:rPr>
+        <w:t>finally</w:t>
+      </w:r>
+      <w:proofErr w:type="gramEnd"/>
+      <w:r>
+        <w:rPr>
+          <w:b/>
+          <w:bCs/>
+          <w:sz w:val="44"/>
+          <w:szCs w:val="44"/>
+        </w:rPr>
+        <w:t xml:space="preserve"> does not </w:t>
+      </w:r>
+      <w:proofErr w:type="gramStart"/>
+      <w:r>
+        <w:rPr>
+          <w:b/>
+          <w:bCs/>
+          <w:sz w:val="44"/>
+          <w:szCs w:val="44"/>
+        </w:rPr>
+        <w:t>execute ?</w:t>
+      </w:r>
+      <w:proofErr w:type="gramEnd"/>
     </w:p>
     <w:p>
       <w:pPr>
@@ -1581,84 +2434,292 @@
           <w:sz w:val="44"/>
           <w:szCs w:val="44"/>
         </w:rPr>
-        <w:t>80) what is .hashCode() and it’s significance ?</w:t>
-      </w:r>
-    </w:p>
-    <w:p>
-      <w:pPr>
-        <w:rPr>
-          <w:b/>
-          <w:bCs/>
-          <w:sz w:val="44"/>
-          <w:szCs w:val="44"/>
-        </w:rPr>
-      </w:pPr>
-      <w:r>
-        <w:rPr>
-          <w:b/>
-          <w:bCs/>
-          <w:sz w:val="44"/>
-          <w:szCs w:val="44"/>
-        </w:rPr>
-        <w:t>81) default behaviour of the .equals() in java ?</w:t>
-      </w:r>
-    </w:p>
-    <w:p>
-      <w:pPr>
-        <w:rPr>
-          <w:b/>
-          <w:bCs/>
-          <w:sz w:val="44"/>
-          <w:szCs w:val="44"/>
-        </w:rPr>
-      </w:pPr>
-      <w:r>
-        <w:rPr>
-          <w:b/>
-          <w:bCs/>
-          <w:sz w:val="44"/>
-          <w:szCs w:val="44"/>
-        </w:rPr>
-        <w:t>82) why does .equals() behaves differently in String class?</w:t>
-      </w:r>
-    </w:p>
-    <w:p>
-      <w:pPr>
-        <w:rPr>
-          <w:b/>
-          <w:bCs/>
-          <w:sz w:val="44"/>
-          <w:szCs w:val="44"/>
-        </w:rPr>
-      </w:pPr>
-      <w:r>
-        <w:rPr>
-          <w:b/>
-          <w:bCs/>
-          <w:sz w:val="44"/>
-          <w:szCs w:val="44"/>
-        </w:rPr>
-        <w:t>83)what is the contract between .equals() and .hashCode() in java ?</w:t>
-      </w:r>
-    </w:p>
-    <w:p>
-      <w:pPr>
-        <w:rPr>
-          <w:b/>
-          <w:bCs/>
-          <w:sz w:val="44"/>
-          <w:szCs w:val="44"/>
-        </w:rPr>
-      </w:pPr>
-      <w:r>
-        <w:rPr>
-          <w:b/>
-          <w:bCs/>
-          <w:sz w:val="44"/>
-          <w:szCs w:val="44"/>
-        </w:rPr>
-        <w:t>84) define :</w:t>
-      </w:r>
+        <w:t xml:space="preserve">80) what </w:t>
+      </w:r>
+      <w:proofErr w:type="gramStart"/>
+      <w:r>
+        <w:rPr>
+          <w:b/>
+          <w:bCs/>
+          <w:sz w:val="44"/>
+          <w:szCs w:val="44"/>
+        </w:rPr>
+        <w:t>is .</w:t>
+      </w:r>
+      <w:proofErr w:type="spellStart"/>
+      <w:r>
+        <w:rPr>
+          <w:b/>
+          <w:bCs/>
+          <w:sz w:val="44"/>
+          <w:szCs w:val="44"/>
+        </w:rPr>
+        <w:t>hashCode</w:t>
+      </w:r>
+      <w:proofErr w:type="spellEnd"/>
+      <w:proofErr w:type="gramEnd"/>
+      <w:r>
+        <w:rPr>
+          <w:b/>
+          <w:bCs/>
+          <w:sz w:val="44"/>
+          <w:szCs w:val="44"/>
+        </w:rPr>
+        <w:t xml:space="preserve">() and </w:t>
+      </w:r>
+      <w:proofErr w:type="spellStart"/>
+      <w:proofErr w:type="gramStart"/>
+      <w:r>
+        <w:rPr>
+          <w:b/>
+          <w:bCs/>
+          <w:sz w:val="44"/>
+          <w:szCs w:val="44"/>
+        </w:rPr>
+        <w:t>it’s</w:t>
+      </w:r>
+      <w:proofErr w:type="spellEnd"/>
+      <w:proofErr w:type="gramEnd"/>
+      <w:r>
+        <w:rPr>
+          <w:b/>
+          <w:bCs/>
+          <w:sz w:val="44"/>
+          <w:szCs w:val="44"/>
+        </w:rPr>
+        <w:t xml:space="preserve"> </w:t>
+      </w:r>
+      <w:proofErr w:type="gramStart"/>
+      <w:r>
+        <w:rPr>
+          <w:b/>
+          <w:bCs/>
+          <w:sz w:val="44"/>
+          <w:szCs w:val="44"/>
+        </w:rPr>
+        <w:t>significance ?</w:t>
+      </w:r>
+      <w:proofErr w:type="gramEnd"/>
+    </w:p>
+    <w:p>
+      <w:pPr>
+        <w:rPr>
+          <w:b/>
+          <w:bCs/>
+          <w:sz w:val="44"/>
+          <w:szCs w:val="44"/>
+        </w:rPr>
+      </w:pPr>
+      <w:r>
+        <w:rPr>
+          <w:b/>
+          <w:bCs/>
+          <w:sz w:val="44"/>
+          <w:szCs w:val="44"/>
+        </w:rPr>
+        <w:t xml:space="preserve">81) default </w:t>
+      </w:r>
+      <w:proofErr w:type="spellStart"/>
+      <w:r>
+        <w:rPr>
+          <w:b/>
+          <w:bCs/>
+          <w:sz w:val="44"/>
+          <w:szCs w:val="44"/>
+        </w:rPr>
+        <w:t>behaviour</w:t>
+      </w:r>
+      <w:proofErr w:type="spellEnd"/>
+      <w:r>
+        <w:rPr>
+          <w:b/>
+          <w:bCs/>
+          <w:sz w:val="44"/>
+          <w:szCs w:val="44"/>
+        </w:rPr>
+        <w:t xml:space="preserve"> of </w:t>
+      </w:r>
+      <w:proofErr w:type="gramStart"/>
+      <w:r>
+        <w:rPr>
+          <w:b/>
+          <w:bCs/>
+          <w:sz w:val="44"/>
+          <w:szCs w:val="44"/>
+        </w:rPr>
+        <w:t>the .equals</w:t>
+      </w:r>
+      <w:proofErr w:type="gramEnd"/>
+      <w:r>
+        <w:rPr>
+          <w:b/>
+          <w:bCs/>
+          <w:sz w:val="44"/>
+          <w:szCs w:val="44"/>
+        </w:rPr>
+        <w:t xml:space="preserve">() in </w:t>
+      </w:r>
+      <w:proofErr w:type="gramStart"/>
+      <w:r>
+        <w:rPr>
+          <w:b/>
+          <w:bCs/>
+          <w:sz w:val="44"/>
+          <w:szCs w:val="44"/>
+        </w:rPr>
+        <w:t>java ?</w:t>
+      </w:r>
+      <w:proofErr w:type="gramEnd"/>
+    </w:p>
+    <w:p>
+      <w:pPr>
+        <w:rPr>
+          <w:b/>
+          <w:bCs/>
+          <w:sz w:val="44"/>
+          <w:szCs w:val="44"/>
+        </w:rPr>
+      </w:pPr>
+      <w:r>
+        <w:rPr>
+          <w:b/>
+          <w:bCs/>
+          <w:sz w:val="44"/>
+          <w:szCs w:val="44"/>
+        </w:rPr>
+        <w:t xml:space="preserve">82) why </w:t>
+      </w:r>
+      <w:proofErr w:type="gramStart"/>
+      <w:r>
+        <w:rPr>
+          <w:b/>
+          <w:bCs/>
+          <w:sz w:val="44"/>
+          <w:szCs w:val="44"/>
+        </w:rPr>
+        <w:t>does .equals</w:t>
+      </w:r>
+      <w:proofErr w:type="gramEnd"/>
+      <w:r>
+        <w:rPr>
+          <w:b/>
+          <w:bCs/>
+          <w:sz w:val="44"/>
+          <w:szCs w:val="44"/>
+        </w:rPr>
+        <w:t>() behaves differently in String class?</w:t>
+      </w:r>
+    </w:p>
+    <w:p>
+      <w:pPr>
+        <w:rPr>
+          <w:b/>
+          <w:bCs/>
+          <w:sz w:val="44"/>
+          <w:szCs w:val="44"/>
+        </w:rPr>
+      </w:pPr>
+      <w:r>
+        <w:rPr>
+          <w:b/>
+          <w:bCs/>
+          <w:sz w:val="44"/>
+          <w:szCs w:val="44"/>
+        </w:rPr>
+        <w:t xml:space="preserve">83)what is the contract </w:t>
+      </w:r>
+      <w:proofErr w:type="gramStart"/>
+      <w:r>
+        <w:rPr>
+          <w:b/>
+          <w:bCs/>
+          <w:sz w:val="44"/>
+          <w:szCs w:val="44"/>
+        </w:rPr>
+        <w:t>between .equals</w:t>
+      </w:r>
+      <w:proofErr w:type="gramEnd"/>
+      <w:r>
+        <w:rPr>
+          <w:b/>
+          <w:bCs/>
+          <w:sz w:val="44"/>
+          <w:szCs w:val="44"/>
+        </w:rPr>
+        <w:t xml:space="preserve">() </w:t>
+      </w:r>
+      <w:proofErr w:type="gramStart"/>
+      <w:r>
+        <w:rPr>
+          <w:b/>
+          <w:bCs/>
+          <w:sz w:val="44"/>
+          <w:szCs w:val="44"/>
+        </w:rPr>
+        <w:t>and .</w:t>
+      </w:r>
+      <w:proofErr w:type="spellStart"/>
+      <w:r>
+        <w:rPr>
+          <w:b/>
+          <w:bCs/>
+          <w:sz w:val="44"/>
+          <w:szCs w:val="44"/>
+        </w:rPr>
+        <w:t>hashCode</w:t>
+      </w:r>
+      <w:proofErr w:type="spellEnd"/>
+      <w:proofErr w:type="gramEnd"/>
+      <w:r>
+        <w:rPr>
+          <w:b/>
+          <w:bCs/>
+          <w:sz w:val="44"/>
+          <w:szCs w:val="44"/>
+        </w:rPr>
+        <w:t xml:space="preserve">() in </w:t>
+      </w:r>
+      <w:proofErr w:type="gramStart"/>
+      <w:r>
+        <w:rPr>
+          <w:b/>
+          <w:bCs/>
+          <w:sz w:val="44"/>
+          <w:szCs w:val="44"/>
+        </w:rPr>
+        <w:t>java ?</w:t>
+      </w:r>
+      <w:proofErr w:type="gramEnd"/>
+    </w:p>
+    <w:p>
+      <w:pPr>
+        <w:rPr>
+          <w:b/>
+          <w:bCs/>
+          <w:sz w:val="44"/>
+          <w:szCs w:val="44"/>
+        </w:rPr>
+      </w:pPr>
+      <w:r>
+        <w:rPr>
+          <w:b/>
+          <w:bCs/>
+          <w:sz w:val="44"/>
+          <w:szCs w:val="44"/>
+        </w:rPr>
+        <w:t xml:space="preserve">84) </w:t>
+      </w:r>
+      <w:proofErr w:type="gramStart"/>
+      <w:r>
+        <w:rPr>
+          <w:b/>
+          <w:bCs/>
+          <w:sz w:val="44"/>
+          <w:szCs w:val="44"/>
+        </w:rPr>
+        <w:t>define :</w:t>
+      </w:r>
+      <w:proofErr w:type="gramEnd"/>
       <w:r>
         <w:rPr>
           <w:b/>
@@ -1667,18 +2728,41 @@
           <w:szCs w:val="44"/>
         </w:rPr>
         <w:br/>
-        <w:t xml:space="preserve"> a)reflexitivity</w:t>
-      </w:r>
-    </w:p>
-    <w:p>
-      <w:pPr>
-        <w:rPr>
-          <w:b/>
-          <w:bCs/>
-          <w:sz w:val="44"/>
-          <w:szCs w:val="44"/>
-        </w:rPr>
-      </w:pPr>
+        <w:t xml:space="preserve"> </w:t>
+      </w:r>
+      <w:proofErr w:type="gramStart"/>
+      <w:r>
+        <w:rPr>
+          <w:b/>
+          <w:bCs/>
+          <w:sz w:val="44"/>
+          <w:szCs w:val="44"/>
+        </w:rPr>
+        <w:t>a)</w:t>
+      </w:r>
+      <w:proofErr w:type="spellStart"/>
+      <w:r>
+        <w:rPr>
+          <w:b/>
+          <w:bCs/>
+          <w:sz w:val="44"/>
+          <w:szCs w:val="44"/>
+        </w:rPr>
+        <w:t>reflexitivity</w:t>
+      </w:r>
+      <w:proofErr w:type="spellEnd"/>
+      <w:proofErr w:type="gramEnd"/>
+    </w:p>
+    <w:p>
+      <w:pPr>
+        <w:rPr>
+          <w:b/>
+          <w:bCs/>
+          <w:sz w:val="44"/>
+          <w:szCs w:val="44"/>
+        </w:rPr>
+      </w:pPr>
+      <w:proofErr w:type="gramStart"/>
       <w:r>
         <w:rPr>
           <w:b/>
@@ -1688,6 +2772,7 @@
         </w:rPr>
         <w:t>b)consistency</w:t>
       </w:r>
+      <w:proofErr w:type="gramEnd"/>
     </w:p>
     <w:p>
       <w:pPr>
@@ -1736,43 +2821,74 @@
           <w:szCs w:val="44"/>
         </w:rPr>
       </w:pPr>
-      <w:r>
-        <w:rPr>
-          <w:b/>
-          <w:bCs/>
-          <w:sz w:val="44"/>
-          <w:szCs w:val="44"/>
-        </w:rPr>
-        <w:t xml:space="preserve">e)transitivity </w:t>
-      </w:r>
-    </w:p>
-    <w:p>
-      <w:pPr>
-        <w:rPr>
-          <w:b/>
-          <w:bCs/>
-          <w:sz w:val="44"/>
-          <w:szCs w:val="44"/>
-        </w:rPr>
-      </w:pPr>
-    </w:p>
-    <w:p>
-      <w:pPr>
-        <w:rPr>
-          <w:b/>
-          <w:bCs/>
-          <w:sz w:val="44"/>
-          <w:szCs w:val="44"/>
-        </w:rPr>
-      </w:pPr>
-      <w:r>
-        <w:rPr>
-          <w:b/>
-          <w:bCs/>
-          <w:sz w:val="44"/>
-          <w:szCs w:val="44"/>
-        </w:rPr>
-        <w:t>contracts of .equals() in java with example.</w:t>
+      <w:proofErr w:type="gramStart"/>
+      <w:r>
+        <w:rPr>
+          <w:b/>
+          <w:bCs/>
+          <w:sz w:val="44"/>
+          <w:szCs w:val="44"/>
+        </w:rPr>
+        <w:t>e)transitivity</w:t>
+      </w:r>
+      <w:proofErr w:type="gramEnd"/>
+      <w:r>
+        <w:rPr>
+          <w:b/>
+          <w:bCs/>
+          <w:sz w:val="44"/>
+          <w:szCs w:val="44"/>
+        </w:rPr>
+        <w:t xml:space="preserve"> </w:t>
+      </w:r>
+    </w:p>
+    <w:p>
+      <w:pPr>
+        <w:rPr>
+          <w:b/>
+          <w:bCs/>
+          <w:sz w:val="44"/>
+          <w:szCs w:val="44"/>
+        </w:rPr>
+      </w:pPr>
+    </w:p>
+    <w:p>
+      <w:pPr>
+        <w:rPr>
+          <w:b/>
+          <w:bCs/>
+          <w:sz w:val="44"/>
+          <w:szCs w:val="44"/>
+        </w:rPr>
+      </w:pPr>
+      <w:r>
+        <w:rPr>
+          <w:b/>
+          <w:bCs/>
+          <w:sz w:val="44"/>
+          <w:szCs w:val="44"/>
+        </w:rPr>
+        <w:t xml:space="preserve">contracts </w:t>
+      </w:r>
+      <w:proofErr w:type="gramStart"/>
+      <w:r>
+        <w:rPr>
+          <w:b/>
+          <w:bCs/>
+          <w:sz w:val="44"/>
+          <w:szCs w:val="44"/>
+        </w:rPr>
+        <w:t>of .equals</w:t>
+      </w:r>
+      <w:proofErr w:type="gramEnd"/>
+      <w:r>
+        <w:rPr>
+          <w:b/>
+          <w:bCs/>
+          <w:sz w:val="44"/>
+          <w:szCs w:val="44"/>
+        </w:rPr>
+        <w:t>() in java with example.</w:t>
       </w:r>
     </w:p>
     <w:p>
@@ -1802,65 +2918,240 @@
           <w:szCs w:val="44"/>
         </w:rPr>
         <w:lastRenderedPageBreak/>
-        <w:t>85) why to override .equals() and .hashCode() together in java ?</w:t>
-      </w:r>
-    </w:p>
-    <w:p>
-      <w:pPr>
-        <w:rPr>
-          <w:b/>
-          <w:bCs/>
-          <w:sz w:val="44"/>
-          <w:szCs w:val="44"/>
-        </w:rPr>
-      </w:pPr>
-      <w:r>
-        <w:rPr>
-          <w:b/>
-          <w:bCs/>
-          <w:sz w:val="44"/>
-          <w:szCs w:val="44"/>
-        </w:rPr>
-        <w:t>86)what are the best practices followed when overriding the .equals() and .hashCode() in Java?</w:t>
-      </w:r>
-    </w:p>
-    <w:p>
-      <w:pPr>
-        <w:rPr>
-          <w:b/>
-          <w:bCs/>
-          <w:sz w:val="44"/>
-          <w:szCs w:val="44"/>
-        </w:rPr>
-      </w:pPr>
-      <w:r>
-        <w:rPr>
-          <w:b/>
-          <w:bCs/>
-          <w:sz w:val="44"/>
-          <w:szCs w:val="44"/>
-        </w:rPr>
-        <w:t>87)what is the HAS-A relationship in Java ? Can you equate the HAS-A with Dependacy injection in java ?</w:t>
-      </w:r>
-    </w:p>
-    <w:p>
-      <w:pPr>
-        <w:rPr>
-          <w:b/>
-          <w:bCs/>
-          <w:sz w:val="44"/>
-          <w:szCs w:val="44"/>
-        </w:rPr>
-      </w:pPr>
-      <w:r>
-        <w:rPr>
-          <w:b/>
-          <w:bCs/>
-          <w:sz w:val="44"/>
-          <w:szCs w:val="44"/>
-        </w:rPr>
-        <w:t>88) what is the difference between reference and Object in Java ?</w:t>
-      </w:r>
+        <w:t xml:space="preserve">85) why to </w:t>
+      </w:r>
+      <w:proofErr w:type="gramStart"/>
+      <w:r>
+        <w:rPr>
+          <w:b/>
+          <w:bCs/>
+          <w:sz w:val="44"/>
+          <w:szCs w:val="44"/>
+        </w:rPr>
+        <w:t>override .equals</w:t>
+      </w:r>
+      <w:proofErr w:type="gramEnd"/>
+      <w:r>
+        <w:rPr>
+          <w:b/>
+          <w:bCs/>
+          <w:sz w:val="44"/>
+          <w:szCs w:val="44"/>
+        </w:rPr>
+        <w:t xml:space="preserve">() </w:t>
+      </w:r>
+      <w:proofErr w:type="gramStart"/>
+      <w:r>
+        <w:rPr>
+          <w:b/>
+          <w:bCs/>
+          <w:sz w:val="44"/>
+          <w:szCs w:val="44"/>
+        </w:rPr>
+        <w:t>and .</w:t>
+      </w:r>
+      <w:proofErr w:type="spellStart"/>
+      <w:r>
+        <w:rPr>
+          <w:b/>
+          <w:bCs/>
+          <w:sz w:val="44"/>
+          <w:szCs w:val="44"/>
+        </w:rPr>
+        <w:t>hashCode</w:t>
+      </w:r>
+      <w:proofErr w:type="spellEnd"/>
+      <w:proofErr w:type="gramEnd"/>
+      <w:r>
+        <w:rPr>
+          <w:b/>
+          <w:bCs/>
+          <w:sz w:val="44"/>
+          <w:szCs w:val="44"/>
+        </w:rPr>
+        <w:t xml:space="preserve">() together in </w:t>
+      </w:r>
+      <w:proofErr w:type="gramStart"/>
+      <w:r>
+        <w:rPr>
+          <w:b/>
+          <w:bCs/>
+          <w:sz w:val="44"/>
+          <w:szCs w:val="44"/>
+        </w:rPr>
+        <w:t>java ?</w:t>
+      </w:r>
+      <w:proofErr w:type="gramEnd"/>
+    </w:p>
+    <w:p>
+      <w:pPr>
+        <w:rPr>
+          <w:b/>
+          <w:bCs/>
+          <w:sz w:val="44"/>
+          <w:szCs w:val="44"/>
+        </w:rPr>
+      </w:pPr>
+      <w:r>
+        <w:rPr>
+          <w:b/>
+          <w:bCs/>
+          <w:sz w:val="44"/>
+          <w:szCs w:val="44"/>
+        </w:rPr>
+        <w:t xml:space="preserve">86)what are the best practices followed when overriding </w:t>
+      </w:r>
+      <w:proofErr w:type="gramStart"/>
+      <w:r>
+        <w:rPr>
+          <w:b/>
+          <w:bCs/>
+          <w:sz w:val="44"/>
+          <w:szCs w:val="44"/>
+        </w:rPr>
+        <w:t>the .equals</w:t>
+      </w:r>
+      <w:proofErr w:type="gramEnd"/>
+      <w:r>
+        <w:rPr>
+          <w:b/>
+          <w:bCs/>
+          <w:sz w:val="44"/>
+          <w:szCs w:val="44"/>
+        </w:rPr>
+        <w:t xml:space="preserve">() </w:t>
+      </w:r>
+      <w:proofErr w:type="gramStart"/>
+      <w:r>
+        <w:rPr>
+          <w:b/>
+          <w:bCs/>
+          <w:sz w:val="44"/>
+          <w:szCs w:val="44"/>
+        </w:rPr>
+        <w:t>and .</w:t>
+      </w:r>
+      <w:proofErr w:type="spellStart"/>
+      <w:r>
+        <w:rPr>
+          <w:b/>
+          <w:bCs/>
+          <w:sz w:val="44"/>
+          <w:szCs w:val="44"/>
+        </w:rPr>
+        <w:t>hashCode</w:t>
+      </w:r>
+      <w:proofErr w:type="spellEnd"/>
+      <w:proofErr w:type="gramEnd"/>
+      <w:r>
+        <w:rPr>
+          <w:b/>
+          <w:bCs/>
+          <w:sz w:val="44"/>
+          <w:szCs w:val="44"/>
+        </w:rPr>
+        <w:t>() in Java?</w:t>
+      </w:r>
+    </w:p>
+    <w:p>
+      <w:pPr>
+        <w:rPr>
+          <w:b/>
+          <w:bCs/>
+          <w:sz w:val="44"/>
+          <w:szCs w:val="44"/>
+        </w:rPr>
+      </w:pPr>
+      <w:r>
+        <w:rPr>
+          <w:b/>
+          <w:bCs/>
+          <w:sz w:val="44"/>
+          <w:szCs w:val="44"/>
+        </w:rPr>
+        <w:t xml:space="preserve">87)what is the HAS-A relationship in </w:t>
+      </w:r>
+      <w:proofErr w:type="gramStart"/>
+      <w:r>
+        <w:rPr>
+          <w:b/>
+          <w:bCs/>
+          <w:sz w:val="44"/>
+          <w:szCs w:val="44"/>
+        </w:rPr>
+        <w:t>Java ?</w:t>
+      </w:r>
+      <w:proofErr w:type="gramEnd"/>
+      <w:r>
+        <w:rPr>
+          <w:b/>
+          <w:bCs/>
+          <w:sz w:val="44"/>
+          <w:szCs w:val="44"/>
+        </w:rPr>
+        <w:t xml:space="preserve"> Can you equate the HAS-A with </w:t>
+      </w:r>
+      <w:proofErr w:type="spellStart"/>
+      <w:r>
+        <w:rPr>
+          <w:b/>
+          <w:bCs/>
+          <w:sz w:val="44"/>
+          <w:szCs w:val="44"/>
+        </w:rPr>
+        <w:t>Dependacy</w:t>
+      </w:r>
+      <w:proofErr w:type="spellEnd"/>
+      <w:r>
+        <w:rPr>
+          <w:b/>
+          <w:bCs/>
+          <w:sz w:val="44"/>
+          <w:szCs w:val="44"/>
+        </w:rPr>
+        <w:t xml:space="preserve"> injection in </w:t>
+      </w:r>
+      <w:proofErr w:type="gramStart"/>
+      <w:r>
+        <w:rPr>
+          <w:b/>
+          <w:bCs/>
+          <w:sz w:val="44"/>
+          <w:szCs w:val="44"/>
+        </w:rPr>
+        <w:t>java ?</w:t>
+      </w:r>
+      <w:proofErr w:type="gramEnd"/>
+    </w:p>
+    <w:p>
+      <w:pPr>
+        <w:rPr>
+          <w:b/>
+          <w:bCs/>
+          <w:sz w:val="44"/>
+          <w:szCs w:val="44"/>
+        </w:rPr>
+      </w:pPr>
+      <w:r>
+        <w:rPr>
+          <w:b/>
+          <w:bCs/>
+          <w:sz w:val="44"/>
+          <w:szCs w:val="44"/>
+        </w:rPr>
+        <w:t xml:space="preserve">88) what is the difference between reference and Object in </w:t>
+      </w:r>
+      <w:proofErr w:type="gramStart"/>
+      <w:r>
+        <w:rPr>
+          <w:b/>
+          <w:bCs/>
+          <w:sz w:val="44"/>
+          <w:szCs w:val="44"/>
+        </w:rPr>
+        <w:t>Java ?</w:t>
+      </w:r>
+      <w:proofErr w:type="gramEnd"/>
     </w:p>
     <w:p>
       <w:pPr>
@@ -1973,26 +3264,126 @@
           <w:sz w:val="44"/>
           <w:szCs w:val="44"/>
         </w:rPr>
-        <w:t>94) ArrayList vs  LinkedList vs Vector vs Stack.</w:t>
-      </w:r>
-    </w:p>
-    <w:p>
-      <w:pPr>
-        <w:rPr>
-          <w:b/>
-          <w:bCs/>
-          <w:sz w:val="44"/>
-          <w:szCs w:val="44"/>
-        </w:rPr>
-      </w:pPr>
-      <w:r>
-        <w:rPr>
-          <w:b/>
-          <w:bCs/>
-          <w:sz w:val="44"/>
-          <w:szCs w:val="44"/>
-        </w:rPr>
-        <w:t>95) Peek() vs Push() vs Pop().</w:t>
+        <w:t xml:space="preserve">94) </w:t>
+      </w:r>
+      <w:proofErr w:type="spellStart"/>
+      <w:r>
+        <w:rPr>
+          <w:b/>
+          <w:bCs/>
+          <w:sz w:val="44"/>
+          <w:szCs w:val="44"/>
+        </w:rPr>
+        <w:t>ArrayList</w:t>
+      </w:r>
+      <w:proofErr w:type="spellEnd"/>
+      <w:r>
+        <w:rPr>
+          <w:b/>
+          <w:bCs/>
+          <w:sz w:val="44"/>
+          <w:szCs w:val="44"/>
+        </w:rPr>
+        <w:t xml:space="preserve"> </w:t>
+      </w:r>
+      <w:proofErr w:type="gramStart"/>
+      <w:r>
+        <w:rPr>
+          <w:b/>
+          <w:bCs/>
+          <w:sz w:val="44"/>
+          <w:szCs w:val="44"/>
+        </w:rPr>
+        <w:t>vs  LinkedList</w:t>
+      </w:r>
+      <w:proofErr w:type="gramEnd"/>
+      <w:r>
+        <w:rPr>
+          <w:b/>
+          <w:bCs/>
+          <w:sz w:val="44"/>
+          <w:szCs w:val="44"/>
+        </w:rPr>
+        <w:t xml:space="preserve"> vs Vector vs Stack.</w:t>
+      </w:r>
+    </w:p>
+    <w:p>
+      <w:pPr>
+        <w:rPr>
+          <w:b/>
+          <w:bCs/>
+          <w:sz w:val="44"/>
+          <w:szCs w:val="44"/>
+        </w:rPr>
+      </w:pPr>
+      <w:r>
+        <w:rPr>
+          <w:b/>
+          <w:bCs/>
+          <w:sz w:val="44"/>
+          <w:szCs w:val="44"/>
+        </w:rPr>
+        <w:t xml:space="preserve">95) </w:t>
+      </w:r>
+      <w:proofErr w:type="gramStart"/>
+      <w:r>
+        <w:rPr>
+          <w:b/>
+          <w:bCs/>
+          <w:sz w:val="44"/>
+          <w:szCs w:val="44"/>
+        </w:rPr>
+        <w:t>Peek(</w:t>
+      </w:r>
+      <w:proofErr w:type="gramEnd"/>
+      <w:r>
+        <w:rPr>
+          <w:b/>
+          <w:bCs/>
+          <w:sz w:val="44"/>
+          <w:szCs w:val="44"/>
+        </w:rPr>
+        <w:t xml:space="preserve">) vs </w:t>
+      </w:r>
+      <w:proofErr w:type="gramStart"/>
+      <w:r>
+        <w:rPr>
+          <w:b/>
+          <w:bCs/>
+          <w:sz w:val="44"/>
+          <w:szCs w:val="44"/>
+        </w:rPr>
+        <w:t>Push(</w:t>
+      </w:r>
+      <w:proofErr w:type="gramEnd"/>
+      <w:r>
+        <w:rPr>
+          <w:b/>
+          <w:bCs/>
+          <w:sz w:val="44"/>
+          <w:szCs w:val="44"/>
+        </w:rPr>
+        <w:t xml:space="preserve">) vs </w:t>
+      </w:r>
+      <w:proofErr w:type="gramStart"/>
+      <w:r>
+        <w:rPr>
+          <w:b/>
+          <w:bCs/>
+          <w:sz w:val="44"/>
+          <w:szCs w:val="44"/>
+        </w:rPr>
+        <w:t>Pop(</w:t>
+      </w:r>
+      <w:proofErr w:type="gramEnd"/>
+      <w:r>
+        <w:rPr>
+          <w:b/>
+          <w:bCs/>
+          <w:sz w:val="44"/>
+          <w:szCs w:val="44"/>
+        </w:rPr>
+        <w:t>).</w:t>
       </w:r>
     </w:p>
     <w:p>
@@ -2012,26 +3403,66 @@
           <w:szCs w:val="44"/>
         </w:rPr>
         <w:lastRenderedPageBreak/>
-        <w:t>96) Best case scenarios for ArrayList vs LinkedList.</w:t>
-      </w:r>
-    </w:p>
-    <w:p>
-      <w:pPr>
-        <w:rPr>
-          <w:b/>
-          <w:bCs/>
-          <w:sz w:val="44"/>
-          <w:szCs w:val="44"/>
-        </w:rPr>
-      </w:pPr>
-      <w:r>
-        <w:rPr>
-          <w:b/>
-          <w:bCs/>
-          <w:sz w:val="44"/>
-          <w:szCs w:val="44"/>
-        </w:rPr>
-        <w:t>97)prove that Linked list is faster than Arraylist in specific cases and it is otherwise in other cases.</w:t>
+        <w:t xml:space="preserve">96) Best case scenarios for </w:t>
+      </w:r>
+      <w:proofErr w:type="spellStart"/>
+      <w:r>
+        <w:rPr>
+          <w:b/>
+          <w:bCs/>
+          <w:sz w:val="44"/>
+          <w:szCs w:val="44"/>
+        </w:rPr>
+        <w:t>ArrayList</w:t>
+      </w:r>
+      <w:proofErr w:type="spellEnd"/>
+      <w:r>
+        <w:rPr>
+          <w:b/>
+          <w:bCs/>
+          <w:sz w:val="44"/>
+          <w:szCs w:val="44"/>
+        </w:rPr>
+        <w:t xml:space="preserve"> vs LinkedList.</w:t>
+      </w:r>
+    </w:p>
+    <w:p>
+      <w:pPr>
+        <w:rPr>
+          <w:b/>
+          <w:bCs/>
+          <w:sz w:val="44"/>
+          <w:szCs w:val="44"/>
+        </w:rPr>
+      </w:pPr>
+      <w:r>
+        <w:rPr>
+          <w:b/>
+          <w:bCs/>
+          <w:sz w:val="44"/>
+          <w:szCs w:val="44"/>
+        </w:rPr>
+        <w:t xml:space="preserve">97)prove that Linked list is faster than </w:t>
+      </w:r>
+      <w:proofErr w:type="spellStart"/>
+      <w:r>
+        <w:rPr>
+          <w:b/>
+          <w:bCs/>
+          <w:sz w:val="44"/>
+          <w:szCs w:val="44"/>
+        </w:rPr>
+        <w:t>Arraylist</w:t>
+      </w:r>
+      <w:proofErr w:type="spellEnd"/>
+      <w:r>
+        <w:rPr>
+          <w:b/>
+          <w:bCs/>
+          <w:sz w:val="44"/>
+          <w:szCs w:val="44"/>
+        </w:rPr>
+        <w:t xml:space="preserve"> in specific cases and it is otherwise in other cases.</w:t>
       </w:r>
     </w:p>
     <w:p>
@@ -2069,56 +3500,138 @@
           <w:sz w:val="44"/>
           <w:szCs w:val="44"/>
         </w:rPr>
-        <w:t>99) why stack is not a good choice for LIFO ?</w:t>
-      </w:r>
-    </w:p>
-    <w:p>
-      <w:pPr>
-        <w:rPr>
-          <w:b/>
-          <w:bCs/>
-          <w:sz w:val="44"/>
-          <w:szCs w:val="44"/>
-        </w:rPr>
-      </w:pPr>
-      <w:r>
-        <w:rPr>
-          <w:b/>
-          <w:bCs/>
-          <w:sz w:val="44"/>
-          <w:szCs w:val="44"/>
-        </w:rPr>
-        <w:t>100)Type Safe and  Generic in java.</w:t>
-      </w:r>
-    </w:p>
-    <w:p>
-      <w:pPr>
-        <w:rPr>
-          <w:b/>
-          <w:bCs/>
-          <w:sz w:val="44"/>
-          <w:szCs w:val="44"/>
-        </w:rPr>
-      </w:pPr>
-    </w:p>
-    <w:p>
-      <w:pPr>
-        <w:rPr>
-          <w:b/>
-          <w:bCs/>
-          <w:sz w:val="44"/>
-          <w:szCs w:val="44"/>
-        </w:rPr>
-      </w:pPr>
-      <w:r>
-        <w:rPr>
-          <w:b/>
-          <w:bCs/>
-          <w:sz w:val="44"/>
-          <w:szCs w:val="44"/>
-        </w:rPr>
-        <w:t>101)what is set interface ? DC ? LF ?</w:t>
-      </w:r>
+        <w:t xml:space="preserve">99) why stack is not a good choice for </w:t>
+      </w:r>
+      <w:proofErr w:type="gramStart"/>
+      <w:r>
+        <w:rPr>
+          <w:b/>
+          <w:bCs/>
+          <w:sz w:val="44"/>
+          <w:szCs w:val="44"/>
+        </w:rPr>
+        <w:t>LIFO ?</w:t>
+      </w:r>
+      <w:proofErr w:type="gramEnd"/>
+    </w:p>
+    <w:p>
+      <w:pPr>
+        <w:rPr>
+          <w:b/>
+          <w:bCs/>
+          <w:sz w:val="44"/>
+          <w:szCs w:val="44"/>
+        </w:rPr>
+      </w:pPr>
+      <w:r>
+        <w:rPr>
+          <w:b/>
+          <w:bCs/>
+          <w:sz w:val="44"/>
+          <w:szCs w:val="44"/>
+        </w:rPr>
+        <w:t xml:space="preserve">100)Type Safe </w:t>
+      </w:r>
+      <w:proofErr w:type="gramStart"/>
+      <w:r>
+        <w:rPr>
+          <w:b/>
+          <w:bCs/>
+          <w:sz w:val="44"/>
+          <w:szCs w:val="44"/>
+        </w:rPr>
+        <w:t>and  Generic</w:t>
+      </w:r>
+      <w:proofErr w:type="gramEnd"/>
+      <w:r>
+        <w:rPr>
+          <w:b/>
+          <w:bCs/>
+          <w:sz w:val="44"/>
+          <w:szCs w:val="44"/>
+        </w:rPr>
+        <w:t xml:space="preserve"> in java.</w:t>
+      </w:r>
+    </w:p>
+    <w:p>
+      <w:pPr>
+        <w:rPr>
+          <w:b/>
+          <w:bCs/>
+          <w:sz w:val="44"/>
+          <w:szCs w:val="44"/>
+        </w:rPr>
+      </w:pPr>
+    </w:p>
+    <w:p>
+      <w:pPr>
+        <w:rPr>
+          <w:b/>
+          <w:bCs/>
+          <w:sz w:val="44"/>
+          <w:szCs w:val="44"/>
+        </w:rPr>
+      </w:pPr>
+      <w:r>
+        <w:rPr>
+          <w:b/>
+          <w:bCs/>
+          <w:sz w:val="44"/>
+          <w:szCs w:val="44"/>
+        </w:rPr>
+        <w:t xml:space="preserve">101)what is set </w:t>
+      </w:r>
+      <w:proofErr w:type="gramStart"/>
+      <w:r>
+        <w:rPr>
+          <w:b/>
+          <w:bCs/>
+          <w:sz w:val="44"/>
+          <w:szCs w:val="44"/>
+        </w:rPr>
+        <w:t>interface ?</w:t>
+      </w:r>
+      <w:proofErr w:type="gramEnd"/>
+      <w:r>
+        <w:rPr>
+          <w:b/>
+          <w:bCs/>
+          <w:sz w:val="44"/>
+          <w:szCs w:val="44"/>
+        </w:rPr>
+        <w:t xml:space="preserve"> </w:t>
+      </w:r>
+      <w:proofErr w:type="gramStart"/>
+      <w:r>
+        <w:rPr>
+          <w:b/>
+          <w:bCs/>
+          <w:sz w:val="44"/>
+          <w:szCs w:val="44"/>
+        </w:rPr>
+        <w:t>DC ?</w:t>
+      </w:r>
+      <w:proofErr w:type="gramEnd"/>
+      <w:r>
+        <w:rPr>
+          <w:b/>
+          <w:bCs/>
+          <w:sz w:val="44"/>
+          <w:szCs w:val="44"/>
+        </w:rPr>
+        <w:t xml:space="preserve"> </w:t>
+      </w:r>
+      <w:proofErr w:type="gramStart"/>
+      <w:r>
+        <w:rPr>
+          <w:b/>
+          <w:bCs/>
+          <w:sz w:val="44"/>
+          <w:szCs w:val="44"/>
+        </w:rPr>
+        <w:t>LF ?</w:t>
+      </w:r>
+      <w:proofErr w:type="gramEnd"/>
     </w:p>
     <w:p>
       <w:pPr>
@@ -2155,84 +3668,188 @@
           <w:sz w:val="44"/>
           <w:szCs w:val="44"/>
         </w:rPr>
-        <w:t>103) HashSet and it’s behaviour.</w:t>
-      </w:r>
-    </w:p>
-    <w:p>
-      <w:pPr>
-        <w:rPr>
-          <w:b/>
-          <w:bCs/>
-          <w:sz w:val="44"/>
-          <w:szCs w:val="44"/>
-        </w:rPr>
-      </w:pPr>
-      <w:r>
-        <w:rPr>
-          <w:b/>
-          <w:bCs/>
-          <w:sz w:val="44"/>
-          <w:szCs w:val="44"/>
-        </w:rPr>
-        <w:t>104) working with  the custom classes In the  HashSet.</w:t>
-      </w:r>
-    </w:p>
-    <w:p>
-      <w:pPr>
-        <w:rPr>
-          <w:b/>
-          <w:bCs/>
-          <w:sz w:val="44"/>
-          <w:szCs w:val="44"/>
-        </w:rPr>
-      </w:pPr>
-      <w:r>
-        <w:rPr>
-          <w:b/>
-          <w:bCs/>
-          <w:sz w:val="44"/>
-          <w:szCs w:val="44"/>
-        </w:rPr>
-        <w:t>105)what is the hashCollison ?</w:t>
-      </w:r>
-    </w:p>
-    <w:p>
-      <w:pPr>
-        <w:rPr>
-          <w:b/>
-          <w:bCs/>
-          <w:sz w:val="44"/>
-          <w:szCs w:val="44"/>
-        </w:rPr>
-      </w:pPr>
-      <w:r>
-        <w:rPr>
-          <w:b/>
-          <w:bCs/>
-          <w:sz w:val="44"/>
-          <w:szCs w:val="44"/>
-        </w:rPr>
-        <w:t>106) what is Tree Set ?</w:t>
-      </w:r>
-    </w:p>
-    <w:p>
-      <w:pPr>
-        <w:rPr>
-          <w:b/>
-          <w:bCs/>
-          <w:sz w:val="44"/>
-          <w:szCs w:val="44"/>
-        </w:rPr>
-      </w:pPr>
-      <w:r>
-        <w:rPr>
-          <w:b/>
-          <w:bCs/>
-          <w:sz w:val="44"/>
-          <w:szCs w:val="44"/>
-        </w:rPr>
-        <w:t>107)What is Linked-Hash Set ?</w:t>
-      </w:r>
+        <w:t xml:space="preserve">103) HashSet and it’s </w:t>
+      </w:r>
+      <w:proofErr w:type="spellStart"/>
+      <w:r>
+        <w:rPr>
+          <w:b/>
+          <w:bCs/>
+          <w:sz w:val="44"/>
+          <w:szCs w:val="44"/>
+        </w:rPr>
+        <w:t>behaviour</w:t>
+      </w:r>
+      <w:proofErr w:type="spellEnd"/>
+      <w:r>
+        <w:rPr>
+          <w:b/>
+          <w:bCs/>
+          <w:sz w:val="44"/>
+          <w:szCs w:val="44"/>
+        </w:rPr>
+        <w:t>.</w:t>
+      </w:r>
+    </w:p>
+    <w:p>
+      <w:pPr>
+        <w:rPr>
+          <w:b/>
+          <w:bCs/>
+          <w:sz w:val="44"/>
+          <w:szCs w:val="44"/>
+        </w:rPr>
+      </w:pPr>
+      <w:r>
+        <w:rPr>
+          <w:b/>
+          <w:bCs/>
+          <w:sz w:val="44"/>
+          <w:szCs w:val="44"/>
+        </w:rPr>
+        <w:t xml:space="preserve">104) working </w:t>
+      </w:r>
+      <w:proofErr w:type="gramStart"/>
+      <w:r>
+        <w:rPr>
+          <w:b/>
+          <w:bCs/>
+          <w:sz w:val="44"/>
+          <w:szCs w:val="44"/>
+        </w:rPr>
+        <w:t>with  the</w:t>
+      </w:r>
+      <w:proofErr w:type="gramEnd"/>
+      <w:r>
+        <w:rPr>
+          <w:b/>
+          <w:bCs/>
+          <w:sz w:val="44"/>
+          <w:szCs w:val="44"/>
+        </w:rPr>
+        <w:t xml:space="preserve"> custom classes In </w:t>
+      </w:r>
+      <w:proofErr w:type="gramStart"/>
+      <w:r>
+        <w:rPr>
+          <w:b/>
+          <w:bCs/>
+          <w:sz w:val="44"/>
+          <w:szCs w:val="44"/>
+        </w:rPr>
+        <w:t>the  HashSet</w:t>
+      </w:r>
+      <w:proofErr w:type="gramEnd"/>
+      <w:r>
+        <w:rPr>
+          <w:b/>
+          <w:bCs/>
+          <w:sz w:val="44"/>
+          <w:szCs w:val="44"/>
+        </w:rPr>
+        <w:t>.</w:t>
+      </w:r>
+    </w:p>
+    <w:p>
+      <w:pPr>
+        <w:rPr>
+          <w:b/>
+          <w:bCs/>
+          <w:sz w:val="44"/>
+          <w:szCs w:val="44"/>
+        </w:rPr>
+      </w:pPr>
+      <w:r>
+        <w:rPr>
+          <w:b/>
+          <w:bCs/>
+          <w:sz w:val="44"/>
+          <w:szCs w:val="44"/>
+        </w:rPr>
+        <w:t xml:space="preserve">105)what is the </w:t>
+      </w:r>
+      <w:proofErr w:type="spellStart"/>
+      <w:proofErr w:type="gramStart"/>
+      <w:r>
+        <w:rPr>
+          <w:b/>
+          <w:bCs/>
+          <w:sz w:val="44"/>
+          <w:szCs w:val="44"/>
+        </w:rPr>
+        <w:t>hashCollison</w:t>
+      </w:r>
+      <w:proofErr w:type="spellEnd"/>
+      <w:r>
+        <w:rPr>
+          <w:b/>
+          <w:bCs/>
+          <w:sz w:val="44"/>
+          <w:szCs w:val="44"/>
+        </w:rPr>
+        <w:t xml:space="preserve"> ?</w:t>
+      </w:r>
+      <w:proofErr w:type="gramEnd"/>
+    </w:p>
+    <w:p>
+      <w:pPr>
+        <w:rPr>
+          <w:b/>
+          <w:bCs/>
+          <w:sz w:val="44"/>
+          <w:szCs w:val="44"/>
+        </w:rPr>
+      </w:pPr>
+      <w:r>
+        <w:rPr>
+          <w:b/>
+          <w:bCs/>
+          <w:sz w:val="44"/>
+          <w:szCs w:val="44"/>
+        </w:rPr>
+        <w:t xml:space="preserve">106) what is Tree </w:t>
+      </w:r>
+      <w:proofErr w:type="gramStart"/>
+      <w:r>
+        <w:rPr>
+          <w:b/>
+          <w:bCs/>
+          <w:sz w:val="44"/>
+          <w:szCs w:val="44"/>
+        </w:rPr>
+        <w:t>Set ?</w:t>
+      </w:r>
+      <w:proofErr w:type="gramEnd"/>
+    </w:p>
+    <w:p>
+      <w:pPr>
+        <w:rPr>
+          <w:b/>
+          <w:bCs/>
+          <w:sz w:val="44"/>
+          <w:szCs w:val="44"/>
+        </w:rPr>
+      </w:pPr>
+      <w:r>
+        <w:rPr>
+          <w:b/>
+          <w:bCs/>
+          <w:sz w:val="44"/>
+          <w:szCs w:val="44"/>
+        </w:rPr>
+        <w:t xml:space="preserve">107)What is Linked-Hash </w:t>
+      </w:r>
+      <w:proofErr w:type="gramStart"/>
+      <w:r>
+        <w:rPr>
+          <w:b/>
+          <w:bCs/>
+          <w:sz w:val="44"/>
+          <w:szCs w:val="44"/>
+        </w:rPr>
+        <w:t>Set ?</w:t>
+      </w:r>
+      <w:proofErr w:type="gramEnd"/>
     </w:p>
     <w:p>
       <w:pPr>
@@ -2251,45 +3868,116 @@
           <w:szCs w:val="44"/>
         </w:rPr>
         <w:lastRenderedPageBreak/>
-        <w:t>108) HashSet vs LinkedHashSet vs TreeSet.</w:t>
-      </w:r>
-    </w:p>
-    <w:p>
-      <w:pPr>
-        <w:rPr>
-          <w:b/>
-          <w:bCs/>
-          <w:sz w:val="44"/>
-          <w:szCs w:val="44"/>
-        </w:rPr>
-      </w:pPr>
-      <w:r>
-        <w:rPr>
-          <w:b/>
-          <w:bCs/>
-          <w:sz w:val="44"/>
-          <w:szCs w:val="44"/>
-        </w:rPr>
-        <w:t>109)what is comparable&lt;T&gt; and natural sorting ?</w:t>
-      </w:r>
-    </w:p>
-    <w:p>
-      <w:pPr>
-        <w:rPr>
-          <w:b/>
-          <w:bCs/>
-          <w:sz w:val="44"/>
-          <w:szCs w:val="44"/>
-        </w:rPr>
-      </w:pPr>
-      <w:r>
-        <w:rPr>
-          <w:b/>
-          <w:bCs/>
-          <w:sz w:val="44"/>
-          <w:szCs w:val="44"/>
-        </w:rPr>
-        <w:t>110)natural  ordering vs Custom Ordering.</w:t>
+        <w:t xml:space="preserve">108) HashSet vs </w:t>
+      </w:r>
+      <w:proofErr w:type="spellStart"/>
+      <w:r>
+        <w:rPr>
+          <w:b/>
+          <w:bCs/>
+          <w:sz w:val="44"/>
+          <w:szCs w:val="44"/>
+        </w:rPr>
+        <w:t>LinkedHashSet</w:t>
+      </w:r>
+      <w:proofErr w:type="spellEnd"/>
+      <w:r>
+        <w:rPr>
+          <w:b/>
+          <w:bCs/>
+          <w:sz w:val="44"/>
+          <w:szCs w:val="44"/>
+        </w:rPr>
+        <w:t xml:space="preserve"> vs </w:t>
+      </w:r>
+      <w:proofErr w:type="spellStart"/>
+      <w:r>
+        <w:rPr>
+          <w:b/>
+          <w:bCs/>
+          <w:sz w:val="44"/>
+          <w:szCs w:val="44"/>
+        </w:rPr>
+        <w:t>TreeSet</w:t>
+      </w:r>
+      <w:proofErr w:type="spellEnd"/>
+      <w:r>
+        <w:rPr>
+          <w:b/>
+          <w:bCs/>
+          <w:sz w:val="44"/>
+          <w:szCs w:val="44"/>
+        </w:rPr>
+        <w:t>.</w:t>
+      </w:r>
+    </w:p>
+    <w:p>
+      <w:pPr>
+        <w:rPr>
+          <w:b/>
+          <w:bCs/>
+          <w:sz w:val="44"/>
+          <w:szCs w:val="44"/>
+        </w:rPr>
+      </w:pPr>
+      <w:r>
+        <w:rPr>
+          <w:b/>
+          <w:bCs/>
+          <w:sz w:val="44"/>
+          <w:szCs w:val="44"/>
+        </w:rPr>
+        <w:t xml:space="preserve">109)what is comparable&lt;T&gt; and natural </w:t>
+      </w:r>
+      <w:proofErr w:type="gramStart"/>
+      <w:r>
+        <w:rPr>
+          <w:b/>
+          <w:bCs/>
+          <w:sz w:val="44"/>
+          <w:szCs w:val="44"/>
+        </w:rPr>
+        <w:t>sorting ?</w:t>
+      </w:r>
+      <w:proofErr w:type="gramEnd"/>
+    </w:p>
+    <w:p>
+      <w:pPr>
+        <w:rPr>
+          <w:b/>
+          <w:bCs/>
+          <w:sz w:val="44"/>
+          <w:szCs w:val="44"/>
+        </w:rPr>
+      </w:pPr>
+      <w:r>
+        <w:rPr>
+          <w:b/>
+          <w:bCs/>
+          <w:sz w:val="44"/>
+          <w:szCs w:val="44"/>
+        </w:rPr>
+        <w:t>110)</w:t>
+      </w:r>
+      <w:proofErr w:type="gramStart"/>
+      <w:r>
+        <w:rPr>
+          <w:b/>
+          <w:bCs/>
+          <w:sz w:val="44"/>
+          <w:szCs w:val="44"/>
+        </w:rPr>
+        <w:t>natural  ordering</w:t>
+      </w:r>
+      <w:proofErr w:type="gramEnd"/>
+      <w:r>
+        <w:rPr>
+          <w:b/>
+          <w:bCs/>
+          <w:sz w:val="44"/>
+          <w:szCs w:val="44"/>
+        </w:rPr>
+        <w:t xml:space="preserve"> vs Custom Ordering.</w:t>
       </w:r>
     </w:p>
     <w:p>
@@ -2327,26 +4015,97 @@
           <w:sz w:val="44"/>
           <w:szCs w:val="44"/>
         </w:rPr>
-        <w:t>112)CompareTo(Object o) vs Compare(T o1, T o2)</w:t>
-      </w:r>
-    </w:p>
-    <w:p>
-      <w:pPr>
-        <w:rPr>
-          <w:b/>
-          <w:bCs/>
-          <w:sz w:val="44"/>
-          <w:szCs w:val="44"/>
-        </w:rPr>
-      </w:pPr>
-      <w:r>
-        <w:rPr>
-          <w:b/>
-          <w:bCs/>
-          <w:sz w:val="44"/>
-          <w:szCs w:val="44"/>
-        </w:rPr>
-        <w:t>113)Hierarchy of TreeSet.</w:t>
+        <w:t>112)</w:t>
+      </w:r>
+      <w:proofErr w:type="spellStart"/>
+      <w:proofErr w:type="gramStart"/>
+      <w:r>
+        <w:rPr>
+          <w:b/>
+          <w:bCs/>
+          <w:sz w:val="44"/>
+          <w:szCs w:val="44"/>
+        </w:rPr>
+        <w:t>CompareTo</w:t>
+      </w:r>
+      <w:proofErr w:type="spellEnd"/>
+      <w:r>
+        <w:rPr>
+          <w:b/>
+          <w:bCs/>
+          <w:sz w:val="44"/>
+          <w:szCs w:val="44"/>
+        </w:rPr>
+        <w:t>(</w:t>
+      </w:r>
+      <w:proofErr w:type="gramEnd"/>
+      <w:r>
+        <w:rPr>
+          <w:b/>
+          <w:bCs/>
+          <w:sz w:val="44"/>
+          <w:szCs w:val="44"/>
+        </w:rPr>
+        <w:t xml:space="preserve">Object o) vs </w:t>
+      </w:r>
+      <w:proofErr w:type="gramStart"/>
+      <w:r>
+        <w:rPr>
+          <w:b/>
+          <w:bCs/>
+          <w:sz w:val="44"/>
+          <w:szCs w:val="44"/>
+        </w:rPr>
+        <w:t>Compare(</w:t>
+      </w:r>
+      <w:proofErr w:type="gramEnd"/>
+      <w:r>
+        <w:rPr>
+          <w:b/>
+          <w:bCs/>
+          <w:sz w:val="44"/>
+          <w:szCs w:val="44"/>
+        </w:rPr>
+        <w:t>T o1, T o2)</w:t>
+      </w:r>
+    </w:p>
+    <w:p>
+      <w:pPr>
+        <w:rPr>
+          <w:b/>
+          <w:bCs/>
+          <w:sz w:val="44"/>
+          <w:szCs w:val="44"/>
+        </w:rPr>
+      </w:pPr>
+      <w:r>
+        <w:rPr>
+          <w:b/>
+          <w:bCs/>
+          <w:sz w:val="44"/>
+          <w:szCs w:val="44"/>
+        </w:rPr>
+        <w:t xml:space="preserve">113)Hierarchy of </w:t>
+      </w:r>
+      <w:proofErr w:type="spellStart"/>
+      <w:r>
+        <w:rPr>
+          <w:b/>
+          <w:bCs/>
+          <w:sz w:val="44"/>
+          <w:szCs w:val="44"/>
+        </w:rPr>
+        <w:t>TreeSet</w:t>
+      </w:r>
+      <w:proofErr w:type="spellEnd"/>
+      <w:r>
+        <w:rPr>
+          <w:b/>
+          <w:bCs/>
+          <w:sz w:val="44"/>
+          <w:szCs w:val="44"/>
+        </w:rPr>
+        <w:t>.</w:t>
       </w:r>
     </w:p>
     <w:p>
@@ -2374,64 +4133,206 @@
           <w:sz w:val="44"/>
           <w:szCs w:val="44"/>
         </w:rPr>
-        <w:t>What is TreeSet ?</w:t>
-      </w:r>
-    </w:p>
-    <w:p>
-      <w:pPr>
-        <w:rPr>
-          <w:b/>
-          <w:bCs/>
-          <w:sz w:val="44"/>
-          <w:szCs w:val="44"/>
-        </w:rPr>
-      </w:pPr>
-      <w:r>
-        <w:rPr>
-          <w:b/>
-          <w:bCs/>
-          <w:sz w:val="44"/>
-          <w:szCs w:val="44"/>
-        </w:rPr>
-        <w:t>115)Set vs TreeSet vs LinkedHashSet vs HashSet</w:t>
-      </w:r>
-    </w:p>
-    <w:p>
-      <w:pPr>
-        <w:rPr>
-          <w:b/>
-          <w:bCs/>
-          <w:sz w:val="44"/>
-          <w:szCs w:val="44"/>
-        </w:rPr>
-      </w:pPr>
-      <w:r>
-        <w:rPr>
-          <w:b/>
-          <w:bCs/>
-          <w:sz w:val="44"/>
-          <w:szCs w:val="44"/>
-        </w:rPr>
-        <w:t>116) Uniqueness in the case of HashSet, LinkedHashset and TreeSet.</w:t>
-      </w:r>
-    </w:p>
-    <w:p>
-      <w:pPr>
-        <w:rPr>
-          <w:b/>
-          <w:bCs/>
-          <w:sz w:val="44"/>
-          <w:szCs w:val="44"/>
-        </w:rPr>
-      </w:pPr>
-      <w:r>
-        <w:rPr>
-          <w:b/>
-          <w:bCs/>
-          <w:sz w:val="44"/>
-          <w:szCs w:val="44"/>
-        </w:rPr>
-        <w:t>117)SortedSet and NavigableSet in SET.</w:t>
+        <w:t xml:space="preserve">What is </w:t>
+      </w:r>
+      <w:proofErr w:type="spellStart"/>
+      <w:proofErr w:type="gramStart"/>
+      <w:r>
+        <w:rPr>
+          <w:b/>
+          <w:bCs/>
+          <w:sz w:val="44"/>
+          <w:szCs w:val="44"/>
+        </w:rPr>
+        <w:t>TreeSet</w:t>
+      </w:r>
+      <w:proofErr w:type="spellEnd"/>
+      <w:r>
+        <w:rPr>
+          <w:b/>
+          <w:bCs/>
+          <w:sz w:val="44"/>
+          <w:szCs w:val="44"/>
+        </w:rPr>
+        <w:t xml:space="preserve"> ?</w:t>
+      </w:r>
+      <w:proofErr w:type="gramEnd"/>
+    </w:p>
+    <w:p>
+      <w:pPr>
+        <w:rPr>
+          <w:b/>
+          <w:bCs/>
+          <w:sz w:val="44"/>
+          <w:szCs w:val="44"/>
+        </w:rPr>
+      </w:pPr>
+      <w:r>
+        <w:rPr>
+          <w:b/>
+          <w:bCs/>
+          <w:sz w:val="44"/>
+          <w:szCs w:val="44"/>
+        </w:rPr>
+        <w:t xml:space="preserve">115)Set vs </w:t>
+      </w:r>
+      <w:proofErr w:type="spellStart"/>
+      <w:r>
+        <w:rPr>
+          <w:b/>
+          <w:bCs/>
+          <w:sz w:val="44"/>
+          <w:szCs w:val="44"/>
+        </w:rPr>
+        <w:t>TreeSet</w:t>
+      </w:r>
+      <w:proofErr w:type="spellEnd"/>
+      <w:r>
+        <w:rPr>
+          <w:b/>
+          <w:bCs/>
+          <w:sz w:val="44"/>
+          <w:szCs w:val="44"/>
+        </w:rPr>
+        <w:t xml:space="preserve"> vs </w:t>
+      </w:r>
+      <w:proofErr w:type="spellStart"/>
+      <w:r>
+        <w:rPr>
+          <w:b/>
+          <w:bCs/>
+          <w:sz w:val="44"/>
+          <w:szCs w:val="44"/>
+        </w:rPr>
+        <w:t>LinkedHashSet</w:t>
+      </w:r>
+      <w:proofErr w:type="spellEnd"/>
+      <w:r>
+        <w:rPr>
+          <w:b/>
+          <w:bCs/>
+          <w:sz w:val="44"/>
+          <w:szCs w:val="44"/>
+        </w:rPr>
+        <w:t xml:space="preserve"> vs HashSet</w:t>
+      </w:r>
+    </w:p>
+    <w:p>
+      <w:pPr>
+        <w:rPr>
+          <w:b/>
+          <w:bCs/>
+          <w:sz w:val="44"/>
+          <w:szCs w:val="44"/>
+        </w:rPr>
+      </w:pPr>
+      <w:r>
+        <w:rPr>
+          <w:b/>
+          <w:bCs/>
+          <w:sz w:val="44"/>
+          <w:szCs w:val="44"/>
+        </w:rPr>
+        <w:t xml:space="preserve">116) Uniqueness in the case of HashSet, </w:t>
+      </w:r>
+      <w:proofErr w:type="spellStart"/>
+      <w:r>
+        <w:rPr>
+          <w:b/>
+          <w:bCs/>
+          <w:sz w:val="44"/>
+          <w:szCs w:val="44"/>
+        </w:rPr>
+        <w:t>LinkedHashset</w:t>
+      </w:r>
+      <w:proofErr w:type="spellEnd"/>
+      <w:r>
+        <w:rPr>
+          <w:b/>
+          <w:bCs/>
+          <w:sz w:val="44"/>
+          <w:szCs w:val="44"/>
+        </w:rPr>
+        <w:t xml:space="preserve"> and </w:t>
+      </w:r>
+      <w:proofErr w:type="spellStart"/>
+      <w:r>
+        <w:rPr>
+          <w:b/>
+          <w:bCs/>
+          <w:sz w:val="44"/>
+          <w:szCs w:val="44"/>
+        </w:rPr>
+        <w:t>TreeSet</w:t>
+      </w:r>
+      <w:proofErr w:type="spellEnd"/>
+      <w:r>
+        <w:rPr>
+          <w:b/>
+          <w:bCs/>
+          <w:sz w:val="44"/>
+          <w:szCs w:val="44"/>
+        </w:rPr>
+        <w:t>.</w:t>
+      </w:r>
+    </w:p>
+    <w:p>
+      <w:pPr>
+        <w:rPr>
+          <w:b/>
+          <w:bCs/>
+          <w:sz w:val="44"/>
+          <w:szCs w:val="44"/>
+        </w:rPr>
+      </w:pPr>
+      <w:r>
+        <w:rPr>
+          <w:b/>
+          <w:bCs/>
+          <w:sz w:val="44"/>
+          <w:szCs w:val="44"/>
+        </w:rPr>
+        <w:t>117)</w:t>
+      </w:r>
+      <w:proofErr w:type="spellStart"/>
+      <w:r>
+        <w:rPr>
+          <w:b/>
+          <w:bCs/>
+          <w:sz w:val="44"/>
+          <w:szCs w:val="44"/>
+        </w:rPr>
+        <w:t>SortedSet</w:t>
+      </w:r>
+      <w:proofErr w:type="spellEnd"/>
+      <w:r>
+        <w:rPr>
+          <w:b/>
+          <w:bCs/>
+          <w:sz w:val="44"/>
+          <w:szCs w:val="44"/>
+        </w:rPr>
+        <w:t xml:space="preserve"> and </w:t>
+      </w:r>
+      <w:proofErr w:type="spellStart"/>
+      <w:r>
+        <w:rPr>
+          <w:b/>
+          <w:bCs/>
+          <w:sz w:val="44"/>
+          <w:szCs w:val="44"/>
+        </w:rPr>
+        <w:t>NavigableSet</w:t>
+      </w:r>
+      <w:proofErr w:type="spellEnd"/>
+      <w:r>
+        <w:rPr>
+          <w:b/>
+          <w:bCs/>
+          <w:sz w:val="44"/>
+          <w:szCs w:val="44"/>
+        </w:rPr>
+        <w:t xml:space="preserve"> in SET.</w:t>
       </w:r>
     </w:p>
     <w:p>
@@ -2508,23 +4409,65 @@
         </w:rPr>
         <w:t>120)</w:t>
       </w:r>
-      <w:r>
-        <w:rPr>
-          <w:b/>
-          <w:bCs/>
-          <w:sz w:val="44"/>
-          <w:szCs w:val="44"/>
-        </w:rPr>
-        <w:t xml:space="preserve">ArrayDequeue vs </w:t>
-      </w:r>
-      <w:r>
-        <w:rPr>
-          <w:b/>
-          <w:bCs/>
-          <w:sz w:val="44"/>
-          <w:szCs w:val="44"/>
-        </w:rPr>
-        <w:t xml:space="preserve"> PriorityQueue.</w:t>
+      <w:proofErr w:type="spellStart"/>
+      <w:r>
+        <w:rPr>
+          <w:b/>
+          <w:bCs/>
+          <w:sz w:val="44"/>
+          <w:szCs w:val="44"/>
+        </w:rPr>
+        <w:t>ArrayDequeue</w:t>
+      </w:r>
+      <w:proofErr w:type="spellEnd"/>
+      <w:r>
+        <w:rPr>
+          <w:b/>
+          <w:bCs/>
+          <w:sz w:val="44"/>
+          <w:szCs w:val="44"/>
+        </w:rPr>
+        <w:t xml:space="preserve"> </w:t>
+      </w:r>
+      <w:proofErr w:type="gramStart"/>
+      <w:r>
+        <w:rPr>
+          <w:b/>
+          <w:bCs/>
+          <w:sz w:val="44"/>
+          <w:szCs w:val="44"/>
+        </w:rPr>
+        <w:t xml:space="preserve">vs </w:t>
+      </w:r>
+      <w:r>
+        <w:rPr>
+          <w:b/>
+          <w:bCs/>
+          <w:sz w:val="44"/>
+          <w:szCs w:val="44"/>
+        </w:rPr>
+        <w:t xml:space="preserve"> </w:t>
+      </w:r>
+      <w:proofErr w:type="spellStart"/>
+      <w:r>
+        <w:rPr>
+          <w:b/>
+          <w:bCs/>
+          <w:sz w:val="44"/>
+          <w:szCs w:val="44"/>
+        </w:rPr>
+        <w:t>PriorityQueue</w:t>
+      </w:r>
+      <w:proofErr w:type="spellEnd"/>
+      <w:proofErr w:type="gramEnd"/>
+      <w:r>
+        <w:rPr>
+          <w:b/>
+          <w:bCs/>
+          <w:sz w:val="44"/>
+          <w:szCs w:val="44"/>
+        </w:rPr>
+        <w:t>.</w:t>
       </w:r>
     </w:p>
     <w:p>
@@ -2563,7 +4506,173 @@
           <w:sz w:val="44"/>
           <w:szCs w:val="44"/>
         </w:rPr>
-        <w:t>122)PriorityQueue and Custom Sorting.</w:t>
+        <w:t>122)</w:t>
+      </w:r>
+      <w:proofErr w:type="spellStart"/>
+      <w:r>
+        <w:rPr>
+          <w:b/>
+          <w:bCs/>
+          <w:sz w:val="44"/>
+          <w:szCs w:val="44"/>
+        </w:rPr>
+        <w:t>PriorityQueue</w:t>
+      </w:r>
+      <w:proofErr w:type="spellEnd"/>
+      <w:r>
+        <w:rPr>
+          <w:b/>
+          <w:bCs/>
+          <w:sz w:val="44"/>
+          <w:szCs w:val="44"/>
+        </w:rPr>
+        <w:t xml:space="preserve"> and Custom Sorting.</w:t>
+      </w:r>
+    </w:p>
+    <w:p>
+      <w:pPr>
+        <w:rPr>
+          <w:b/>
+          <w:bCs/>
+          <w:sz w:val="44"/>
+          <w:szCs w:val="44"/>
+        </w:rPr>
+      </w:pPr>
+      <w:r>
+        <w:rPr>
+          <w:b/>
+          <w:bCs/>
+          <w:sz w:val="44"/>
+          <w:szCs w:val="44"/>
+        </w:rPr>
+        <w:t xml:space="preserve">123)Iterator </w:t>
+      </w:r>
+      <w:r>
+        <w:rPr>
+          <w:b/>
+          <w:bCs/>
+          <w:sz w:val="44"/>
+          <w:szCs w:val="44"/>
+        </w:rPr>
+        <w:t>&lt;T&gt;</w:t>
+      </w:r>
+      <w:r>
+        <w:rPr>
+          <w:b/>
+          <w:bCs/>
+          <w:sz w:val="44"/>
+          <w:szCs w:val="44"/>
+        </w:rPr>
+        <w:t xml:space="preserve">vs </w:t>
+      </w:r>
+      <w:proofErr w:type="spellStart"/>
+      <w:proofErr w:type="gramStart"/>
+      <w:r>
+        <w:rPr>
+          <w:b/>
+          <w:bCs/>
+          <w:sz w:val="44"/>
+          <w:szCs w:val="44"/>
+        </w:rPr>
+        <w:t>ListIterator</w:t>
+      </w:r>
+      <w:proofErr w:type="spellEnd"/>
+      <w:r>
+        <w:rPr>
+          <w:b/>
+          <w:bCs/>
+          <w:sz w:val="44"/>
+          <w:szCs w:val="44"/>
+        </w:rPr>
+        <w:t>.</w:t>
+      </w:r>
+      <w:r>
+        <w:rPr>
+          <w:b/>
+          <w:bCs/>
+          <w:sz w:val="44"/>
+          <w:szCs w:val="44"/>
+        </w:rPr>
+        <w:t>&lt;</w:t>
+      </w:r>
+      <w:proofErr w:type="gramEnd"/>
+      <w:r>
+        <w:rPr>
+          <w:b/>
+          <w:bCs/>
+          <w:sz w:val="44"/>
+          <w:szCs w:val="44"/>
+        </w:rPr>
+        <w:t>T&gt;</w:t>
+      </w:r>
+    </w:p>
+    <w:p>
+      <w:pPr>
+        <w:rPr>
+          <w:b/>
+          <w:bCs/>
+          <w:sz w:val="44"/>
+          <w:szCs w:val="44"/>
+        </w:rPr>
+      </w:pPr>
+      <w:proofErr w:type="gramStart"/>
+      <w:r>
+        <w:rPr>
+          <w:b/>
+          <w:bCs/>
+          <w:sz w:val="44"/>
+          <w:szCs w:val="44"/>
+        </w:rPr>
+        <w:t>124).remove</w:t>
+      </w:r>
+      <w:proofErr w:type="gramEnd"/>
+      <w:r>
+        <w:rPr>
+          <w:b/>
+          <w:bCs/>
+          <w:sz w:val="44"/>
+          <w:szCs w:val="44"/>
+        </w:rPr>
+        <w:t>() in Iteration.</w:t>
+      </w:r>
+    </w:p>
+    <w:p>
+      <w:pPr>
+        <w:rPr>
+          <w:b/>
+          <w:bCs/>
+          <w:sz w:val="44"/>
+          <w:szCs w:val="44"/>
+        </w:rPr>
+      </w:pPr>
+      <w:r>
+        <w:rPr>
+          <w:b/>
+          <w:bCs/>
+          <w:sz w:val="44"/>
+          <w:szCs w:val="44"/>
+        </w:rPr>
+        <w:t xml:space="preserve">125) Traversing backward in the </w:t>
+      </w:r>
+      <w:proofErr w:type="spellStart"/>
+      <w:r>
+        <w:rPr>
+          <w:b/>
+          <w:bCs/>
+          <w:sz w:val="44"/>
+          <w:szCs w:val="44"/>
+        </w:rPr>
+        <w:t>ListIterator</w:t>
+      </w:r>
+      <w:proofErr w:type="spellEnd"/>
+      <w:r>
+        <w:rPr>
+          <w:b/>
+          <w:bCs/>
+          <w:sz w:val="44"/>
+          <w:szCs w:val="44"/>
+        </w:rPr>
+        <w:t>&lt;T&gt;</w:t>
       </w:r>
     </w:p>
     <w:p>

</xml_diff>